<commit_message>
Phase 21 - Custom Wazuh rule 100010 for vsftpd backdoor (port 6200)
</commit_message>
<xml_diff>
--- a/Incidents/Issues setting up Home Lab.docx
+++ b/Incidents/Issues setting up Home Lab.docx
@@ -1,21 +1,22 @@
 
 <file path=word/document.xml><?xml version="1.0" encoding="utf-8"?>
-<w:document xmlns:wpc="http://schemas.microsoft.com/office/word/2010/wordprocessingCanvas" xmlns:cx="http://schemas.microsoft.com/office/drawing/2014/chartex" xmlns:cx1="http://schemas.microsoft.com/office/drawing/2015/9/8/chartex" xmlns:cx2="http://schemas.microsoft.com/office/drawing/2015/10/21/chartex" xmlns:cx3="http://schemas.microsoft.com/office/drawing/2016/5/9/chartex" xmlns:cx4="http://schemas.microsoft.com/office/drawing/2016/5/10/chartex" xmlns:cx5="http://schemas.microsoft.com/office/drawing/2016/5/11/chartex" xmlns:cx6="http://schemas.microsoft.com/office/drawing/2016/5/12/chartex" xmlns:cx7="http://schemas.microsoft.com/office/drawing/2016/5/13/chartex" xmlns:cx8="http://schemas.microsoft.com/office/drawing/2016/5/14/chartex" xmlns:mc="http://schemas.openxmlformats.org/markup-compatibility/2006" xmlns:aink="http://schemas.microsoft.com/office/drawing/2016/ink" xmlns:am3d="http://schemas.microsoft.com/office/drawing/2017/model3d" xmlns:o="urn:schemas-microsoft-com:office:office" xmlns:oel="http://schemas.microsoft.com/office/2019/extlst" xmlns:r="http://schemas.openxmlformats.org/officeDocument/2006/relationships" xmlns:m="http://schemas.openxmlformats.org/officeDocument/2006/math" xmlns:v="urn:schemas-microsoft-com:vml" xmlns:wp14="http://schemas.microsoft.com/office/word/2010/wordprocessingDrawing" xmlns:wp="http://schemas.openxmlformats.org/drawingml/2006/wordprocessingDrawing" xmlns:w10="urn:schemas-microsoft-com:office:word" xmlns:w="http://schemas.openxmlformats.org/wordprocessingml/2006/main" xmlns:w14="http://schemas.microsoft.com/office/word/2010/wordml" xmlns:w15="http://schemas.microsoft.com/office/word/2012/wordml" xmlns:w16cex="http://schemas.microsoft.com/office/word/2018/wordml/cex" xmlns:w16cid="http://schemas.microsoft.com/office/word/2016/wordml/cid" xmlns:w16="http://schemas.microsoft.com/office/word/2018/wordml" xmlns:w16du="http://schemas.microsoft.com/office/word/2023/wordml/word16du" xmlns:w16sdtdh="http://schemas.microsoft.com/office/word/2020/wordml/sdtdatahash" xmlns:w16sdtfl="http://schemas.microsoft.com/office/word/2024/wordml/sdtformatlock" xmlns:w16se="http://schemas.microsoft.com/office/word/2015/wordml/symex" xmlns:wpg="http://schemas.microsoft.com/office/word/2010/wordprocessingGroup" xmlns:wpi="http://schemas.microsoft.com/office/word/2010/wordprocessingInk" xmlns:wne="http://schemas.microsoft.com/office/word/2006/wordml" xmlns:wps="http://schemas.microsoft.com/office/word/2010/wordprocessingShape" mc:Ignorable="w14 w15 w16se w16cid w16 w16cex w16sdtdh w16sdtfl w16du wp14">
+<w:document xmlns:o="urn:schemas-microsoft-com:office:office" xmlns:r="http://schemas.openxmlformats.org/officeDocument/2006/relationships" xmlns:v="urn:schemas-microsoft-com:vml" xmlns:w="http://schemas.openxmlformats.org/wordprocessingml/2006/main" xmlns:w10="urn:schemas-microsoft-com:office:word" xmlns:wp="http://schemas.openxmlformats.org/drawingml/2006/wordprocessingDrawing" xmlns:pic="http://schemas.openxmlformats.org/drawingml/2006/picture" xmlns:wps="http://schemas.microsoft.com/office/word/2010/wordprocessingShape" xmlns:wpg="http://schemas.microsoft.com/office/word/2010/wordprocessingGroup" xmlns:mc="http://schemas.openxmlformats.org/markup-compatibility/2006" xmlns:wp14="http://schemas.microsoft.com/office/word/2010/wordprocessingDrawing" xmlns:w14="http://schemas.microsoft.com/office/word/2010/wordml" xmlns:w15="http://schemas.microsoft.com/office/word/2012/wordml" mc:Ignorable="w14 wp14 w15">
   <w:body>
     <w:p>
-      <w:r>
-        <w:t xml:space="preserve">Here's a full summary of every major issue you hit and how you solved it — this is </w:t>
-      </w:r>
-      <w:proofErr w:type="gramStart"/>
-      <w:r>
-        <w:t>actually excellent</w:t>
-      </w:r>
-      <w:proofErr w:type="gramEnd"/>
-      <w:r>
-        <w:t xml:space="preserve"> interview material.</w:t>
-      </w:r>
-    </w:p>
-    <w:p>
+      <w:pPr>
+        <w:pStyle w:val="Normal"/>
+        <w:rPr/>
+      </w:pPr>
+      <w:r>
+        <w:rPr/>
+        <w:t>Here's a full summary of every major issue you hit and how you solved it — this is actually excellent interview material.</w:t>
+      </w:r>
+    </w:p>
+    <w:p>
+      <w:pPr>
+        <w:pStyle w:val="Normal"/>
+        <w:rPr/>
+      </w:pPr>
       <w:r>
         <w:rPr>
           <w:b/>
@@ -24,46 +25,32 @@
         <w:t>Issue 1 — SSH timeout after SRV-DC01 migration</w:t>
       </w:r>
       <w:r>
-        <w:t xml:space="preserve"> When SRV-DC01 was moved to VMnet10, SSH attempts to SRV-DB01 (still on VMnet8) timed out immediately. The two VMs were now on different networks with no route between them. Solution: Shut down SRV-DB01 directly from the VMware console instead of trying to SSH in, then </w:t>
-      </w:r>
-      <w:proofErr w:type="gramStart"/>
-      <w:r>
-        <w:t>changed</w:t>
-      </w:r>
-      <w:proofErr w:type="gramEnd"/>
-      <w:r>
-        <w:t xml:space="preserve"> its network adapter to VMnet10 before powering back on.</w:t>
-      </w:r>
-    </w:p>
-    <w:p>
-      <w:r>
-        <w:rPr>
-          <w:b/>
-          <w:bCs/>
-        </w:rPr>
-        <w:t xml:space="preserve">Issue 2 — Commands </w:t>
-      </w:r>
-      <w:proofErr w:type="gramStart"/>
-      <w:r>
-        <w:rPr>
-          <w:b/>
-          <w:bCs/>
-        </w:rPr>
-        <w:t>pasted</w:t>
-      </w:r>
-      <w:proofErr w:type="gramEnd"/>
-      <w:r>
-        <w:rPr>
-          <w:b/>
-          <w:bCs/>
-        </w:rPr>
-        <w:t xml:space="preserve"> in all caps on SRV-DB01</w:t>
-      </w:r>
-      <w:r>
+        <w:rPr/>
+        <w:t xml:space="preserve"> When SRV-DC01 was moved to VMnet10, SSH attempts to SRV-DB01 (still on VMnet8) timed out immediately. The two VMs were now on different networks with no route between them. Solution: Shut down SRV-DB01 directly from the VMware console instead of trying to SSH in, then changed its network adapter to VMnet10 before powering back on.</w:t>
+      </w:r>
+    </w:p>
+    <w:p>
+      <w:pPr>
+        <w:pStyle w:val="Normal"/>
+        <w:rPr/>
+      </w:pPr>
+      <w:r>
+        <w:rPr>
+          <w:b/>
+          <w:bCs/>
+        </w:rPr>
+        <w:t>Issue 2 — Commands pasted in all caps on SRV-DB01</w:t>
+      </w:r>
+      <w:r>
+        <w:rPr/>
         <w:t xml:space="preserve"> When copying commands into the VMware console, they were being entered in ALL CAPS (SUDO instead of sudo), causing "command not found" errors on every command. Solution: Typed commands manually in lowercase directly in the console. Linux is fully case-sensitive and sudo vs SUDO are completely different strings.</w:t>
       </w:r>
     </w:p>
     <w:p>
+      <w:pPr>
+        <w:pStyle w:val="Normal"/>
+        <w:rPr/>
+      </w:pPr>
       <w:r>
         <w:rPr>
           <w:b/>
@@ -72,10 +59,15 @@
         <w:t>Issue 3 — Multiple commands pasted as one line</w:t>
       </w:r>
       <w:r>
+        <w:rPr/>
         <w:t xml:space="preserve"> Several times when copying multi-line command blocks, all commands ran together as a single string, causing systemd to interpret the entire block as one service name. Solution: Run each command individually, pressing Enter after each one before typing the next.</w:t>
       </w:r>
     </w:p>
     <w:p>
+      <w:pPr>
+        <w:pStyle w:val="Normal"/>
+        <w:rPr/>
+      </w:pPr>
       <w:r>
         <w:rPr>
           <w:b/>
@@ -84,10 +76,15 @@
         <w:t>Issue 4 — SRV-DB01 not appearing on network scan after migration</w:t>
       </w:r>
       <w:r>
+        <w:rPr/>
         <w:t xml:space="preserve"> After moving SRV-DB01 to VMnet10 and powering it on, the PowerShell subnet scan from SRV-DC01 only returned 10.10.10.1 (pfSense). SRV-DB01 was invisible. Solution: Ubuntu's UFW firewall blocks ICMP pings by default, so ping-based scanning couldn't find it. Logged into the SRV-DB01 console directly in VMware and ran ip addr show to find the DHCP address pfSense had assigned (10.10.10.202).</w:t>
       </w:r>
     </w:p>
     <w:p>
+      <w:pPr>
+        <w:pStyle w:val="Normal"/>
+        <w:rPr/>
+      </w:pPr>
       <w:r>
         <w:rPr>
           <w:b/>
@@ -96,10 +93,15 @@
         <w:t>Issue 5 — SRV-SIEM01 netplan interface name mismatch</w:t>
       </w:r>
       <w:r>
+        <w:rPr/>
         <w:t xml:space="preserve"> When setting the static IP on SRV-SIEM01, there was a risk of using the wrong interface name in the netplan config. Solution: Ran ip addr show first to confirm the interface was named ens33 before editing the netplan YAML, ensuring the config matched the actual hardware.</w:t>
       </w:r>
     </w:p>
     <w:p>
+      <w:pPr>
+        <w:pStyle w:val="Normal"/>
+        <w:rPr/>
+      </w:pPr>
       <w:r>
         <w:rPr>
           <w:b/>
@@ -108,10 +110,15 @@
         <w:t>Issue 6 — Wazuh agent not installed on SRV-DC01</w:t>
       </w:r>
       <w:r>
+        <w:rPr/>
         <w:t xml:space="preserve"> After migration, searches for the Wazuh service and ossec.conf on SRV-DC01 returned nothing. The agent had never actually been installed — previous agent registrations in the dashboard were from a different setup. Solution: Downloaded the Wazuh 4.7.5 MSI installer fresh and installed it, then configured the manager IP to 10.10.10.135.</w:t>
       </w:r>
     </w:p>
     <w:p>
+      <w:pPr>
+        <w:pStyle w:val="Normal"/>
+        <w:rPr/>
+      </w:pPr>
       <w:r>
         <w:rPr>
           <w:b/>
@@ -120,14 +127,15 @@
         <w:t>Issue 7 — VMware drag and drop not working</w:t>
       </w:r>
       <w:r>
-        <w:t xml:space="preserve"> Trying to drag the Wazuh MSI from the host machine into the SRV-DC01 VM window showed a "no drop" circle cursor. Shared folders were also greyed out. Solution: Installed VMware Tools on SRV-DC01 first. Both drag/drop </w:t>
-      </w:r>
-      <w:r>
-        <w:lastRenderedPageBreak/>
-        <w:t>and shared folders require VMware Tools to be running in the guest OS before they function.</w:t>
-      </w:r>
-    </w:p>
-    <w:p>
+        <w:rPr/>
+        <w:t xml:space="preserve"> Trying to drag the Wazuh MSI from the host machine into the SRV-DC01 VM window showed a "no drop" circle cursor. Shared folders were also greyed out. Solution: Installed VMware Tools on SRV-DC01 first. Both drag/drop and shared folders require VMware Tools to be running in the guest OS before they function.</w:t>
+      </w:r>
+    </w:p>
+    <w:p>
+      <w:pPr>
+        <w:pStyle w:val="Normal"/>
+        <w:rPr/>
+      </w:pPr>
       <w:r>
         <w:rPr>
           <w:b/>
@@ -136,10 +144,15 @@
         <w:t>Issue 8 — VMware Tools installation froze the host machine</w:t>
       </w:r>
       <w:r>
+        <w:rPr/>
         <w:t xml:space="preserve"> During VMware Tools installation on SRV-DC01, the entire host PC locked up and required a hard restart. All VMs powered off. Solution: Rebooted, powered all VMs back on in correct order (SRV-FW01 first, then others), verified all IPs and connectivity were intact before continuing.</w:t>
       </w:r>
     </w:p>
     <w:p>
+      <w:pPr>
+        <w:pStyle w:val="Normal"/>
+        <w:rPr/>
+      </w:pPr>
       <w:r>
         <w:rPr>
           <w:b/>
@@ -148,10 +161,15 @@
         <w:t>Issue 9 — All 4 Wazuh agents disconnected after migration</w:t>
       </w:r>
       <w:r>
+        <w:rPr/>
         <w:t xml:space="preserve"> After all VMs were migrated to new VMnets, the Wazuh dashboard showed all 4 agents as disconnected. The manager was running fine. Solution: Checked the manager logs with agent_control -l which showed agents trying to re-enroll but being rejected with "duplicate name — key already exists" and "agent has not been disconnected long enough to be replaced." Removed all old agent registrations manually using manage_agents -r for each ID, restarted the manager, then restarted all agents. All 4 came back active within 60 seconds.</w:t>
       </w:r>
     </w:p>
     <w:p>
+      <w:pPr>
+        <w:pStyle w:val="Normal"/>
+        <w:rPr/>
+      </w:pPr>
       <w:r>
         <w:rPr>
           <w:b/>
@@ -160,10 +178,15 @@
         <w:t>Issue 10 — ATT-KALI01 not getting DHCP after VMnet12 migration</w:t>
       </w:r>
       <w:r>
+        <w:rPr/>
         <w:t xml:space="preserve"> After moving Kali to VMnet12, ip addr show only showed an IPv6 link-local address and no IPv4. Neither dhclient nor dhcpcd were installed. Solution: Used nmcli (NetworkManager CLI) to bring the interface up and request a DHCP lease, then used nmcli con mod to set the static IP permanently.</w:t>
       </w:r>
     </w:p>
     <w:p>
+      <w:pPr>
+        <w:pStyle w:val="Normal"/>
+        <w:rPr/>
+      </w:pPr>
       <w:r>
         <w:rPr>
           <w:b/>
@@ -172,50 +195,32 @@
         <w:t>Issue 11 — DMZ-VULN01 static IP didn't update via DHCP</w:t>
       </w:r>
       <w:r>
+        <w:rPr/>
         <w:t xml:space="preserve"> After moving to VMnet12, Metasploitable 2 still showed its old 192.168.147.131 address because it uses a static IP config, not DHCP. Solution: Used sudo ifconfig eth0 10.10.30.131 netmask 255.255.255.0 directly to set the IP at runtime. Note: this is non-persistent across reboots on Metasploitable 2 — it will need to be reset if the VM is rebooted.</w:t>
       </w:r>
     </w:p>
     <w:p>
-      <w:r>
-        <w:rPr>
-          <w:b/>
-          <w:bCs/>
-        </w:rPr>
-        <w:t xml:space="preserve">Issue 12 </w:t>
-      </w:r>
-      <w:proofErr w:type="gramStart"/>
-      <w:r>
-        <w:rPr>
-          <w:b/>
-          <w:bCs/>
-        </w:rPr>
-        <w:t>— pfSense</w:t>
-      </w:r>
-      <w:proofErr w:type="gramEnd"/>
-      <w:r>
-        <w:rPr>
-          <w:b/>
-          <w:bCs/>
-        </w:rPr>
-        <w:t xml:space="preserve"> GUI unreachable after host PC </w:t>
-      </w:r>
-      <w:proofErr w:type="gramStart"/>
-      <w:r>
-        <w:rPr>
-          <w:b/>
-          <w:bCs/>
-        </w:rPr>
-        <w:t>restart</w:t>
-      </w:r>
-      <w:r>
-        <w:t xml:space="preserve"> </w:t>
-      </w:r>
-      <w:proofErr w:type="gramEnd"/>
-      <w:r>
-        <w:t>After the host froze and rebooted, SRV-FW01 and all VMs were powered off. pfSense wasn't reachable. Solution: Always power on SRV-FW01 first before any other VMs since everything routes through it. Once pfSense was up and stable, other VMs could reach their gateways and the GUI was accessible again.</w:t>
-      </w:r>
-    </w:p>
-    <w:p>
+      <w:pPr>
+        <w:pStyle w:val="Normal"/>
+        <w:rPr/>
+      </w:pPr>
+      <w:r>
+        <w:rPr>
+          <w:b/>
+          <w:bCs/>
+        </w:rPr>
+        <w:t>Issue 12 — pfSense GUI unreachable after host PC restart</w:t>
+      </w:r>
+      <w:r>
+        <w:rPr/>
+        <w:t xml:space="preserve"> After the host froze and rebooted, SRV-FW01 and all VMs were powered off. pfSense wasn't reachable. Solution: Always power on SRV-FW01 first before any other VMs since everything routes through it. Once pfSense was up and stable, other VMs could reach their gateways and the GUI was accessible again.</w:t>
+      </w:r>
+    </w:p>
+    <w:p>
+      <w:pPr>
+        <w:pStyle w:val="Normal"/>
+        <w:rPr/>
+      </w:pPr>
       <w:r>
         <w:rPr>
           <w:b/>
@@ -224,10 +229,15 @@
         <w:t>Issue 13 — OPT1 and OPT2 firewall rules blocking ICMP (ping)</w:t>
       </w:r>
       <w:r>
+        <w:rPr/>
         <w:t xml:space="preserve"> After initially setting up pfSense rules as TCP-only, cross-VLAN pings were failing even though the rules appeared correct. Solution: Changed protocol from TCP to Any on both OPT1 and OPT2 rules. ICMP is a separate protocol from TCP and requires the Any setting to pass through.</w:t>
       </w:r>
     </w:p>
     <w:p>
+      <w:pPr>
+        <w:pStyle w:val="Normal"/>
+        <w:rPr/>
+      </w:pPr>
       <w:r>
         <w:rPr>
           <w:b/>
@@ -236,14 +246,15 @@
         <w:t>Issue 14 — pfSense firewall rule order causing blocks before allows</w:t>
       </w:r>
       <w:r>
-        <w:t xml:space="preserve"> When adding block rules for OPT2, the Block → Servers rule kept floating to the top above the Allow → DMZ-VULN01 rule. pfSense processes rules top-to-bottom, so the block was firing before the </w:t>
-      </w:r>
-      <w:r>
-        <w:lastRenderedPageBreak/>
-        <w:t>allow could match. Solution: Used the anchor drag handle to manually reorder rules so Allow → DMZ-VULN01 was always first, followed by the block rules. Rule order is critical in pfSense.</w:t>
-      </w:r>
-    </w:p>
-    <w:p>
+        <w:rPr/>
+        <w:t xml:space="preserve"> When adding block rules for OPT2, the Block → Servers rule kept floating to the top above the Allow → DMZ-VULN01 rule. pfSense processes rules top-to-bottom, so the block was firing before the allow could match. Solution: Used the anchor drag handle to manually reorder rules so Allow → DMZ-VULN01 was always first, followed by the block rules. Rule order is critical in pfSense.</w:t>
+      </w:r>
+    </w:p>
+    <w:p>
+      <w:pPr>
+        <w:pStyle w:val="Normal"/>
+        <w:rPr/>
+      </w:pPr>
       <w:r>
         <w:rPr>
           <w:b/>
@@ -252,10 +263,15 @@
         <w:t>Issue 15 — System state backup failed to VHD target</w:t>
       </w:r>
       <w:r>
+        <w:rPr/>
         <w:t xml:space="preserve"> When running wbadmin start systemstatebackup targeting the VHD-mounted E: drive, the backup completed with errors. The error log showed Error [0x800701b1] A device which does not exist was specified while trying to read C:\Windows\SysWOW64\TtlsAuth.dll. Solution: This is a known Windows Server Backup limitation — system state backups are not supported to VHD targets due to VSS constraints. Documented as expected behavior. Volume/application-level backup completed successfully and was used for the restore test.</w:t>
       </w:r>
     </w:p>
     <w:p>
+      <w:pPr>
+        <w:pStyle w:val="Normal"/>
+        <w:rPr/>
+      </w:pPr>
       <w:r>
         <w:rPr>
           <w:b/>
@@ -264,10 +280,15 @@
         <w:t>Issue 16 — Error log path not found when reading backup logs</w:t>
       </w:r>
       <w:r>
+        <w:rPr/>
         <w:t xml:space="preserve"> Attempted to read the backup error log by typing the path directly as a command instead of passing it to Get-Content, causing a "not recognized as cmdlet" error. Second attempt failed because the filename used mixed hyphens and underscores that didn't match exactly. Solution: Used Get-ChildItem on the log folder first to get the exact filenames, then used Get-Content with the correct quoted path.</w:t>
       </w:r>
     </w:p>
     <w:p>
+      <w:pPr>
+        <w:pStyle w:val="Normal"/>
+        <w:rPr/>
+      </w:pPr>
       <w:r>
         <w:rPr>
           <w:b/>
@@ -276,10 +297,15 @@
         <w:t>Issue 17 — File-level restore failed — path not found in backup</w:t>
       </w:r>
       <w:r>
+        <w:rPr/>
         <w:t xml:space="preserve"> Attempted to restore C:\Windows\System32\drivers\etc\hosts from the backup but received "The specified path was not found in the backup." Solution: Ran wbadmin get items to inspect backup contents. Discovered the backup captured AD application components (ntds, SYSVOL/FRS, Registry, EFI) — not individual files. File-level restore is not applicable to this backup type.</w:t>
       </w:r>
     </w:p>
     <w:p>
+      <w:pPr>
+        <w:pStyle w:val="Normal"/>
+        <w:rPr/>
+      </w:pPr>
       <w:r>
         <w:rPr>
           <w:b/>
@@ -288,10 +314,15 @@
         <w:t>Issue 18 — AD component restore to alternate location failed</w:t>
       </w:r>
       <w:r>
+        <w:rPr/>
         <w:t xml:space="preserve"> Attempted to restore Registry and FRS components to C:\RestoreTest\ as a restore simulation. Both failed with "The parameter is incorrect." Solution: VSS writer-dependent components (Registry, SYSVOL, AD database) cannot be restored to alternate locations. Real AD recovery requires booting into DSRM (Directory Services Restore Mode). Documented as expected production behavior, not a lab error.</w:t>
       </w:r>
     </w:p>
     <w:p>
+      <w:pPr>
+        <w:pStyle w:val="Normal"/>
+        <w:rPr/>
+      </w:pPr>
       <w:r>
         <w:rPr>
           <w:b/>
@@ -300,23 +331,32 @@
         <w:t>Issue 19 — VMware auto-start task ran as SYSTEM but no VMs started</w:t>
       </w:r>
       <w:r>
+        <w:rPr/>
         <w:t xml:space="preserve"> Task Scheduler task registered successfully and showed State: Ready, but after triggering, vmrun reported 0 running VMs. Solution: VMware Workstation requires an active user session to start VMs — SYSTEM account has no desktop session. Fixed by running the startup script manually after login. Auto-start via Task Scheduler works only when a user is logged in at boot.</w:t>
       </w:r>
     </w:p>
     <w:p>
-      <w:r>
-        <w:rPr>
-          <w:b/>
-          <w:bCs/>
-        </w:rPr>
-        <w:lastRenderedPageBreak/>
+      <w:pPr>
+        <w:pStyle w:val="Normal"/>
+        <w:rPr/>
+      </w:pPr>
+      <w:r>
+        <w:rPr>
+          <w:b/>
+          <w:bCs/>
+        </w:rPr>
         <w:t>Issue 20 — Dell host could not reach lab VMs (10.10.10.x unreachable)</w:t>
       </w:r>
       <w:r>
+        <w:rPr/>
         <w:t xml:space="preserve"> After establishing SSH to the Dell host, attempts to SSH or ping SRV-SIEM01 at 10.10.10.135 timed out. The Dell host had no route to the 10.10.10.x subnet. Solution: Opened VMware Virtual Network Editor and enabled "Connect a host virtual adapter to this network" on VMnet10. This created a VMware Network Adapter VMnet10 on the host, assigned it 10.10.10.204 via DHCP, then set it to static 10.10.10.2. Host can now reach all LAN VMs directly.</w:t>
       </w:r>
     </w:p>
     <w:p>
+      <w:pPr>
+        <w:pStyle w:val="Normal"/>
+        <w:rPr/>
+      </w:pPr>
       <w:r>
         <w:rPr>
           <w:b/>
@@ -325,10 +365,15 @@
         <w:t>Issue 21 — RDP to DC01 disconnected immediately with "another connection was made"</w:t>
       </w:r>
       <w:r>
+        <w:rPr/>
         <w:t xml:space="preserve"> After enabling RDP on DC01 via PowerShell, the Dell host connected but was immediately dropped. Solution: The VMware console tab counts as an active session. Windows Server allows only one RDP session by default. Closing the DC01 console tab ("Run in Background") released the session and allowed RDP to connect cleanly.</w:t>
       </w:r>
     </w:p>
     <w:p>
+      <w:pPr>
+        <w:pStyle w:val="Normal"/>
+        <w:rPr/>
+      </w:pPr>
       <w:r>
         <w:rPr>
           <w:b/>
@@ -337,10 +382,15 @@
         <w:t>Issue 22 — RDP credentials rejected on DC01</w:t>
       </w:r>
       <w:r>
+        <w:rPr/>
         <w:t xml:space="preserve"> RDP prompted for credentials but rejected them. Windows was defaulting to the Microsoft account associated with the Dell host rather than DC01's local Administrator account. Solution: Clicked "More choices" → "Use a different account" and entered LAB\Administrator with the DC01 local password. Microsoft account credentials on the host machine are separate from VM guest credentials.</w:t>
       </w:r>
     </w:p>
     <w:p>
+      <w:pPr>
+        <w:pStyle w:val="Normal"/>
+        <w:rPr/>
+      </w:pPr>
       <w:r>
         <w:rPr>
           <w:b/>
@@ -349,10 +399,15 @@
         <w:t>Issue 23 — PowerShell multi-line paste showed no output</w:t>
       </w:r>
       <w:r>
+        <w:rPr/>
         <w:t xml:space="preserve"> After pasting multi-line scripts into the DC01 RDP PowerShell window, pressing Enter showed no output and the prompt didn't return. Solution: PowerShell was in multi-line input mode waiting to close the script block. Pressing Enter one additional time after the final line executed the script. This is consistent with the VMware console paste behavior from previous sessions.</w:t>
       </w:r>
     </w:p>
     <w:p>
+      <w:pPr>
+        <w:pStyle w:val="Normal"/>
+        <w:rPr/>
+      </w:pPr>
       <w:r>
         <w:rPr>
           <w:b/>
@@ -361,10 +416,15 @@
         <w:t>Issue 24 — MacBook Kali could not ping Dell (100% packet loss)</w:t>
       </w:r>
       <w:r>
+        <w:rPr/>
         <w:t xml:space="preserve"> After configuring the MacBook Kali VM in UTM with bridged networking, ping to the Dell at 192.168.0.150 returned 100% packet loss. Solution: Windows Firewall on the Dell was blocking inbound ICMP from outside its normal network range. Enabled the "File and Printer Sharing (Echo Request - ICMPv4-In)" rule via PowerShell: Enable-NetFirewallRule -DisplayName "File and Printer Sharing (Echo Request - ICMPv4-In)". Ping succeeded immediately after.</w:t>
       </w:r>
     </w:p>
     <w:p>
+      <w:pPr>
+        <w:pStyle w:val="Normal"/>
+        <w:rPr/>
+      </w:pPr>
       <w:r>
         <w:rPr>
           <w:b/>
@@ -373,10 +433,15 @@
         <w:t>Issue 25 — netsh portproxy command failed with "requires elevation"</w:t>
       </w:r>
       <w:r>
+        <w:rPr/>
         <w:t xml:space="preserve"> Running the portproxy add command in a standard Command Prompt returned "The requested operation requires elevation." Solution: netsh interface portproxy requires Administrator privileges. Re-ran from a cmd window opened with Ctrl+Shift+Enter (Run as Administrator).</w:t>
       </w:r>
     </w:p>
     <w:p>
+      <w:pPr>
+        <w:pStyle w:val="Normal"/>
+        <w:rPr/>
+      </w:pPr>
       <w:r>
         <w:rPr>
           <w:b/>
@@ -385,14 +450,15 @@
         <w:t>Issue 26 — New-NetFirewallRule failed with "not recognized as command"</w:t>
       </w:r>
       <w:r>
-        <w:t xml:space="preserve"> Attempted to run New-NetFirewallRule in a standard Command Prompt window and got "not recognized as an internal or external command." Solution: New-NetFirewallRule is a </w:t>
-      </w:r>
-      <w:r>
-        <w:lastRenderedPageBreak/>
-        <w:t>PowerShell cmdlet, not a CMD command. Opened a separate PowerShell window as Administrator to run it. CMD and PowerShell have different command sets and cannot cross-execute each other's native commands.</w:t>
-      </w:r>
-    </w:p>
-    <w:p>
+        <w:rPr/>
+        <w:t xml:space="preserve"> Attempted to run New-NetFirewallRule in a standard Command Prompt window and got "not recognized as an internal or external command." Solution: New-NetFirewallRule is a PowerShell cmdlet, not a CMD command. Opened a separate PowerShell window as Administrator to run it. CMD and PowerShell have different command sets and cannot cross-execute each other's native commands.</w:t>
+      </w:r>
+    </w:p>
+    <w:p>
+      <w:pPr>
+        <w:pStyle w:val="Normal"/>
+        <w:rPr/>
+      </w:pPr>
       <w:r>
         <w:rPr>
           <w:b/>
@@ -401,9 +467,10 @@
         <w:t>Issue 27 — curl to Metasploitable returned "Connection reset by peer"</w:t>
       </w:r>
       <w:r>
+        <w:rPr/>
         <w:t xml:space="preserve"> After the portproxy rule was in place and Metasploitable was running, curl </w:t>
       </w:r>
-      <w:hyperlink r:id="rId4" w:history="1">
+      <w:hyperlink r:id="rId2">
         <w:r>
           <w:rPr>
             <w:rStyle w:val="Hyperlink"/>
@@ -412,10 +479,15 @@
         </w:r>
       </w:hyperlink>
       <w:r>
+        <w:rPr/>
         <w:t xml:space="preserve"> from Kali returned error 56 — connection reset by peer. Solution: The port forward was routing to the old Metasploitable IP (10.10.30.131) which was unreachable. The root cause was that DMZ-VULN01 had no VMnet adapter that matched the host's VMnet configuration, and the Dell host had no adapter on the DMZ subnet at all. Required a full DMZ network rebuild (see Issues 28–32).</w:t>
       </w:r>
     </w:p>
     <w:p>
+      <w:pPr>
+        <w:pStyle w:val="Normal"/>
+        <w:rPr/>
+      </w:pPr>
       <w:r>
         <w:rPr>
           <w:b/>
@@ -424,10 +496,15 @@
         <w:t>Issue 28 — Dell host had no adapter on the DMZ network</w:t>
       </w:r>
       <w:r>
+        <w:rPr/>
         <w:t xml:space="preserve"> The Dell could ping Metasploitable via VMnet but curl always timed out. Checking ipconfig showed VMnet10 and VMnet19 but no adapter on 10.10.30.0/24. Solution: Opened VMware Virtual Network Editor, created VMnet19 as a new host-only network with subnet 10.10.30.0/255.255.255.0 and host adapter enabled. Set static IP 10.10.30.2 on the new adapter via netsh.</w:t>
       </w:r>
     </w:p>
     <w:p>
+      <w:pPr>
+        <w:pStyle w:val="Normal"/>
+        <w:rPr/>
+      </w:pPr>
       <w:r>
         <w:rPr>
           <w:b/>
@@ -436,10 +513,15 @@
         <w:t>Issue 29 — DMZ VMs were on VMnet12, not VMnet19</w:t>
       </w:r>
       <w:r>
+        <w:rPr/>
         <w:t xml:space="preserve"> After creating VMnet19 for the DMZ, pings from Metasploitable to the Dell still failed. Checking VM settings revealed ATT-KALI01 and DMZ-VULN01 were still assigned to VMnet12 — a network that no longer existed in the Virtual Network Editor. Solution: Changed both VMs' DMZ network adapters from VMnet12 to VMnet19 in VMware Workstation VM settings. pfSense's OPT2 adapter was also still on VMnet12 — changed it to VMnet19 as well and restarted pfSense.</w:t>
       </w:r>
     </w:p>
     <w:p>
+      <w:pPr>
+        <w:pStyle w:val="Normal"/>
+        <w:rPr/>
+      </w:pPr>
       <w:r>
         <w:rPr>
           <w:b/>
@@ -448,10 +530,15 @@
         <w:t>Issue 30 — Metasploitable kept reverting to a 192.168.179.x DHCP address</w:t>
       </w:r>
       <w:r>
+        <w:rPr/>
         <w:t xml:space="preserve"> Every time Metasploitable rebooted, eth0 reverted to a NAT DHCP address instead of the static 10.10.30.x address set manually with ifconfig. The static IP set at runtime was lost on every reboot. Solution: DMZ-VULN01 had a NAT adapter as its first network adapter, which was winning the DHCP race. Removed the NAT adapter entirely in VM settings — both adapters now set to VMnet19. Then made the static IP permanent by editing /etc/network/interfaces to set eth0 as static with address 10.10.30.101, netmask 255.255.255.0, gateway 10.10.30.1.</w:t>
       </w:r>
     </w:p>
     <w:p>
+      <w:pPr>
+        <w:pStyle w:val="Normal"/>
+        <w:rPr/>
+      </w:pPr>
       <w:r>
         <w:rPr>
           <w:b/>
@@ -460,14 +547,15 @@
         <w:t>Issue 31 — VMnet19 host adapter lost its static IP after reboot</w:t>
       </w:r>
       <w:r>
-        <w:t xml:space="preserve"> After rebooting the Dell, ipconfig showed VMnet19 with a 169.254.x.x APIPA address instead of 10.10.30.2, and VMnet10 had also lost its static IP. Solution: Static IPs set via netsh interface portproxy do not always persist across reboots on VMware host adapters. Re-applied both static IPs manually and created a SetVMnetIPs.ps1 startup script registered in Task Scheduler </w:t>
-      </w:r>
-      <w:r>
-        <w:lastRenderedPageBreak/>
-        <w:t>(RunLevel Highest, trigger: AtLogOn) to apply them automatically on every login. Confirmed persistent via Start-ScheduledTask test.</w:t>
-      </w:r>
-    </w:p>
-    <w:p>
+        <w:rPr/>
+        <w:t xml:space="preserve"> After rebooting the Dell, ipconfig showed VMnet19 with a 169.254.x.x APIPA address instead of 10.10.30.2, and VMnet10 had also lost its static IP. Solution: Static IPs set via netsh interface portproxy do not always persist across reboots on VMware host adapters. Re-applied both static IPs manually and created a SetVMnetIPs.ps1 startup script registered in Task Scheduler (RunLevel Highest, trigger: AtLogOn) to apply them automatically on every login. Confirmed persistent via Start-ScheduledTask test.</w:t>
+      </w:r>
+    </w:p>
+    <w:p>
+      <w:pPr>
+        <w:pStyle w:val="Normal"/>
+        <w:rPr/>
+      </w:pPr>
       <w:r>
         <w:rPr>
           <w:b/>
@@ -476,9 +564,10 @@
         <w:t>Issue 32 — curl timed out even after ping succeeded between Dell and Metasploitable</w:t>
       </w:r>
       <w:r>
+        <w:rPr/>
         <w:t xml:space="preserve"> Ping from Dell to Metasploitable at 10.10.30.101 worked with 0% packet loss, but curl </w:t>
       </w:r>
-      <w:hyperlink r:id="rId5" w:history="1">
+      <w:hyperlink r:id="rId3">
         <w:r>
           <w:rPr>
             <w:rStyle w:val="Hyperlink"/>
@@ -487,10 +576,15 @@
         </w:r>
       </w:hyperlink>
       <w:r>
+        <w:rPr/>
         <w:t xml:space="preserve"> timed out every time. Disabling Windows Firewall on the Dell made no difference. Solution: Metasploitable had no default gateway set, so it could receive TCP SYN packets but had no route to send the response back. Added a default gateway pointing to the Dell's VMnet19 IP: sudo route add default gw 10.10.30.2. Once the return path existed, curl succeeded immediately and the full chain from MacBook Kali through the Dell port forward to Metasploitable was confirmed working.</w:t>
       </w:r>
     </w:p>
     <w:p>
+      <w:pPr>
+        <w:pStyle w:val="Normal"/>
+        <w:rPr/>
+      </w:pPr>
       <w:r>
         <w:rPr>
           <w:b/>
@@ -499,10 +593,15 @@
         <w:t>Issue 33 — pfSense OPT2 firewall rule still referenced old Metasploitable IP</w:t>
       </w:r>
       <w:r>
+        <w:rPr/>
         <w:t xml:space="preserve"> After the DMZ rebuild changed Metasploitable's IP from 10.10.30.131 to 10.10.30.101, the OPT2 allow rule in pfSense still had 10.10.30.131 as the destination. Solution: Edited the rule in Firewall → Rules → OPT2, changed destination to 10.10.30.101. pfSense reloaded the firewall rules automatically after saving.</w:t>
       </w:r>
     </w:p>
     <w:p>
+      <w:pPr>
+        <w:pStyle w:val="Normal"/>
+        <w:rPr/>
+      </w:pPr>
       <w:r>
         <w:rPr>
           <w:b/>
@@ -511,10 +610,15 @@
         <w:t>Issue 34 — VMnet19 and VMnet10 static IPs reset on Dell reboot</w:t>
       </w:r>
       <w:r>
+        <w:rPr/>
         <w:t xml:space="preserve"> After rebooting the Dell, both VMnet19 (10.10.30.2) and VMnet10 (10.10.10.2) reverted to APIPA addresses, breaking all lab connectivity. Solution: Created C:\Users\raymo\StartupScripts\SetVMnetIPs.ps1 with netsh commands to statically set both adapters. Registered as a Task Scheduler task (SetVMnetIPs) with AtLogOn trigger and RunLevel Highest. Verified with Start-ScheduledTask — both IPs confirmed correct immediately after.</w:t>
       </w:r>
     </w:p>
     <w:p>
+      <w:pPr>
+        <w:pStyle w:val="Normal"/>
+        <w:rPr/>
+      </w:pPr>
       <w:r>
         <w:rPr>
           <w:b/>
@@ -523,10 +627,15 @@
         <w:t>Issue 35 — Nmap reported host down on Dell despite portproxy being active</w:t>
       </w:r>
       <w:r>
+        <w:rPr/>
         <w:t xml:space="preserve"> Running nmap -sV 192.168.0.150 -p 8080 from MacBook Kali returned "Host seems down." Solution: Nmap performs an ICMP ping probe before scanning. The Dell was blocking ICMP from the MacBook subnet. Added -Pn flag to skip the ping check and force port scanning. Host came up immediately and Apache httpd 2.2.8 on Metasploitable was correctly fingerprinted.</w:t>
       </w:r>
     </w:p>
     <w:p>
+      <w:pPr>
+        <w:pStyle w:val="Normal"/>
+        <w:rPr/>
+      </w:pPr>
       <w:r>
         <w:rPr>
           <w:b/>
@@ -535,10 +644,15 @@
         <w:t>Issue 36 — Portproxy forwarded ports appeared filtered in Nmap</w:t>
       </w:r>
       <w:r>
+        <w:rPr/>
         <w:t xml:space="preserve"> After adding portproxy rules for ports 21, 139, 445, and 1524, Nmap still showed them as filtered. Solution: Windows Firewall was blocking inbound traffic on those ports even though portproxy was configured. Added a firewall allow rule via netsh advfirewall for ports 21, 139, 445, and 1524. All four ports opened immediately on rescan.</w:t>
       </w:r>
     </w:p>
     <w:p>
+      <w:pPr>
+        <w:pStyle w:val="Normal"/>
+        <w:rPr/>
+      </w:pPr>
       <w:r>
         <w:rPr>
           <w:b/>
@@ -547,14 +661,15 @@
         <w:t>Issue 37 — vsftpd 2.3.4 exploit completed but no session created</w:t>
       </w:r>
       <w:r>
-        <w:t xml:space="preserve"> Metasploit's vsftpd_234_backdoor module connected to port 21 and triggered the backdoor sequence </w:t>
-      </w:r>
-      <w:r>
-        <w:lastRenderedPageBreak/>
-        <w:t>but failed to create a session. Solution: The vsftpd backdoor opens a shell on port 6200, which requires a second inbound connection. The portproxy had no rule for port 6200. Added portproxy rule for 6200 and a firewall allow rule. The backdoor bind listener was detected as already open on subsequent attempts but the two-stage connection handshake through a portproxy remained unreliable. Documented as a known portproxy architecture limitation — direct network access required for reliable exploitation.</w:t>
-      </w:r>
-    </w:p>
-    <w:p>
+        <w:rPr/>
+        <w:t xml:space="preserve"> Metasploit's vsftpd_234_backdoor module connected to port 21 and triggered the backdoor sequence but failed to create a session. Solution: The vsftpd backdoor opens a shell on port 6200, which requires a second inbound connection. The portproxy had no rule for port 6200. Added portproxy rule for 6200 and a firewall allow rule. The backdoor bind listener was detected as already open on subsequent attempts but the two-stage connection handshake through a portproxy remained unreliable. Documented as a known portproxy architecture limitation — direct network access required for reliable exploitation.</w:t>
+      </w:r>
+    </w:p>
+    <w:p>
+      <w:pPr>
+        <w:pStyle w:val="Normal"/>
+        <w:rPr/>
+      </w:pPr>
       <w:r>
         <w:rPr>
           <w:b/>
@@ -563,10 +678,15 @@
         <w:t>Issue 38 — Samba usermap_script exploit failed with SMB NoReply</w:t>
       </w:r>
       <w:r>
+        <w:rPr/>
         <w:t xml:space="preserve"> Metasploit's usermap_script module against port 139 returned Rex::Proto::SMB::Exceptions::NoReply even with a bind payload. Solution: SMB negotiation requires multiple dynamic ports beyond 139 and 445. The portproxy only forwarded fixed ports and could not handle SMB's dynamic port requirements. Documented as a portproxy architecture limitation. Direct network access from ATT-KALI01 would be required for reliable Samba exploitation.</w:t>
       </w:r>
     </w:p>
     <w:p>
+      <w:pPr>
+        <w:pStyle w:val="Normal"/>
+        <w:rPr/>
+      </w:pPr>
       <w:r>
         <w:rPr>
           <w:b/>
@@ -575,10 +695,15 @@
         <w:t>Issue 39 — ATT-KALI01 could not reach DMZ-VULN01 despite both being on VMnet19</w:t>
       </w:r>
       <w:r>
+        <w:rPr/>
         <w:t xml:space="preserve"> After powering on ATT-KALI01, arping from ATT-KALI01 to Metasploitable (10.10.30.101) timed out at layer 2 even though both VMs were assigned to VMnet19. Solution: ATT-KALI01's second network adapter was set to VMnet8 (NAT) instead of VMnet10, which was causing routing confusion. Changed adapter 2 to VMnet10. VM-to-VM communication on the same VMnet switch still did not resolve — determined to be a VMware promiscuous mode limitation. Attack exercises proceeded via Dell portproxy from MacBook Kali as the designated external attack path.</w:t>
       </w:r>
     </w:p>
     <w:p>
+      <w:pPr>
+        <w:pStyle w:val="Normal"/>
+        <w:rPr/>
+      </w:pPr>
       <w:r>
         <w:rPr>
           <w:b/>
@@ -587,10 +712,15 @@
         <w:t>Issue 40 — vsftpd and Samba exploits failed through portproxy even after port 6200 was added</w:t>
       </w:r>
       <w:r>
+        <w:rPr/>
         <w:t xml:space="preserve"> The vsftpd backdoor opened on port 6200 but the Metasploit session never fully established through the portproxy chain. Samba continued to fail with NoReply. Solution: Abandoned portproxy for exploit traffic entirely. Established direct IPv4 routing from MacBook Kali through the Dell to the DMZ by enabling IP forwarding on the Dell's Ethernet and VMnet19 adapters. Added sudo ip route add 10.10.30.0/24 via 192.168.0.150 on MacBook Kali and a persistent return route on Metasploitable via /etc/network/interfaces post-up rule. Both exploits succeeded immediately over the direct route.</w:t>
       </w:r>
     </w:p>
     <w:p>
+      <w:pPr>
+        <w:pStyle w:val="Normal"/>
+        <w:rPr/>
+      </w:pPr>
       <w:r>
         <w:rPr>
           <w:b/>
@@ -599,12 +729,17 @@
         <w:t>Issue 41 — SMB ports 139/445 still unreachable after direct routing was established</w:t>
       </w:r>
       <w:r>
+        <w:rPr/>
         <w:t xml:space="preserve"> Even with direct routing working for vsftpd and Samba via port 4444, attempting to target 139/445 directly from MacBook Kali failed. Solution: Windows handles SMB traffic at the OS level on ports 139/445 and intercepts it before it can be forwarded, even with IP forwarding enabled. These ports cannot be forwarded through a Windows host under any configuration. Documented as a permanent architectural constraint. Samba exploitation confirmed working via the Metasploit reverse shell on port 4444 instead.</w:t>
       </w:r>
     </w:p>
     <w:p>
-      <w:r>
-        <w:lastRenderedPageBreak/>
+      <w:pPr>
+        <w:pStyle w:val="Normal"/>
+        <w:rPr/>
+      </w:pPr>
+      <w:r>
+        <w:rPr/>
         <w:t>*</w:t>
       </w:r>
       <w:r>
@@ -615,10 +750,15 @@
         <w:t>Issue 42 — SetVMnetIPs.ps1 path changed — script not found at C:\Users\raymo*</w:t>
       </w:r>
       <w:r>
+        <w:rPr/>
         <w:t xml:space="preserve"> After a session restart, running C:\Users\raymo\SetVMnetIPs.ps1 returned "not recognized as a cmdlet." The script had been moved. Solution: Located the script at D:\Lab-Documentation\Scripts\SetVMnetIPs.ps1. Also required setting execution policy first: Set-ExecutionPolicy -ExecutionPolicy RemoteSigned -Scope CurrentUser, then running with &amp; D:\Lab-Documentation\Scripts\SetVMnetIPs.ps1.</w:t>
       </w:r>
     </w:p>
     <w:p>
+      <w:pPr>
+        <w:pStyle w:val="Normal"/>
+        <w:rPr/>
+      </w:pPr>
       <w:r>
         <w:rPr>
           <w:b/>
@@ -627,10 +767,15 @@
         <w:t>Issue 43 — MacBook Kali route to DMZ lost after session restart</w:t>
       </w:r>
       <w:r>
+        <w:rPr/>
         <w:t xml:space="preserve"> After rebooting or starting a new session, ping 10.10.30.101 from MacBook Kali returned 100% packet loss even though SetVMnetIPs.ps1 had been run on the Dell. Solution: The route on MacBook Kali is runtime-only and does not persist across reboots. Must re-run sudo ip route add 10.10.30.0/24 via 192.168.0.150 on MacBook Kali at the start of every session involving DMZ traffic. The Dell side (SetVMnetIPs.ps1) handles its own persistence; the MacBook side does not.</w:t>
       </w:r>
     </w:p>
     <w:p>
+      <w:pPr>
+        <w:pStyle w:val="Normal"/>
+        <w:rPr/>
+      </w:pPr>
       <w:r>
         <w:rPr>
           <w:b/>
@@ -639,10 +784,15 @@
         <w:t>Issue 44 — tcpdump on DMZ-VULN01 captured 0 packets / 1 packet</w:t>
       </w:r>
       <w:r>
+        <w:rPr/>
         <w:t xml:space="preserve"> First two capture attempts returned 1 packet or 0 packets, missing the exploit traffic entirely. Root cause: tcpdump was started after the exploit had already run, or stopped too early. Solution: Strict sequence required — start tcpdump first and confirm "listening on eth0" before running the exploit, then stop tcpdump only after the exploit session has fully closed. Writing to /tmp/ also caused an early exit once; switching to /home/msfadmin/ resolved it.</w:t>
       </w:r>
     </w:p>
     <w:p>
+      <w:pPr>
+        <w:pStyle w:val="Normal"/>
+        <w:rPr/>
+      </w:pPr>
       <w:r>
         <w:rPr>
           <w:b/>
@@ -651,41 +801,495 @@
         <w:t>Issue 45 — SCP from DMZ-VULN01 to Dell failed with "Bad protocol 2 host key algorithms"</w:t>
       </w:r>
       <w:r>
+        <w:rPr/>
         <w:t xml:space="preserve"> Running scp -oHostKeyAlgorithms=+ssh-rsa from Metasploitable returned a syntax error — the old OpenSSH version on Metasploitable doesn't support the + prefix syntax or the -O flag. Solution: Reversed the transfer direction. Pulled the file from the Dell side using scp -o HostKeyAlgorithms=+ssh-rsa -o PubkeyAcceptedAlgorithms=+ssh-rsa msfadmin@10.10.30.101:/path C:\dest\. Modern OpenSSH on the Dell handles the legacy key negotiation correctly when initiating the connection.</w:t>
       </w:r>
     </w:p>
     <w:p>
-      <w:r>
-        <w:pict w14:anchorId="68DE6665">
-          <v:rect id="_x0000_i1025" style="width:0;height:1.5pt" o:hralign="center" o:hrstd="t" o:hr="t" fillcolor="#a0a0a0" stroked="f"/>
-        </w:pict>
-      </w:r>
-    </w:p>
-    <w:p>
-      <w:r>
-        <w:t xml:space="preserve">The pattern across all of these: Most issues came down to five root causes — network isolation behaving exactly as designed (VMnet segmentation, pfSense rule ordering), Linux case sensitivity and command syntax, Windows authentication layering (SYSTEM vs user sessions, Microsoft account vs local account, RDP session conflicts), tool constraints behaving as documented (VMware Workstation requiring a user session for VM start, wbadmin not supporting local volume targets for system state backup), and VMware virtual networking gaps (missing host adapters, stale VMnet assignments, VM adapters on networks that no longer exist in the Virtual Network Editor). Every single one was resolved </w:t>
-      </w:r>
-      <w:r>
-        <w:lastRenderedPageBreak/>
-        <w:t>methodically by checking logs, verifying with diagnostic commands, and understanding why the behavior was happening rather than just retrying blindly. That reasoning approach is exactly what interviewers want to hear about.</w:t>
+      <w:pPr>
+        <w:pStyle w:val="BodyText"/>
+        <w:spacing w:lineRule="auto" w:line="278" w:before="0" w:after="160"/>
+        <w:rPr/>
+      </w:pPr>
+      <w:r>
+        <w:rPr>
+          <w:rStyle w:val="Strong"/>
+        </w:rPr>
+        <w:t xml:space="preserve">Issue 46 — pfSense logs not appearing in Wazuh archives despite </w:t>
+      </w:r>
+      <w:r>
+        <w:rPr>
+          <w:rStyle w:val="SourceText"/>
+        </w:rPr>
+        <w:t>&lt;remote&gt;</w:t>
+      </w:r>
+      <w:r>
+        <w:rPr>
+          <w:rStyle w:val="Strong"/>
+        </w:rPr>
+        <w:t xml:space="preserve"> block configured</w:t>
+      </w:r>
+      <w:r>
+        <w:rPr/>
+        <w:t xml:space="preserve"> After adding the syslog listener block to ossec.conf and restarting the manager, the archives log showed no pfSense entries. Wazuh was listening on UDP 514 and receiving packets (confirmed via </w:t>
+      </w:r>
+      <w:r>
+        <w:rPr>
+          <w:rStyle w:val="SourceText"/>
+        </w:rPr>
+        <w:t>ss -ulnp</w:t>
+      </w:r>
+      <w:r>
+        <w:rPr/>
+        <w:t xml:space="preserve"> and </w:t>
+      </w:r>
+      <w:r>
+        <w:rPr>
+          <w:rStyle w:val="SourceText"/>
+        </w:rPr>
+        <w:t>tcpdump</w:t>
+      </w:r>
+      <w:r>
+        <w:rPr/>
+        <w:t xml:space="preserve">), but nothing was landing in </w:t>
+      </w:r>
+      <w:r>
+        <w:rPr>
+          <w:rStyle w:val="SourceText"/>
+        </w:rPr>
+        <w:t>/var/ossec/logs/archives/archives.log</w:t>
+      </w:r>
+      <w:r>
+        <w:rPr/>
+        <w:t xml:space="preserve">. Solution: Two separate problems. First, </w:t>
+      </w:r>
+      <w:r>
+        <w:rPr>
+          <w:rStyle w:val="SourceText"/>
+        </w:rPr>
+        <w:t>logall</w:t>
+      </w:r>
+      <w:r>
+        <w:rPr/>
+        <w:t xml:space="preserve"> was set to </w:t>
+      </w:r>
+      <w:r>
+        <w:rPr>
+          <w:rStyle w:val="SourceText"/>
+        </w:rPr>
+        <w:t>no</w:t>
+      </w:r>
+      <w:r>
+        <w:rPr/>
+        <w:t xml:space="preserve"> in ossec.conf — archive logging is disabled by default in Wazuh 4.x and must be explicitly enabled (</w:t>
+      </w:r>
+      <w:r>
+        <w:rPr>
+          <w:rStyle w:val="SourceText"/>
+        </w:rPr>
+        <w:t>&lt;logall&gt;yes&lt;/logall&gt;</w:t>
+      </w:r>
+      <w:r>
+        <w:rPr/>
+        <w:t xml:space="preserve">). Second, the original </w:t>
+      </w:r>
+      <w:r>
+        <w:rPr>
+          <w:rStyle w:val="SourceText"/>
+        </w:rPr>
+        <w:t>allowed-ips</w:t>
+      </w:r>
+      <w:r>
+        <w:rPr/>
+        <w:t xml:space="preserve"> value was set to a single IP (</w:t>
+      </w:r>
+      <w:r>
+        <w:rPr>
+          <w:rStyle w:val="SourceText"/>
+        </w:rPr>
+        <w:t>10.10.10.1</w:t>
+      </w:r>
+      <w:r>
+        <w:rPr/>
+        <w:t xml:space="preserve">) which was too narrow; changed to </w:t>
+      </w:r>
+      <w:r>
+        <w:rPr>
+          <w:rStyle w:val="SourceText"/>
+        </w:rPr>
+        <w:t>10.10.10.0/24</w:t>
+      </w:r>
+      <w:r>
+        <w:rPr/>
+        <w:t xml:space="preserve"> to cover the full Servers subnet. Restarted the manager and pfSense filterlog entries began writing to archives immediately.</w:t>
+      </w:r>
+    </w:p>
+    <w:p>
+      <w:pPr>
+        <w:pStyle w:val="BodyText"/>
+        <w:spacing w:lineRule="auto" w:line="278" w:before="0" w:after="160"/>
+        <w:rPr/>
+      </w:pPr>
+      <w:r>
+        <w:rPr>
+          <w:rStyle w:val="Strong"/>
+        </w:rPr>
+        <w:t>Issue 47 — pfSense not forwarding syslog despite Remote Logging enabled</w:t>
+      </w:r>
+      <w:r>
+        <w:rPr/>
+        <w:t xml:space="preserve"> After enabling Remote Logging in pfSense and adding </w:t>
+      </w:r>
+      <w:r>
+        <w:rPr>
+          <w:rStyle w:val="SourceText"/>
+        </w:rPr>
+        <w:t>10.10.10.135:514</w:t>
+      </w:r>
+      <w:r>
+        <w:rPr/>
+        <w:t xml:space="preserve"> as the remote server, tcpdump on SRV-SIEM01 showed zero packets from </w:t>
+      </w:r>
+      <w:r>
+        <w:rPr>
+          <w:rStyle w:val="SourceText"/>
+        </w:rPr>
+        <w:t>10.10.10.1</w:t>
+      </w:r>
+      <w:r>
+        <w:rPr/>
+        <w:t xml:space="preserve">. The config was saved and firewall events were checked, but nothing was arriving. Solution: pfSense's LAN interface had no firewall rule explicitly permitting outbound UDP 514 from itself to the Wazuh server. Existing Wazuh rules only covered ports 1514 and 1515 (agent traffic). Added a new LAN pass rule: source </w:t>
+      </w:r>
+      <w:r>
+        <w:rPr>
+          <w:rStyle w:val="SourceText"/>
+        </w:rPr>
+        <w:t>10.10.10.1</w:t>
+      </w:r>
+      <w:r>
+        <w:rPr/>
+        <w:t xml:space="preserve">, destination </w:t>
+      </w:r>
+      <w:r>
+        <w:rPr>
+          <w:rStyle w:val="SourceText"/>
+        </w:rPr>
+        <w:t>10.10.10.135</w:t>
+      </w:r>
+      <w:r>
+        <w:rPr/>
+        <w:t>, protocol UDP, port 514. Then clicked Save on the Remote Logging page again to force the syslog daemon to reinitialize. Filterlog entries began arriving within seconds.</w:t>
+      </w:r>
+    </w:p>
+    <w:p>
+      <w:pPr>
+        <w:pStyle w:val="BodyText"/>
+        <w:spacing w:lineRule="auto" w:line="278" w:before="0" w:after="160"/>
+        <w:rPr/>
+      </w:pPr>
+      <w:r>
+        <w:rPr>
+          <w:rStyle w:val="Strong"/>
+        </w:rPr>
+        <w:t>Issue 48 — Wazuh manager failed to restart after adding pfSense decoder</w:t>
+      </w:r>
+      <w:r>
+        <w:rPr/>
+        <w:t xml:space="preserve"> After adding a parent decoder (</w:t>
+      </w:r>
+      <w:r>
+        <w:rPr>
+          <w:rStyle w:val="SourceText"/>
+        </w:rPr>
+        <w:t>&lt;prematch&gt;filterlog&lt;/prematch&gt;</w:t>
+      </w:r>
+      <w:r>
+        <w:rPr/>
+        <w:t xml:space="preserve">) and a child decoder with a regex pattern to local_decoder.xml, </w:t>
+      </w:r>
+      <w:r>
+        <w:rPr>
+          <w:rStyle w:val="SourceText"/>
+        </w:rPr>
+        <w:t>systemctl restart wazuh-manager</w:t>
+      </w:r>
+      <w:r>
+        <w:rPr/>
+        <w:t xml:space="preserve"> failed with exit code 1. Log showed </w:t>
+      </w:r>
+      <w:r>
+        <w:rPr>
+          <w:rStyle w:val="SourceText"/>
+        </w:rPr>
+        <w:t>ERROR: (1452): Syntax error on regex: 'filterlog\[\d+\]: (\S+)'</w:t>
+      </w:r>
+      <w:r>
+        <w:rPr/>
+        <w:t xml:space="preserve">. Solution: Wazuh's regex engine (OSRegex) does not accept PCRE shortcuts like </w:t>
+      </w:r>
+      <w:r>
+        <w:rPr>
+          <w:rStyle w:val="SourceText"/>
+        </w:rPr>
+        <w:t>\d</w:t>
+      </w:r>
+      <w:r>
+        <w:rPr/>
+        <w:t xml:space="preserve">, </w:t>
+      </w:r>
+      <w:r>
+        <w:rPr>
+          <w:rStyle w:val="SourceText"/>
+        </w:rPr>
+        <w:t>\S</w:t>
+      </w:r>
+      <w:r>
+        <w:rPr/>
+        <w:t xml:space="preserve">, or </w:t>
+      </w:r>
+      <w:r>
+        <w:rPr>
+          <w:rStyle w:val="SourceText"/>
+        </w:rPr>
+        <w:t>\w</w:t>
+      </w:r>
+      <w:r>
+        <w:rPr/>
+        <w:t xml:space="preserve">. POSIX-style </w:t>
+      </w:r>
+      <w:r>
+        <w:rPr>
+          <w:rStyle w:val="SourceText"/>
+        </w:rPr>
+        <w:t>[0-9]</w:t>
+      </w:r>
+      <w:r>
+        <w:rPr/>
+        <w:t xml:space="preserve"> substitutions also failed because the overall decoder regex structure was incompatible with OSRegex. Removed the child decoder entirely and kept only the parent with </w:t>
+      </w:r>
+      <w:r>
+        <w:rPr>
+          <w:rStyle w:val="SourceText"/>
+        </w:rPr>
+        <w:t>&lt;prematch&gt;filterlog&lt;/prematch&gt;</w:t>
+      </w:r>
+      <w:r>
+        <w:rPr/>
+        <w:t xml:space="preserve">. Manager restarted cleanly. For rule-level matching on dstport=6200, the </w:t>
+      </w:r>
+      <w:r>
+        <w:rPr>
+          <w:rStyle w:val="SourceText"/>
+        </w:rPr>
+        <w:t>&lt;match&gt;</w:t>
+      </w:r>
+      <w:r>
+        <w:rPr/>
+        <w:t xml:space="preserve"> tag in local_rules.xml handles the filtering directly against the raw message body — no child decoder required.</w:t>
+      </w:r>
+    </w:p>
+    <w:p>
+      <w:pPr>
+        <w:pStyle w:val="BodyText"/>
+        <w:spacing w:lineRule="auto" w:line="278" w:before="0" w:after="160"/>
+        <w:rPr/>
+      </w:pPr>
+      <w:r>
+        <w:rPr>
+          <w:rStyle w:val="Strong"/>
+        </w:rPr>
+        <w:t>Issue 49 — Rule 100010 needed validation but VMnet19 became unstable after Dell restart</w:t>
+      </w:r>
+      <w:r>
+        <w:rPr/>
+        <w:t xml:space="preserve"> After writing rule 100010 and confirming the manager was running cleanly, the plan was to run the actual vsftpd exploit to trigger the rule. VMnet19 had broken silently after the overnight Dell restart — ATT-KALI01 and DMZ-VULN01 could not pass TCP traffic between each other despite both being on VMnet19 and despite ICMP working intermittently. ARP entries on ATT-KALI01 remained incomplete for both pfSense OPT2 (10.10.30.1) and DMZ-VULN01 (10.10.30.101). Restarting </w:t>
+      </w:r>
+      <w:r>
+        <w:rPr>
+          <w:rStyle w:val="SourceText"/>
+        </w:rPr>
+        <w:t>vmnetdhcp</w:t>
+      </w:r>
+      <w:r>
+        <w:rPr/>
+        <w:t xml:space="preserve"> and </w:t>
+      </w:r>
+      <w:r>
+        <w:rPr>
+          <w:rStyle w:val="SourceText"/>
+        </w:rPr>
+        <w:t>vmnetbridge</w:t>
+      </w:r>
+      <w:r>
+        <w:rPr/>
+        <w:t xml:space="preserve"> services on the Dell briefly restored ICMP but TCP still failed. MacBook-direct routing through the Dell also failed despite IPv4 forwarding being enabled on VMnet19 and the macOS host route being correct. Solution: Deferred live exploit validation to a later session. Validated rule 100010 using a synthetic filterlog message injected via </w:t>
+      </w:r>
+      <w:r>
+        <w:rPr>
+          <w:rStyle w:val="SourceText"/>
+        </w:rPr>
+        <w:t>logger -n 10.10.10.135 -P 514 -d -t filterlog "2,,,1000000101,em2,match,pass,out,4,0x0,,64,12345,0,none,6,tcp,60,10.10.30.101,192.168.1.50,6200,54321,...dstport=6200"</w:t>
+      </w:r>
+      <w:r>
+        <w:rPr/>
+        <w:t>. Alert fired correctly at level 12 with the expected description and T1190 MITRE mapping. Detection logic is confirmed functional; live exploit re-test pending VMnet19 stability recovery.</w:t>
+      </w:r>
+    </w:p>
+    <w:p>
+      <w:pPr>
+        <w:pStyle w:val="BodyText"/>
+        <w:spacing w:lineRule="auto" w:line="278" w:before="0" w:after="160"/>
+        <w:rPr/>
+      </w:pPr>
+      <w:r>
+        <w:rPr>
+          <w:rStyle w:val="Strong"/>
+        </w:rPr>
+        <w:t>Issue 50 — ATT-KALI01 SSH service disabled by default after power-on</w:t>
+      </w:r>
+      <w:r>
+        <w:rPr/>
+        <w:t xml:space="preserve"> SSH from the Dell to ATT-KALI01 at 10.10.30.130 timed out even though the VM was booted and had the correct IP. Solution: The </w:t>
+      </w:r>
+      <w:r>
+        <w:rPr>
+          <w:rStyle w:val="SourceText"/>
+        </w:rPr>
+        <w:t>ssh</w:t>
+      </w:r>
+      <w:r>
+        <w:rPr/>
+        <w:t xml:space="preserve"> service is loaded but disabled and inactive on Kali by default. Ran </w:t>
+      </w:r>
+      <w:r>
+        <w:rPr>
+          <w:rStyle w:val="SourceText"/>
+        </w:rPr>
+        <w:t>sudo systemctl start ssh</w:t>
+      </w:r>
+      <w:r>
+        <w:rPr/>
+        <w:t>. SSH functionality was still limited by the VMnet19 TCP issue in Issue 49, but the service state itself is worth remembering for future sessions — Kali does not start SSH automatically.</w:t>
+      </w:r>
+    </w:p>
+    <w:p>
+      <w:pPr>
+        <w:pStyle w:val="Normal"/>
+        <w:rPr/>
+      </w:pPr>
+      <w:r>
+        <w:rPr/>
+      </w:r>
+    </w:p>
+    <w:p>
+      <w:pPr>
+        <w:pStyle w:val="Normal"/>
+        <w:rPr/>
+      </w:pPr>
+      <w:r>
+        <w:rPr/>
+        <mc:AlternateContent>
+          <mc:Choice Requires="wps">
+            <w:drawing>
+              <wp:inline distT="0" distB="0" distL="0" distR="0">
+                <wp:extent cx="5943600" cy="19050"/>
+                <wp:effectExtent l="0" t="0" r="0" b="0"/>
+                <wp:docPr id="1" name=""/>
+                <a:graphic xmlns:a="http://schemas.openxmlformats.org/drawingml/2006/main">
+                  <a:graphicData uri="http://schemas.microsoft.com/office/word/2010/wordprocessingShape">
+                    <wps:wsp>
+                      <wps:cNvSpPr/>
+                      <wps:nvSpPr>
+                        <wps:cNvPr id="2" name=""/>
+                        <wps:cNvSpPr/>
+                      </wps:nvSpPr>
+                      <wps:spPr>
+                        <a:xfrm>
+                          <a:off x="0" y="0"/>
+                          <a:ext cx="5943600" cy="19080"/>
+                        </a:xfrm>
+                        <a:prstGeom prst="rect">
+                          <a:avLst/>
+                        </a:prstGeom>
+                        <a:solidFill>
+                          <a:srgbClr val="a0a0a0"/>
+                        </a:solidFill>
+                        <a:ln w="0">
+                          <a:noFill/>
+                        </a:ln>
+                      </wps:spPr>
+                      <wps:bodyPr/>
+                    </wps:wsp>
+                  </a:graphicData>
+                </a:graphic>
+                <wp14:sizeRelH relativeFrom="page">
+                  <wp14:pctWidth>100000</wp14:pctWidth>
+                </wp14:sizeRelH>
+              </wp:inline>
+            </w:drawing>
+          </mc:Choice>
+          <mc:Fallback>
+            <w:pict>
+              <v:rect id="shape_0" fillcolor="#a0a0a0" stroked="f" o:allowincell="f" style="position:absolute;margin-left:0pt;margin-top:-1.55pt;width:467.95pt;height:1.45pt;mso-wrap-style:none;v-text-anchor:middle;mso-position-horizontal:center;mso-position-vertical:top">
+                <v:fill o:detectmouseclick="t" type="solid" color2="#5f5f5f"/>
+                <v:stroke color="#3465a4" joinstyle="round" endcap="flat"/>
+                <w10:wrap type="topAndBottom"/>
+              </v:rect>
+            </w:pict>
+          </mc:Fallback>
+        </mc:AlternateContent>
+      </w:r>
+    </w:p>
+    <w:p>
+      <w:pPr>
+        <w:pStyle w:val="BodyText"/>
+        <w:spacing w:lineRule="auto" w:line="278" w:before="0" w:after="160"/>
+        <w:rPr/>
+      </w:pPr>
+      <w:r>
+        <w:rPr/>
+        <w:t xml:space="preserve">The pattern across all of these: Most issues came down to six root causes — network isolation behaving exactly as designed (VMnet segmentation, pfSense rule ordering, firewall rules missing for new service ports), Linux case sensitivity and command syntax, Windows authentication layering (SYSTEM vs user sessions, Microsoft account vs local account, RDP session conflicts), tool constraints behaving as documented (VMware Workstation requiring a user session for VM start, wbadmin not supporting local volume targets for system state backup, Wazuh OSRegex not accepting PCRE shortcuts, Wazuh archive logging disabled by default), VMware virtual networking gaps (missing host adapters, stale VMnet assignments, VM adapters on networks that no longer exist, virtual switches becoming unstable after host restarts), and configuration defaults being restrictive rather than permissive (SSH service disabled on Kali, </w:t>
+      </w:r>
+      <w:r>
+        <w:rPr>
+          <w:rStyle w:val="SourceText"/>
+        </w:rPr>
+        <w:t>logall</w:t>
+      </w:r>
+      <w:r>
+        <w:rPr/>
+        <w:t xml:space="preserve"> off in Wazuh, </w:t>
+      </w:r>
+      <w:r>
+        <w:rPr>
+          <w:rStyle w:val="SourceText"/>
+        </w:rPr>
+        <w:t>allowed-ips</w:t>
+      </w:r>
+      <w:r>
+        <w:rPr/>
+        <w:t xml:space="preserve"> needing subnet scope instead of single IP). Every single one was resolved methodically by checking logs, verifying with diagnostic commands, and understanding why the behavior was happening rather than just retrying blindly. That reasoning approach is exactly what interviewers want to hear about.</w:t>
       </w:r>
     </w:p>
     <w:sectPr>
+      <w:type w:val="nextPage"/>
       <w:pgSz w:w="12240" w:h="15840"/>
-      <w:pgMar w:top="1440" w:right="1440" w:bottom="1440" w:left="1440" w:header="720" w:footer="720" w:gutter="0"/>
-      <w:cols w:space="720"/>
-      <w:docGrid w:linePitch="360"/>
+      <w:pgMar w:left="1440" w:right="1440" w:gutter="0" w:header="0" w:top="1440" w:footer="0" w:bottom="1440"/>
+      <w:pgNumType w:fmt="decimal"/>
+      <w:formProt w:val="false"/>
+      <w:textDirection w:val="lrTb"/>
+      <w:docGrid w:type="default" w:linePitch="360" w:charSpace="0"/>
     </w:sectPr>
   </w:body>
 </w:document>
 </file>
 
 <file path=word/styles.xml><?xml version="1.0" encoding="utf-8"?>
-<w:styles xmlns:mc="http://schemas.openxmlformats.org/markup-compatibility/2006" xmlns:r="http://schemas.openxmlformats.org/officeDocument/2006/relationships" xmlns:w="http://schemas.openxmlformats.org/wordprocessingml/2006/main" xmlns:w14="http://schemas.microsoft.com/office/word/2010/wordml" xmlns:w15="http://schemas.microsoft.com/office/word/2012/wordml" xmlns:w16cex="http://schemas.microsoft.com/office/word/2018/wordml/cex" xmlns:w16cid="http://schemas.microsoft.com/office/word/2016/wordml/cid" xmlns:w16="http://schemas.microsoft.com/office/word/2018/wordml" xmlns:w16du="http://schemas.microsoft.com/office/word/2023/wordml/word16du" xmlns:w16sdtdh="http://schemas.microsoft.com/office/word/2020/wordml/sdtdatahash" xmlns:w16sdtfl="http://schemas.microsoft.com/office/word/2024/wordml/sdtformatlock" xmlns:w16se="http://schemas.microsoft.com/office/word/2015/wordml/symex" mc:Ignorable="w14 w15 w16se w16cid w16 w16cex w16sdtdh w16sdtfl w16du">
+<w:styles xmlns:w="http://schemas.openxmlformats.org/wordprocessingml/2006/main" xmlns:w14="http://schemas.microsoft.com/office/word/2010/wordml" xmlns:mc="http://schemas.openxmlformats.org/markup-compatibility/2006" mc:Ignorable="w14">
   <w:docDefaults>
     <w:rPrDefault>
       <w:rPr>
-        <w:rFonts w:asciiTheme="minorHAnsi" w:eastAsiaTheme="minorHAnsi" w:hAnsiTheme="minorHAnsi" w:cstheme="minorBidi"/>
+        <w:rFonts w:ascii="Aptos" w:hAnsi="Aptos" w:eastAsia="Aptos" w:cs="" w:asciiTheme="minorHAnsi" w:cstheme="minorBidi" w:eastAsiaTheme="minorHAnsi" w:hAnsiTheme="minorHAnsi"/>
         <w:kern w:val="2"/>
         <w:sz w:val="24"/>
         <w:szCs w:val="24"/>
@@ -695,21 +1299,21 @@
     </w:rPrDefault>
     <w:pPrDefault>
       <w:pPr>
-        <w:spacing w:after="160" w:line="278" w:lineRule="auto"/>
+        <w:suppressAutoHyphens w:val="true"/>
       </w:pPr>
     </w:pPrDefault>
   </w:docDefaults>
   <w:latentStyles w:defLockedState="0" w:defUIPriority="99" w:defSemiHidden="0" w:defUnhideWhenUsed="0" w:defQFormat="0" w:count="376">
     <w:lsdException w:name="Normal" w:uiPriority="0" w:qFormat="1"/>
     <w:lsdException w:name="heading 1" w:uiPriority="9" w:qFormat="1"/>
-    <w:lsdException w:name="heading 2" w:semiHidden="1" w:uiPriority="9" w:unhideWhenUsed="1" w:qFormat="1"/>
-    <w:lsdException w:name="heading 3" w:semiHidden="1" w:uiPriority="9" w:unhideWhenUsed="1" w:qFormat="1"/>
-    <w:lsdException w:name="heading 4" w:semiHidden="1" w:uiPriority="9" w:unhideWhenUsed="1" w:qFormat="1"/>
-    <w:lsdException w:name="heading 5" w:semiHidden="1" w:uiPriority="9" w:unhideWhenUsed="1" w:qFormat="1"/>
-    <w:lsdException w:name="heading 6" w:semiHidden="1" w:uiPriority="9" w:unhideWhenUsed="1" w:qFormat="1"/>
-    <w:lsdException w:name="heading 7" w:semiHidden="1" w:uiPriority="9" w:unhideWhenUsed="1" w:qFormat="1"/>
-    <w:lsdException w:name="heading 8" w:semiHidden="1" w:uiPriority="9" w:unhideWhenUsed="1" w:qFormat="1"/>
-    <w:lsdException w:name="heading 9" w:semiHidden="1" w:uiPriority="9" w:unhideWhenUsed="1" w:qFormat="1"/>
+    <w:lsdException w:name="heading 2" w:uiPriority="9" w:semiHidden="1" w:unhideWhenUsed="1" w:qFormat="1"/>
+    <w:lsdException w:name="heading 3" w:uiPriority="9" w:semiHidden="1" w:unhideWhenUsed="1" w:qFormat="1"/>
+    <w:lsdException w:name="heading 4" w:uiPriority="9" w:semiHidden="1" w:unhideWhenUsed="1" w:qFormat="1"/>
+    <w:lsdException w:name="heading 5" w:uiPriority="9" w:semiHidden="1" w:unhideWhenUsed="1" w:qFormat="1"/>
+    <w:lsdException w:name="heading 6" w:uiPriority="9" w:semiHidden="1" w:unhideWhenUsed="1" w:qFormat="1"/>
+    <w:lsdException w:name="heading 7" w:uiPriority="9" w:semiHidden="1" w:unhideWhenUsed="1" w:qFormat="1"/>
+    <w:lsdException w:name="heading 8" w:uiPriority="9" w:semiHidden="1" w:unhideWhenUsed="1" w:qFormat="1"/>
+    <w:lsdException w:name="heading 9" w:uiPriority="9" w:semiHidden="1" w:unhideWhenUsed="1" w:qFormat="1"/>
     <w:lsdException w:name="index 1" w:semiHidden="1" w:unhideWhenUsed="1"/>
     <w:lsdException w:name="index 2" w:semiHidden="1" w:unhideWhenUsed="1"/>
     <w:lsdException w:name="index 3" w:semiHidden="1" w:unhideWhenUsed="1"/>
@@ -719,22 +1323,22 @@
     <w:lsdException w:name="index 7" w:semiHidden="1" w:unhideWhenUsed="1"/>
     <w:lsdException w:name="index 8" w:semiHidden="1" w:unhideWhenUsed="1"/>
     <w:lsdException w:name="index 9" w:semiHidden="1" w:unhideWhenUsed="1"/>
-    <w:lsdException w:name="toc 1" w:semiHidden="1" w:uiPriority="39" w:unhideWhenUsed="1"/>
-    <w:lsdException w:name="toc 2" w:semiHidden="1" w:uiPriority="39" w:unhideWhenUsed="1"/>
-    <w:lsdException w:name="toc 3" w:semiHidden="1" w:uiPriority="39" w:unhideWhenUsed="1"/>
-    <w:lsdException w:name="toc 4" w:semiHidden="1" w:uiPriority="39" w:unhideWhenUsed="1"/>
-    <w:lsdException w:name="toc 5" w:semiHidden="1" w:uiPriority="39" w:unhideWhenUsed="1"/>
-    <w:lsdException w:name="toc 6" w:semiHidden="1" w:uiPriority="39" w:unhideWhenUsed="1"/>
-    <w:lsdException w:name="toc 7" w:semiHidden="1" w:uiPriority="39" w:unhideWhenUsed="1"/>
-    <w:lsdException w:name="toc 8" w:semiHidden="1" w:uiPriority="39" w:unhideWhenUsed="1"/>
-    <w:lsdException w:name="toc 9" w:semiHidden="1" w:uiPriority="39" w:unhideWhenUsed="1"/>
+    <w:lsdException w:name="toc 1" w:uiPriority="39" w:semiHidden="1" w:unhideWhenUsed="1"/>
+    <w:lsdException w:name="toc 2" w:uiPriority="39" w:semiHidden="1" w:unhideWhenUsed="1"/>
+    <w:lsdException w:name="toc 3" w:uiPriority="39" w:semiHidden="1" w:unhideWhenUsed="1"/>
+    <w:lsdException w:name="toc 4" w:uiPriority="39" w:semiHidden="1" w:unhideWhenUsed="1"/>
+    <w:lsdException w:name="toc 5" w:uiPriority="39" w:semiHidden="1" w:unhideWhenUsed="1"/>
+    <w:lsdException w:name="toc 6" w:uiPriority="39" w:semiHidden="1" w:unhideWhenUsed="1"/>
+    <w:lsdException w:name="toc 7" w:uiPriority="39" w:semiHidden="1" w:unhideWhenUsed="1"/>
+    <w:lsdException w:name="toc 8" w:uiPriority="39" w:semiHidden="1" w:unhideWhenUsed="1"/>
+    <w:lsdException w:name="toc 9" w:uiPriority="39" w:semiHidden="1" w:unhideWhenUsed="1"/>
     <w:lsdException w:name="Normal Indent" w:semiHidden="1" w:unhideWhenUsed="1"/>
     <w:lsdException w:name="footnote text" w:semiHidden="1" w:unhideWhenUsed="1"/>
     <w:lsdException w:name="annotation text" w:semiHidden="1" w:unhideWhenUsed="1"/>
     <w:lsdException w:name="header" w:semiHidden="1" w:unhideWhenUsed="1"/>
     <w:lsdException w:name="footer" w:semiHidden="1" w:unhideWhenUsed="1"/>
     <w:lsdException w:name="index heading" w:semiHidden="1" w:unhideWhenUsed="1"/>
-    <w:lsdException w:name="caption" w:semiHidden="1" w:uiPriority="35" w:unhideWhenUsed="1" w:qFormat="1"/>
+    <w:lsdException w:name="caption" w:uiPriority="35" w:semiHidden="1" w:unhideWhenUsed="1" w:qFormat="1"/>
     <w:lsdException w:name="table of figures" w:semiHidden="1" w:unhideWhenUsed="1"/>
     <w:lsdException w:name="envelope address" w:semiHidden="1" w:unhideWhenUsed="1"/>
     <w:lsdException w:name="envelope return" w:semiHidden="1" w:unhideWhenUsed="1"/>
@@ -765,7 +1369,7 @@
     <w:lsdException w:name="Title" w:uiPriority="10" w:qFormat="1"/>
     <w:lsdException w:name="Closing" w:semiHidden="1" w:unhideWhenUsed="1"/>
     <w:lsdException w:name="Signature" w:semiHidden="1" w:unhideWhenUsed="1"/>
-    <w:lsdException w:name="Default Paragraph Font" w:semiHidden="1" w:uiPriority="1" w:unhideWhenUsed="1"/>
+    <w:lsdException w:name="Default Paragraph Font" w:uiPriority="1" w:semiHidden="1" w:unhideWhenUsed="1"/>
     <w:lsdException w:name="Body Text" w:semiHidden="1" w:unhideWhenUsed="1"/>
     <w:lsdException w:name="Body Text Indent" w:semiHidden="1" w:unhideWhenUsed="1"/>
     <w:lsdException w:name="List Continue" w:semiHidden="1" w:unhideWhenUsed="1"/>
@@ -965,8 +1569,8 @@
     <w:lsdException w:name="Subtle Reference" w:uiPriority="31" w:qFormat="1"/>
     <w:lsdException w:name="Intense Reference" w:uiPriority="32" w:qFormat="1"/>
     <w:lsdException w:name="Book Title" w:uiPriority="33" w:qFormat="1"/>
-    <w:lsdException w:name="Bibliography" w:semiHidden="1" w:uiPriority="37" w:unhideWhenUsed="1"/>
-    <w:lsdException w:name="TOC Heading" w:semiHidden="1" w:uiPriority="39" w:unhideWhenUsed="1" w:qFormat="1"/>
+    <w:lsdException w:name="Bibliography" w:uiPriority="37" w:semiHidden="1" w:unhideWhenUsed="1"/>
+    <w:lsdException w:name="TOC Heading" w:uiPriority="39" w:semiHidden="1" w:unhideWhenUsed="1" w:qFormat="1"/>
     <w:lsdException w:name="Plain Table 1" w:uiPriority="41"/>
     <w:lsdException w:name="Plain Table 2" w:uiPriority="42"/>
     <w:lsdException w:name="Plain Table 3" w:uiPriority="43"/>
@@ -1077,9 +1681,24 @@
     <w:lsdException w:name="Unresolved Mention" w:semiHidden="1" w:unhideWhenUsed="1"/>
     <w:lsdException w:name="Smart Link" w:semiHidden="1" w:unhideWhenUsed="1"/>
   </w:latentStyles>
-  <w:style w:type="paragraph" w:default="1" w:styleId="Normal">
+  <w:style w:type="paragraph" w:styleId="Normal" w:default="1">
     <w:name w:val="Normal"/>
     <w:qFormat/>
+    <w:pPr>
+      <w:widowControl/>
+      <w:bidi w:val="0"/>
+      <w:spacing w:lineRule="auto" w:line="278" w:before="0" w:after="160"/>
+      <w:jc w:val="start"/>
+    </w:pPr>
+    <w:rPr>
+      <w:rFonts w:ascii="Aptos" w:hAnsi="Aptos" w:eastAsia="Aptos" w:cs="" w:asciiTheme="minorHAnsi" w:cstheme="minorBidi" w:eastAsiaTheme="minorHAnsi" w:hAnsiTheme="minorHAnsi"/>
+      <w:color w:val="auto"/>
+      <w:kern w:val="2"/>
+      <w:sz w:val="24"/>
+      <w:szCs w:val="24"/>
+      <w:lang w:val="en-US" w:eastAsia="en-US" w:bidi="ar-SA"/>
+      <w14:ligatures w14:val="standardContextual"/>
+    </w:rPr>
   </w:style>
   <w:style w:type="paragraph" w:styleId="Heading1">
     <w:name w:val="heading 1"/>
@@ -1088,16 +1707,16 @@
     <w:link w:val="Heading1Char"/>
     <w:uiPriority w:val="9"/>
     <w:qFormat/>
-    <w:rsid w:val="00E627D8"/>
+    <w:rsid w:val="00e627d8"/>
     <w:pPr>
-      <w:keepNext/>
+      <w:keepNext w:val="true"/>
       <w:keepLines/>
       <w:spacing w:before="360" w:after="80"/>
       <w:outlineLvl w:val="0"/>
     </w:pPr>
     <w:rPr>
-      <w:rFonts w:asciiTheme="majorHAnsi" w:eastAsiaTheme="majorEastAsia" w:hAnsiTheme="majorHAnsi" w:cstheme="majorBidi"/>
-      <w:color w:val="0F4761" w:themeColor="accent1" w:themeShade="BF"/>
+      <w:rFonts w:ascii="Aptos Display" w:hAnsi="Aptos Display" w:eastAsia="" w:cs="" w:asciiTheme="majorHAnsi" w:cstheme="majorBidi" w:eastAsiaTheme="majorEastAsia" w:hAnsiTheme="majorHAnsi"/>
+      <w:color w:themeColor="accent1" w:themeShade="bf" w:val="0F4761"/>
       <w:sz w:val="40"/>
       <w:szCs w:val="40"/>
     </w:rPr>
@@ -1111,16 +1730,16 @@
     <w:semiHidden/>
     <w:unhideWhenUsed/>
     <w:qFormat/>
-    <w:rsid w:val="00E627D8"/>
+    <w:rsid w:val="00e627d8"/>
     <w:pPr>
-      <w:keepNext/>
+      <w:keepNext w:val="true"/>
       <w:keepLines/>
       <w:spacing w:before="160" w:after="80"/>
       <w:outlineLvl w:val="1"/>
     </w:pPr>
     <w:rPr>
-      <w:rFonts w:asciiTheme="majorHAnsi" w:eastAsiaTheme="majorEastAsia" w:hAnsiTheme="majorHAnsi" w:cstheme="majorBidi"/>
-      <w:color w:val="0F4761" w:themeColor="accent1" w:themeShade="BF"/>
+      <w:rFonts w:ascii="Aptos Display" w:hAnsi="Aptos Display" w:eastAsia="" w:cs="" w:asciiTheme="majorHAnsi" w:cstheme="majorBidi" w:eastAsiaTheme="majorEastAsia" w:hAnsiTheme="majorHAnsi"/>
+      <w:color w:themeColor="accent1" w:themeShade="bf" w:val="0F4761"/>
       <w:sz w:val="32"/>
       <w:szCs w:val="32"/>
     </w:rPr>
@@ -1134,16 +1753,16 @@
     <w:semiHidden/>
     <w:unhideWhenUsed/>
     <w:qFormat/>
-    <w:rsid w:val="00E627D8"/>
+    <w:rsid w:val="00e627d8"/>
     <w:pPr>
-      <w:keepNext/>
+      <w:keepNext w:val="true"/>
       <w:keepLines/>
       <w:spacing w:before="160" w:after="80"/>
       <w:outlineLvl w:val="2"/>
     </w:pPr>
     <w:rPr>
-      <w:rFonts w:eastAsiaTheme="majorEastAsia" w:cstheme="majorBidi"/>
-      <w:color w:val="0F4761" w:themeColor="accent1" w:themeShade="BF"/>
+      <w:rFonts w:eastAsia="" w:cs="" w:cstheme="majorBidi" w:eastAsiaTheme="majorEastAsia"/>
+      <w:color w:themeColor="accent1" w:themeShade="bf" w:val="0F4761"/>
       <w:sz w:val="28"/>
       <w:szCs w:val="28"/>
     </w:rPr>
@@ -1157,18 +1776,18 @@
     <w:semiHidden/>
     <w:unhideWhenUsed/>
     <w:qFormat/>
-    <w:rsid w:val="00E627D8"/>
+    <w:rsid w:val="00e627d8"/>
     <w:pPr>
-      <w:keepNext/>
+      <w:keepNext w:val="true"/>
       <w:keepLines/>
       <w:spacing w:before="80" w:after="40"/>
       <w:outlineLvl w:val="3"/>
     </w:pPr>
     <w:rPr>
-      <w:rFonts w:eastAsiaTheme="majorEastAsia" w:cstheme="majorBidi"/>
+      <w:rFonts w:eastAsia="" w:cs="" w:cstheme="majorBidi" w:eastAsiaTheme="majorEastAsia"/>
       <w:i/>
       <w:iCs/>
-      <w:color w:val="0F4761" w:themeColor="accent1" w:themeShade="BF"/>
+      <w:color w:themeColor="accent1" w:themeShade="bf" w:val="0F4761"/>
     </w:rPr>
   </w:style>
   <w:style w:type="paragraph" w:styleId="Heading5">
@@ -1180,16 +1799,16 @@
     <w:semiHidden/>
     <w:unhideWhenUsed/>
     <w:qFormat/>
-    <w:rsid w:val="00E627D8"/>
+    <w:rsid w:val="00e627d8"/>
     <w:pPr>
-      <w:keepNext/>
+      <w:keepNext w:val="true"/>
       <w:keepLines/>
       <w:spacing w:before="80" w:after="40"/>
       <w:outlineLvl w:val="4"/>
     </w:pPr>
     <w:rPr>
-      <w:rFonts w:eastAsiaTheme="majorEastAsia" w:cstheme="majorBidi"/>
-      <w:color w:val="0F4761" w:themeColor="accent1" w:themeShade="BF"/>
+      <w:rFonts w:eastAsia="" w:cs="" w:cstheme="majorBidi" w:eastAsiaTheme="majorEastAsia"/>
+      <w:color w:themeColor="accent1" w:themeShade="bf" w:val="0F4761"/>
     </w:rPr>
   </w:style>
   <w:style w:type="paragraph" w:styleId="Heading6">
@@ -1201,18 +1820,18 @@
     <w:semiHidden/>
     <w:unhideWhenUsed/>
     <w:qFormat/>
-    <w:rsid w:val="00E627D8"/>
+    <w:rsid w:val="00e627d8"/>
     <w:pPr>
-      <w:keepNext/>
+      <w:keepNext w:val="true"/>
       <w:keepLines/>
       <w:spacing w:before="40" w:after="0"/>
       <w:outlineLvl w:val="5"/>
     </w:pPr>
     <w:rPr>
-      <w:rFonts w:eastAsiaTheme="majorEastAsia" w:cstheme="majorBidi"/>
+      <w:rFonts w:eastAsia="" w:cs="" w:cstheme="majorBidi" w:eastAsiaTheme="majorEastAsia"/>
       <w:i/>
       <w:iCs/>
-      <w:color w:val="595959" w:themeColor="text1" w:themeTint="A6"/>
+      <w:color w:themeColor="text1" w:themeTint="a6" w:val="595959"/>
     </w:rPr>
   </w:style>
   <w:style w:type="paragraph" w:styleId="Heading7">
@@ -1224,16 +1843,16 @@
     <w:semiHidden/>
     <w:unhideWhenUsed/>
     <w:qFormat/>
-    <w:rsid w:val="00E627D8"/>
+    <w:rsid w:val="00e627d8"/>
     <w:pPr>
-      <w:keepNext/>
+      <w:keepNext w:val="true"/>
       <w:keepLines/>
       <w:spacing w:before="40" w:after="0"/>
       <w:outlineLvl w:val="6"/>
     </w:pPr>
     <w:rPr>
-      <w:rFonts w:eastAsiaTheme="majorEastAsia" w:cstheme="majorBidi"/>
-      <w:color w:val="595959" w:themeColor="text1" w:themeTint="A6"/>
+      <w:rFonts w:eastAsia="" w:cs="" w:cstheme="majorBidi" w:eastAsiaTheme="majorEastAsia"/>
+      <w:color w:themeColor="text1" w:themeTint="a6" w:val="595959"/>
     </w:rPr>
   </w:style>
   <w:style w:type="paragraph" w:styleId="Heading8">
@@ -1245,18 +1864,18 @@
     <w:semiHidden/>
     <w:unhideWhenUsed/>
     <w:qFormat/>
-    <w:rsid w:val="00E627D8"/>
+    <w:rsid w:val="00e627d8"/>
     <w:pPr>
-      <w:keepNext/>
+      <w:keepNext w:val="true"/>
       <w:keepLines/>
-      <w:spacing w:after="0"/>
+      <w:spacing w:before="0" w:after="0"/>
       <w:outlineLvl w:val="7"/>
     </w:pPr>
     <w:rPr>
-      <w:rFonts w:eastAsiaTheme="majorEastAsia" w:cstheme="majorBidi"/>
+      <w:rFonts w:eastAsia="" w:cs="" w:cstheme="majorBidi" w:eastAsiaTheme="majorEastAsia"/>
       <w:i/>
       <w:iCs/>
-      <w:color w:val="272727" w:themeColor="text1" w:themeTint="D8"/>
+      <w:color w:themeColor="text1" w:themeTint="d8" w:val="272727"/>
     </w:rPr>
   </w:style>
   <w:style w:type="paragraph" w:styleId="Heading9">
@@ -1268,22 +1887,429 @@
     <w:semiHidden/>
     <w:unhideWhenUsed/>
     <w:qFormat/>
-    <w:rsid w:val="00E627D8"/>
+    <w:rsid w:val="00e627d8"/>
     <w:pPr>
-      <w:keepNext/>
+      <w:keepNext w:val="true"/>
       <w:keepLines/>
-      <w:spacing w:after="0"/>
+      <w:spacing w:before="0" w:after="0"/>
       <w:outlineLvl w:val="8"/>
     </w:pPr>
     <w:rPr>
-      <w:rFonts w:eastAsiaTheme="majorEastAsia" w:cstheme="majorBidi"/>
-      <w:color w:val="272727" w:themeColor="text1" w:themeTint="D8"/>
-    </w:rPr>
-  </w:style>
-  <w:style w:type="character" w:default="1" w:styleId="DefaultParagraphFont">
+      <w:rFonts w:eastAsia="" w:cs="" w:cstheme="majorBidi" w:eastAsiaTheme="majorEastAsia"/>
+      <w:color w:themeColor="text1" w:themeTint="d8" w:val="272727"/>
+    </w:rPr>
+  </w:style>
+  <w:style w:type="character" w:styleId="DefaultParagraphFont" w:default="1">
     <w:name w:val="Default Paragraph Font"/>
     <w:uiPriority w:val="1"/>
     <w:unhideWhenUsed/>
+    <w:qFormat/>
+    <w:rPr/>
+  </w:style>
+  <w:style w:type="character" w:styleId="Heading1Char" w:customStyle="1">
+    <w:name w:val="Heading 1 Char"/>
+    <w:basedOn w:val="DefaultParagraphFont"/>
+    <w:link w:val="Heading1"/>
+    <w:uiPriority w:val="9"/>
+    <w:qFormat/>
+    <w:rsid w:val="00e627d8"/>
+    <w:rPr>
+      <w:rFonts w:ascii="Aptos Display" w:hAnsi="Aptos Display" w:eastAsia="" w:cs="" w:asciiTheme="majorHAnsi" w:cstheme="majorBidi" w:eastAsiaTheme="majorEastAsia" w:hAnsiTheme="majorHAnsi"/>
+      <w:color w:themeColor="accent1" w:themeShade="bf" w:val="0F4761"/>
+      <w:sz w:val="40"/>
+      <w:szCs w:val="40"/>
+    </w:rPr>
+  </w:style>
+  <w:style w:type="character" w:styleId="Heading2Char" w:customStyle="1">
+    <w:name w:val="Heading 2 Char"/>
+    <w:basedOn w:val="DefaultParagraphFont"/>
+    <w:link w:val="Heading2"/>
+    <w:uiPriority w:val="9"/>
+    <w:semiHidden/>
+    <w:qFormat/>
+    <w:rsid w:val="00e627d8"/>
+    <w:rPr>
+      <w:rFonts w:ascii="Aptos Display" w:hAnsi="Aptos Display" w:eastAsia="" w:cs="" w:asciiTheme="majorHAnsi" w:cstheme="majorBidi" w:eastAsiaTheme="majorEastAsia" w:hAnsiTheme="majorHAnsi"/>
+      <w:color w:themeColor="accent1" w:themeShade="bf" w:val="0F4761"/>
+      <w:sz w:val="32"/>
+      <w:szCs w:val="32"/>
+    </w:rPr>
+  </w:style>
+  <w:style w:type="character" w:styleId="Heading3Char" w:customStyle="1">
+    <w:name w:val="Heading 3 Char"/>
+    <w:basedOn w:val="DefaultParagraphFont"/>
+    <w:link w:val="Heading3"/>
+    <w:uiPriority w:val="9"/>
+    <w:semiHidden/>
+    <w:qFormat/>
+    <w:rsid w:val="00e627d8"/>
+    <w:rPr>
+      <w:rFonts w:eastAsia="" w:cs="" w:cstheme="majorBidi" w:eastAsiaTheme="majorEastAsia"/>
+      <w:color w:themeColor="accent1" w:themeShade="bf" w:val="0F4761"/>
+      <w:sz w:val="28"/>
+      <w:szCs w:val="28"/>
+    </w:rPr>
+  </w:style>
+  <w:style w:type="character" w:styleId="Heading4Char" w:customStyle="1">
+    <w:name w:val="Heading 4 Char"/>
+    <w:basedOn w:val="DefaultParagraphFont"/>
+    <w:link w:val="Heading4"/>
+    <w:uiPriority w:val="9"/>
+    <w:semiHidden/>
+    <w:qFormat/>
+    <w:rsid w:val="00e627d8"/>
+    <w:rPr>
+      <w:rFonts w:eastAsia="" w:cs="" w:cstheme="majorBidi" w:eastAsiaTheme="majorEastAsia"/>
+      <w:i/>
+      <w:iCs/>
+      <w:color w:themeColor="accent1" w:themeShade="bf" w:val="0F4761"/>
+    </w:rPr>
+  </w:style>
+  <w:style w:type="character" w:styleId="Heading5Char" w:customStyle="1">
+    <w:name w:val="Heading 5 Char"/>
+    <w:basedOn w:val="DefaultParagraphFont"/>
+    <w:link w:val="Heading5"/>
+    <w:uiPriority w:val="9"/>
+    <w:semiHidden/>
+    <w:qFormat/>
+    <w:rsid w:val="00e627d8"/>
+    <w:rPr>
+      <w:rFonts w:eastAsia="" w:cs="" w:cstheme="majorBidi" w:eastAsiaTheme="majorEastAsia"/>
+      <w:color w:themeColor="accent1" w:themeShade="bf" w:val="0F4761"/>
+    </w:rPr>
+  </w:style>
+  <w:style w:type="character" w:styleId="Heading6Char" w:customStyle="1">
+    <w:name w:val="Heading 6 Char"/>
+    <w:basedOn w:val="DefaultParagraphFont"/>
+    <w:link w:val="Heading6"/>
+    <w:uiPriority w:val="9"/>
+    <w:semiHidden/>
+    <w:qFormat/>
+    <w:rsid w:val="00e627d8"/>
+    <w:rPr>
+      <w:rFonts w:eastAsia="" w:cs="" w:cstheme="majorBidi" w:eastAsiaTheme="majorEastAsia"/>
+      <w:i/>
+      <w:iCs/>
+      <w:color w:themeColor="text1" w:themeTint="a6" w:val="595959"/>
+    </w:rPr>
+  </w:style>
+  <w:style w:type="character" w:styleId="Heading7Char" w:customStyle="1">
+    <w:name w:val="Heading 7 Char"/>
+    <w:basedOn w:val="DefaultParagraphFont"/>
+    <w:link w:val="Heading7"/>
+    <w:uiPriority w:val="9"/>
+    <w:semiHidden/>
+    <w:qFormat/>
+    <w:rsid w:val="00e627d8"/>
+    <w:rPr>
+      <w:rFonts w:eastAsia="" w:cs="" w:cstheme="majorBidi" w:eastAsiaTheme="majorEastAsia"/>
+      <w:color w:themeColor="text1" w:themeTint="a6" w:val="595959"/>
+    </w:rPr>
+  </w:style>
+  <w:style w:type="character" w:styleId="Heading8Char" w:customStyle="1">
+    <w:name w:val="Heading 8 Char"/>
+    <w:basedOn w:val="DefaultParagraphFont"/>
+    <w:link w:val="Heading8"/>
+    <w:uiPriority w:val="9"/>
+    <w:semiHidden/>
+    <w:qFormat/>
+    <w:rsid w:val="00e627d8"/>
+    <w:rPr>
+      <w:rFonts w:eastAsia="" w:cs="" w:cstheme="majorBidi" w:eastAsiaTheme="majorEastAsia"/>
+      <w:i/>
+      <w:iCs/>
+      <w:color w:themeColor="text1" w:themeTint="d8" w:val="272727"/>
+    </w:rPr>
+  </w:style>
+  <w:style w:type="character" w:styleId="Heading9Char" w:customStyle="1">
+    <w:name w:val="Heading 9 Char"/>
+    <w:basedOn w:val="DefaultParagraphFont"/>
+    <w:link w:val="Heading9"/>
+    <w:uiPriority w:val="9"/>
+    <w:semiHidden/>
+    <w:qFormat/>
+    <w:rsid w:val="00e627d8"/>
+    <w:rPr>
+      <w:rFonts w:eastAsia="" w:cs="" w:cstheme="majorBidi" w:eastAsiaTheme="majorEastAsia"/>
+      <w:color w:themeColor="text1" w:themeTint="d8" w:val="272727"/>
+    </w:rPr>
+  </w:style>
+  <w:style w:type="character" w:styleId="TitleChar" w:customStyle="1">
+    <w:name w:val="Title Char"/>
+    <w:basedOn w:val="DefaultParagraphFont"/>
+    <w:link w:val="Title"/>
+    <w:uiPriority w:val="10"/>
+    <w:qFormat/>
+    <w:rsid w:val="00e627d8"/>
+    <w:rPr>
+      <w:rFonts w:ascii="Aptos Display" w:hAnsi="Aptos Display" w:eastAsia="" w:cs="" w:asciiTheme="majorHAnsi" w:cstheme="majorBidi" w:eastAsiaTheme="majorEastAsia" w:hAnsiTheme="majorHAnsi"/>
+      <w:spacing w:val="-10"/>
+      <w:kern w:val="2"/>
+      <w:sz w:val="56"/>
+      <w:szCs w:val="56"/>
+    </w:rPr>
+  </w:style>
+  <w:style w:type="character" w:styleId="SubtitleChar" w:customStyle="1">
+    <w:name w:val="Subtitle Char"/>
+    <w:basedOn w:val="DefaultParagraphFont"/>
+    <w:link w:val="Subtitle"/>
+    <w:uiPriority w:val="11"/>
+    <w:qFormat/>
+    <w:rsid w:val="00e627d8"/>
+    <w:rPr>
+      <w:rFonts w:eastAsia="" w:cs="" w:cstheme="majorBidi" w:eastAsiaTheme="majorEastAsia"/>
+      <w:color w:themeColor="text1" w:themeTint="a6" w:val="595959"/>
+      <w:spacing w:val="15"/>
+      <w:sz w:val="28"/>
+      <w:szCs w:val="28"/>
+    </w:rPr>
+  </w:style>
+  <w:style w:type="character" w:styleId="QuoteChar" w:customStyle="1">
+    <w:name w:val="Quote Char"/>
+    <w:basedOn w:val="DefaultParagraphFont"/>
+    <w:link w:val="Quote"/>
+    <w:uiPriority w:val="29"/>
+    <w:qFormat/>
+    <w:rsid w:val="00e627d8"/>
+    <w:rPr>
+      <w:i/>
+      <w:iCs/>
+      <w:color w:themeColor="text1" w:themeTint="bf" w:val="404040"/>
+    </w:rPr>
+  </w:style>
+  <w:style w:type="character" w:styleId="IntenseEmphasis">
+    <w:name w:val="Intense Emphasis"/>
+    <w:basedOn w:val="DefaultParagraphFont"/>
+    <w:uiPriority w:val="21"/>
+    <w:qFormat/>
+    <w:rsid w:val="00e627d8"/>
+    <w:rPr>
+      <w:i/>
+      <w:iCs/>
+      <w:color w:themeColor="accent1" w:themeShade="bf" w:val="0F4761"/>
+    </w:rPr>
+  </w:style>
+  <w:style w:type="character" w:styleId="IntenseQuoteChar" w:customStyle="1">
+    <w:name w:val="Intense Quote Char"/>
+    <w:basedOn w:val="DefaultParagraphFont"/>
+    <w:link w:val="IntenseQuote"/>
+    <w:uiPriority w:val="30"/>
+    <w:qFormat/>
+    <w:rsid w:val="00e627d8"/>
+    <w:rPr>
+      <w:i/>
+      <w:iCs/>
+      <w:color w:themeColor="accent1" w:themeShade="bf" w:val="0F4761"/>
+    </w:rPr>
+  </w:style>
+  <w:style w:type="character" w:styleId="IntenseReference">
+    <w:name w:val="Intense Reference"/>
+    <w:basedOn w:val="DefaultParagraphFont"/>
+    <w:uiPriority w:val="32"/>
+    <w:qFormat/>
+    <w:rsid w:val="00e627d8"/>
+    <w:rPr>
+      <w:b/>
+      <w:bCs/>
+      <w:smallCaps/>
+      <w:color w:themeColor="accent1" w:themeShade="bf" w:val="0F4761"/>
+      <w:spacing w:val="5"/>
+    </w:rPr>
+  </w:style>
+  <w:style w:type="character" w:styleId="Hyperlink">
+    <w:name w:val="Hyperlink"/>
+    <w:basedOn w:val="DefaultParagraphFont"/>
+    <w:uiPriority w:val="99"/>
+    <w:unhideWhenUsed/>
+    <w:rsid w:val="00e627d8"/>
+    <w:rPr>
+      <w:color w:themeColor="hyperlink" w:val="467886"/>
+      <w:u w:val="single"/>
+    </w:rPr>
+  </w:style>
+  <w:style w:type="character" w:styleId="UnresolvedMention">
+    <w:name w:val="Unresolved Mention"/>
+    <w:basedOn w:val="DefaultParagraphFont"/>
+    <w:uiPriority w:val="99"/>
+    <w:semiHidden/>
+    <w:unhideWhenUsed/>
+    <w:qFormat/>
+    <w:rsid w:val="00e627d8"/>
+    <w:rPr>
+      <w:color w:val="605E5C"/>
+      <w:shd w:fill="E1DFDD" w:val="clear"/>
+    </w:rPr>
+  </w:style>
+  <w:style w:type="character" w:styleId="Strong">
+    <w:name w:val="Strong"/>
+    <w:qFormat/>
+    <w:rPr>
+      <w:b/>
+      <w:bCs/>
+    </w:rPr>
+  </w:style>
+  <w:style w:type="character" w:styleId="SourceText">
+    <w:name w:val="Source Text"/>
+    <w:qFormat/>
+    <w:rPr>
+      <w:rFonts w:ascii="Liberation Mono" w:hAnsi="Liberation Mono" w:eastAsia="Liberation Mono" w:cs="Liberation Mono"/>
+    </w:rPr>
+  </w:style>
+  <w:style w:type="paragraph" w:styleId="Heading">
+    <w:name w:val="Heading"/>
+    <w:basedOn w:val="Normal"/>
+    <w:next w:val="BodyText"/>
+    <w:qFormat/>
+    <w:pPr>
+      <w:keepNext w:val="true"/>
+      <w:spacing w:before="240" w:after="120"/>
+    </w:pPr>
+    <w:rPr>
+      <w:rFonts w:ascii="Liberation Sans" w:hAnsi="Liberation Sans" w:eastAsia="Microsoft YaHei" w:cs="Arial"/>
+      <w:sz w:val="28"/>
+      <w:szCs w:val="28"/>
+    </w:rPr>
+  </w:style>
+  <w:style w:type="paragraph" w:styleId="BodyText">
+    <w:name w:val="Body Text"/>
+    <w:basedOn w:val="Normal"/>
+    <w:pPr>
+      <w:spacing w:lineRule="auto" w:line="276" w:before="0" w:after="140"/>
+    </w:pPr>
+    <w:rPr/>
+  </w:style>
+  <w:style w:type="paragraph" w:styleId="List">
+    <w:name w:val="List"/>
+    <w:basedOn w:val="BodyText"/>
+    <w:pPr/>
+    <w:rPr>
+      <w:rFonts w:cs="Arial"/>
+    </w:rPr>
+  </w:style>
+  <w:style w:type="paragraph" w:styleId="Caption">
+    <w:name w:val="caption"/>
+    <w:basedOn w:val="Normal"/>
+    <w:qFormat/>
+    <w:pPr>
+      <w:suppressLineNumbers/>
+      <w:spacing w:before="120" w:after="120"/>
+    </w:pPr>
+    <w:rPr>
+      <w:rFonts w:cs="Arial"/>
+      <w:i/>
+      <w:iCs/>
+      <w:sz w:val="24"/>
+      <w:szCs w:val="24"/>
+    </w:rPr>
+  </w:style>
+  <w:style w:type="paragraph" w:styleId="Index">
+    <w:name w:val="Index"/>
+    <w:basedOn w:val="Normal"/>
+    <w:qFormat/>
+    <w:pPr>
+      <w:suppressLineNumbers/>
+    </w:pPr>
+    <w:rPr>
+      <w:rFonts w:cs="Arial"/>
+    </w:rPr>
+  </w:style>
+  <w:style w:type="paragraph" w:styleId="Title">
+    <w:name w:val="Title"/>
+    <w:basedOn w:val="Normal"/>
+    <w:next w:val="Normal"/>
+    <w:link w:val="TitleChar"/>
+    <w:uiPriority w:val="10"/>
+    <w:qFormat/>
+    <w:rsid w:val="00e627d8"/>
+    <w:pPr>
+      <w:spacing w:lineRule="auto" w:line="240" w:before="0" w:after="80"/>
+      <w:contextualSpacing/>
+    </w:pPr>
+    <w:rPr>
+      <w:rFonts w:ascii="Aptos Display" w:hAnsi="Aptos Display" w:eastAsia="" w:cs="" w:asciiTheme="majorHAnsi" w:cstheme="majorBidi" w:eastAsiaTheme="majorEastAsia" w:hAnsiTheme="majorHAnsi"/>
+      <w:spacing w:val="-10"/>
+      <w:kern w:val="2"/>
+      <w:sz w:val="56"/>
+      <w:szCs w:val="56"/>
+    </w:rPr>
+  </w:style>
+  <w:style w:type="paragraph" w:styleId="Subtitle">
+    <w:name w:val="Subtitle"/>
+    <w:basedOn w:val="Normal"/>
+    <w:next w:val="Normal"/>
+    <w:link w:val="SubtitleChar"/>
+    <w:uiPriority w:val="11"/>
+    <w:qFormat/>
+    <w:rsid w:val="00e627d8"/>
+    <w:pPr/>
+    <w:rPr>
+      <w:rFonts w:eastAsia="" w:cs="" w:cstheme="majorBidi" w:eastAsiaTheme="majorEastAsia"/>
+      <w:color w:themeColor="text1" w:themeTint="a6" w:val="595959"/>
+      <w:spacing w:val="15"/>
+      <w:sz w:val="28"/>
+      <w:szCs w:val="28"/>
+    </w:rPr>
+  </w:style>
+  <w:style w:type="paragraph" w:styleId="Quote">
+    <w:name w:val="Quote"/>
+    <w:basedOn w:val="Normal"/>
+    <w:next w:val="Normal"/>
+    <w:link w:val="QuoteChar"/>
+    <w:uiPriority w:val="29"/>
+    <w:qFormat/>
+    <w:rsid w:val="00e627d8"/>
+    <w:pPr>
+      <w:spacing w:before="160" w:after="160"/>
+      <w:jc w:val="center"/>
+    </w:pPr>
+    <w:rPr>
+      <w:i/>
+      <w:iCs/>
+      <w:color w:themeColor="text1" w:themeTint="bf" w:val="404040"/>
+    </w:rPr>
+  </w:style>
+  <w:style w:type="paragraph" w:styleId="ListParagraph">
+    <w:name w:val="List Paragraph"/>
+    <w:basedOn w:val="Normal"/>
+    <w:uiPriority w:val="34"/>
+    <w:qFormat/>
+    <w:rsid w:val="00e627d8"/>
+    <w:pPr>
+      <w:spacing w:before="0" w:after="160"/>
+      <w:ind w:start="720"/>
+      <w:contextualSpacing/>
+    </w:pPr>
+    <w:rPr/>
+  </w:style>
+  <w:style w:type="paragraph" w:styleId="IntenseQuote">
+    <w:name w:val="Intense Quote"/>
+    <w:basedOn w:val="Normal"/>
+    <w:next w:val="Normal"/>
+    <w:link w:val="IntenseQuoteChar"/>
+    <w:uiPriority w:val="30"/>
+    <w:qFormat/>
+    <w:rsid w:val="00e627d8"/>
+    <w:pPr>
+      <w:pBdr>
+        <w:top w:val="single" w:sz="4" w:space="10" w:color="0F4761" w:themeColor="accent1" w:themeShade="bf"/>
+        <w:bottom w:val="single" w:sz="4" w:space="10" w:color="0F4761" w:themeColor="accent1" w:themeShade="bf"/>
+      </w:pBdr>
+      <w:spacing w:before="360" w:after="360"/>
+      <w:ind w:start="864" w:end="864"/>
+      <w:jc w:val="center"/>
+    </w:pPr>
+    <w:rPr>
+      <w:i/>
+      <w:iCs/>
+      <w:color w:themeColor="accent1" w:themeShade="bf" w:val="0F4761"/>
+    </w:rPr>
+  </w:style>
+  <w:style w:type="numbering" w:styleId="NoList" w:default="1">
+    <w:name w:val="No List"/>
+    <w:uiPriority w:val="99"/>
+    <w:semiHidden/>
+    <w:unhideWhenUsed/>
+    <w:qFormat/>
   </w:style>
   <w:style w:type="table" w:default="1" w:styleId="TableNormal">
     <w:name w:val="Normal Table"/>
@@ -1291,7 +2317,6 @@
     <w:semiHidden/>
     <w:unhideWhenUsed/>
     <w:tblPr>
-      <w:tblInd w:w="0" w:type="dxa"/>
       <w:tblCellMar>
         <w:top w:w="0" w:type="dxa"/>
         <w:left w:w="108" w:type="dxa"/>
@@ -1300,518 +2325,101 @@
       </w:tblCellMar>
     </w:tblPr>
   </w:style>
-  <w:style w:type="numbering" w:default="1" w:styleId="NoList">
-    <w:name w:val="No List"/>
-    <w:uiPriority w:val="99"/>
-    <w:semiHidden/>
-    <w:unhideWhenUsed/>
-  </w:style>
-  <w:style w:type="character" w:customStyle="1" w:styleId="Heading1Char">
-    <w:name w:val="Heading 1 Char"/>
-    <w:basedOn w:val="DefaultParagraphFont"/>
-    <w:link w:val="Heading1"/>
-    <w:uiPriority w:val="9"/>
-    <w:rsid w:val="00E627D8"/>
-    <w:rPr>
-      <w:rFonts w:asciiTheme="majorHAnsi" w:eastAsiaTheme="majorEastAsia" w:hAnsiTheme="majorHAnsi" w:cstheme="majorBidi"/>
-      <w:color w:val="0F4761" w:themeColor="accent1" w:themeShade="BF"/>
-      <w:sz w:val="40"/>
-      <w:szCs w:val="40"/>
-    </w:rPr>
-  </w:style>
-  <w:style w:type="character" w:customStyle="1" w:styleId="Heading2Char">
-    <w:name w:val="Heading 2 Char"/>
-    <w:basedOn w:val="DefaultParagraphFont"/>
-    <w:link w:val="Heading2"/>
-    <w:uiPriority w:val="9"/>
-    <w:semiHidden/>
-    <w:rsid w:val="00E627D8"/>
-    <w:rPr>
-      <w:rFonts w:asciiTheme="majorHAnsi" w:eastAsiaTheme="majorEastAsia" w:hAnsiTheme="majorHAnsi" w:cstheme="majorBidi"/>
-      <w:color w:val="0F4761" w:themeColor="accent1" w:themeShade="BF"/>
-      <w:sz w:val="32"/>
-      <w:szCs w:val="32"/>
-    </w:rPr>
-  </w:style>
-  <w:style w:type="character" w:customStyle="1" w:styleId="Heading3Char">
-    <w:name w:val="Heading 3 Char"/>
-    <w:basedOn w:val="DefaultParagraphFont"/>
-    <w:link w:val="Heading3"/>
-    <w:uiPriority w:val="9"/>
-    <w:semiHidden/>
-    <w:rsid w:val="00E627D8"/>
-    <w:rPr>
-      <w:rFonts w:eastAsiaTheme="majorEastAsia" w:cstheme="majorBidi"/>
-      <w:color w:val="0F4761" w:themeColor="accent1" w:themeShade="BF"/>
-      <w:sz w:val="28"/>
-      <w:szCs w:val="28"/>
-    </w:rPr>
-  </w:style>
-  <w:style w:type="character" w:customStyle="1" w:styleId="Heading4Char">
-    <w:name w:val="Heading 4 Char"/>
-    <w:basedOn w:val="DefaultParagraphFont"/>
-    <w:link w:val="Heading4"/>
-    <w:uiPriority w:val="9"/>
-    <w:semiHidden/>
-    <w:rsid w:val="00E627D8"/>
-    <w:rPr>
-      <w:rFonts w:eastAsiaTheme="majorEastAsia" w:cstheme="majorBidi"/>
-      <w:i/>
-      <w:iCs/>
-      <w:color w:val="0F4761" w:themeColor="accent1" w:themeShade="BF"/>
-    </w:rPr>
-  </w:style>
-  <w:style w:type="character" w:customStyle="1" w:styleId="Heading5Char">
-    <w:name w:val="Heading 5 Char"/>
-    <w:basedOn w:val="DefaultParagraphFont"/>
-    <w:link w:val="Heading5"/>
-    <w:uiPriority w:val="9"/>
-    <w:semiHidden/>
-    <w:rsid w:val="00E627D8"/>
-    <w:rPr>
-      <w:rFonts w:eastAsiaTheme="majorEastAsia" w:cstheme="majorBidi"/>
-      <w:color w:val="0F4761" w:themeColor="accent1" w:themeShade="BF"/>
-    </w:rPr>
-  </w:style>
-  <w:style w:type="character" w:customStyle="1" w:styleId="Heading6Char">
-    <w:name w:val="Heading 6 Char"/>
-    <w:basedOn w:val="DefaultParagraphFont"/>
-    <w:link w:val="Heading6"/>
-    <w:uiPriority w:val="9"/>
-    <w:semiHidden/>
-    <w:rsid w:val="00E627D8"/>
-    <w:rPr>
-      <w:rFonts w:eastAsiaTheme="majorEastAsia" w:cstheme="majorBidi"/>
-      <w:i/>
-      <w:iCs/>
-      <w:color w:val="595959" w:themeColor="text1" w:themeTint="A6"/>
-    </w:rPr>
-  </w:style>
-  <w:style w:type="character" w:customStyle="1" w:styleId="Heading7Char">
-    <w:name w:val="Heading 7 Char"/>
-    <w:basedOn w:val="DefaultParagraphFont"/>
-    <w:link w:val="Heading7"/>
-    <w:uiPriority w:val="9"/>
-    <w:semiHidden/>
-    <w:rsid w:val="00E627D8"/>
-    <w:rPr>
-      <w:rFonts w:eastAsiaTheme="majorEastAsia" w:cstheme="majorBidi"/>
-      <w:color w:val="595959" w:themeColor="text1" w:themeTint="A6"/>
-    </w:rPr>
-  </w:style>
-  <w:style w:type="character" w:customStyle="1" w:styleId="Heading8Char">
-    <w:name w:val="Heading 8 Char"/>
-    <w:basedOn w:val="DefaultParagraphFont"/>
-    <w:link w:val="Heading8"/>
-    <w:uiPriority w:val="9"/>
-    <w:semiHidden/>
-    <w:rsid w:val="00E627D8"/>
-    <w:rPr>
-      <w:rFonts w:eastAsiaTheme="majorEastAsia" w:cstheme="majorBidi"/>
-      <w:i/>
-      <w:iCs/>
-      <w:color w:val="272727" w:themeColor="text1" w:themeTint="D8"/>
-    </w:rPr>
-  </w:style>
-  <w:style w:type="character" w:customStyle="1" w:styleId="Heading9Char">
-    <w:name w:val="Heading 9 Char"/>
-    <w:basedOn w:val="DefaultParagraphFont"/>
-    <w:link w:val="Heading9"/>
-    <w:uiPriority w:val="9"/>
-    <w:semiHidden/>
-    <w:rsid w:val="00E627D8"/>
-    <w:rPr>
-      <w:rFonts w:eastAsiaTheme="majorEastAsia" w:cstheme="majorBidi"/>
-      <w:color w:val="272727" w:themeColor="text1" w:themeTint="D8"/>
-    </w:rPr>
-  </w:style>
-  <w:style w:type="paragraph" w:styleId="Title">
-    <w:name w:val="Title"/>
-    <w:basedOn w:val="Normal"/>
-    <w:next w:val="Normal"/>
-    <w:link w:val="TitleChar"/>
-    <w:uiPriority w:val="10"/>
-    <w:qFormat/>
-    <w:rsid w:val="00E627D8"/>
-    <w:pPr>
-      <w:spacing w:after="80" w:line="240" w:lineRule="auto"/>
-      <w:contextualSpacing/>
-    </w:pPr>
-    <w:rPr>
-      <w:rFonts w:asciiTheme="majorHAnsi" w:eastAsiaTheme="majorEastAsia" w:hAnsiTheme="majorHAnsi" w:cstheme="majorBidi"/>
-      <w:spacing w:val="-10"/>
-      <w:kern w:val="28"/>
-      <w:sz w:val="56"/>
-      <w:szCs w:val="56"/>
-    </w:rPr>
-  </w:style>
-  <w:style w:type="character" w:customStyle="1" w:styleId="TitleChar">
-    <w:name w:val="Title Char"/>
-    <w:basedOn w:val="DefaultParagraphFont"/>
-    <w:link w:val="Title"/>
-    <w:uiPriority w:val="10"/>
-    <w:rsid w:val="00E627D8"/>
-    <w:rPr>
-      <w:rFonts w:asciiTheme="majorHAnsi" w:eastAsiaTheme="majorEastAsia" w:hAnsiTheme="majorHAnsi" w:cstheme="majorBidi"/>
-      <w:spacing w:val="-10"/>
-      <w:kern w:val="28"/>
-      <w:sz w:val="56"/>
-      <w:szCs w:val="56"/>
-    </w:rPr>
-  </w:style>
-  <w:style w:type="paragraph" w:styleId="Subtitle">
-    <w:name w:val="Subtitle"/>
-    <w:basedOn w:val="Normal"/>
-    <w:next w:val="Normal"/>
-    <w:link w:val="SubtitleChar"/>
-    <w:uiPriority w:val="11"/>
-    <w:qFormat/>
-    <w:rsid w:val="00E627D8"/>
-    <w:pPr>
-      <w:numPr>
-        <w:ilvl w:val="1"/>
-      </w:numPr>
-    </w:pPr>
-    <w:rPr>
-      <w:rFonts w:eastAsiaTheme="majorEastAsia" w:cstheme="majorBidi"/>
-      <w:color w:val="595959" w:themeColor="text1" w:themeTint="A6"/>
-      <w:spacing w:val="15"/>
-      <w:sz w:val="28"/>
-      <w:szCs w:val="28"/>
-    </w:rPr>
-  </w:style>
-  <w:style w:type="character" w:customStyle="1" w:styleId="SubtitleChar">
-    <w:name w:val="Subtitle Char"/>
-    <w:basedOn w:val="DefaultParagraphFont"/>
-    <w:link w:val="Subtitle"/>
-    <w:uiPriority w:val="11"/>
-    <w:rsid w:val="00E627D8"/>
-    <w:rPr>
-      <w:rFonts w:eastAsiaTheme="majorEastAsia" w:cstheme="majorBidi"/>
-      <w:color w:val="595959" w:themeColor="text1" w:themeTint="A6"/>
-      <w:spacing w:val="15"/>
-      <w:sz w:val="28"/>
-      <w:szCs w:val="28"/>
-    </w:rPr>
-  </w:style>
-  <w:style w:type="paragraph" w:styleId="Quote">
-    <w:name w:val="Quote"/>
-    <w:basedOn w:val="Normal"/>
-    <w:next w:val="Normal"/>
-    <w:link w:val="QuoteChar"/>
-    <w:uiPriority w:val="29"/>
-    <w:qFormat/>
-    <w:rsid w:val="00E627D8"/>
-    <w:pPr>
-      <w:spacing w:before="160"/>
-      <w:jc w:val="center"/>
-    </w:pPr>
-    <w:rPr>
-      <w:i/>
-      <w:iCs/>
-      <w:color w:val="404040" w:themeColor="text1" w:themeTint="BF"/>
-    </w:rPr>
-  </w:style>
-  <w:style w:type="character" w:customStyle="1" w:styleId="QuoteChar">
-    <w:name w:val="Quote Char"/>
-    <w:basedOn w:val="DefaultParagraphFont"/>
-    <w:link w:val="Quote"/>
-    <w:uiPriority w:val="29"/>
-    <w:rsid w:val="00E627D8"/>
-    <w:rPr>
-      <w:i/>
-      <w:iCs/>
-      <w:color w:val="404040" w:themeColor="text1" w:themeTint="BF"/>
-    </w:rPr>
-  </w:style>
-  <w:style w:type="paragraph" w:styleId="ListParagraph">
-    <w:name w:val="List Paragraph"/>
-    <w:basedOn w:val="Normal"/>
-    <w:uiPriority w:val="34"/>
-    <w:qFormat/>
-    <w:rsid w:val="00E627D8"/>
-    <w:pPr>
-      <w:ind w:left="720"/>
-      <w:contextualSpacing/>
-    </w:pPr>
-  </w:style>
-  <w:style w:type="character" w:styleId="IntenseEmphasis">
-    <w:name w:val="Intense Emphasis"/>
-    <w:basedOn w:val="DefaultParagraphFont"/>
-    <w:uiPriority w:val="21"/>
-    <w:qFormat/>
-    <w:rsid w:val="00E627D8"/>
-    <w:rPr>
-      <w:i/>
-      <w:iCs/>
-      <w:color w:val="0F4761" w:themeColor="accent1" w:themeShade="BF"/>
-    </w:rPr>
-  </w:style>
-  <w:style w:type="paragraph" w:styleId="IntenseQuote">
-    <w:name w:val="Intense Quote"/>
-    <w:basedOn w:val="Normal"/>
-    <w:next w:val="Normal"/>
-    <w:link w:val="IntenseQuoteChar"/>
-    <w:uiPriority w:val="30"/>
-    <w:qFormat/>
-    <w:rsid w:val="00E627D8"/>
-    <w:pPr>
-      <w:pBdr>
-        <w:top w:val="single" w:sz="4" w:space="10" w:color="0F4761" w:themeColor="accent1" w:themeShade="BF"/>
-        <w:bottom w:val="single" w:sz="4" w:space="10" w:color="0F4761" w:themeColor="accent1" w:themeShade="BF"/>
-      </w:pBdr>
-      <w:spacing w:before="360" w:after="360"/>
-      <w:ind w:left="864" w:right="864"/>
-      <w:jc w:val="center"/>
-    </w:pPr>
-    <w:rPr>
-      <w:i/>
-      <w:iCs/>
-      <w:color w:val="0F4761" w:themeColor="accent1" w:themeShade="BF"/>
-    </w:rPr>
-  </w:style>
-  <w:style w:type="character" w:customStyle="1" w:styleId="IntenseQuoteChar">
-    <w:name w:val="Intense Quote Char"/>
-    <w:basedOn w:val="DefaultParagraphFont"/>
-    <w:link w:val="IntenseQuote"/>
-    <w:uiPriority w:val="30"/>
-    <w:rsid w:val="00E627D8"/>
-    <w:rPr>
-      <w:i/>
-      <w:iCs/>
-      <w:color w:val="0F4761" w:themeColor="accent1" w:themeShade="BF"/>
-    </w:rPr>
-  </w:style>
-  <w:style w:type="character" w:styleId="IntenseReference">
-    <w:name w:val="Intense Reference"/>
-    <w:basedOn w:val="DefaultParagraphFont"/>
-    <w:uiPriority w:val="32"/>
-    <w:qFormat/>
-    <w:rsid w:val="00E627D8"/>
-    <w:rPr>
-      <w:b/>
-      <w:bCs/>
-      <w:smallCaps/>
-      <w:color w:val="0F4761" w:themeColor="accent1" w:themeShade="BF"/>
-      <w:spacing w:val="5"/>
-    </w:rPr>
-  </w:style>
-  <w:style w:type="character" w:styleId="Hyperlink">
-    <w:name w:val="Hyperlink"/>
-    <w:basedOn w:val="DefaultParagraphFont"/>
-    <w:uiPriority w:val="99"/>
-    <w:unhideWhenUsed/>
-    <w:rsid w:val="00E627D8"/>
-    <w:rPr>
-      <w:color w:val="467886" w:themeColor="hyperlink"/>
-      <w:u w:val="single"/>
-    </w:rPr>
-  </w:style>
-  <w:style w:type="character" w:styleId="UnresolvedMention">
-    <w:name w:val="Unresolved Mention"/>
-    <w:basedOn w:val="DefaultParagraphFont"/>
-    <w:uiPriority w:val="99"/>
-    <w:semiHidden/>
-    <w:unhideWhenUsed/>
-    <w:rsid w:val="00E627D8"/>
-    <w:rPr>
-      <w:color w:val="605E5C"/>
-      <w:shd w:val="clear" w:color="auto" w:fill="E1DFDD"/>
-    </w:rPr>
-  </w:style>
 </w:styles>
 </file>
 
 <file path=word/theme/theme1.xml><?xml version="1.0" encoding="utf-8"?>
-<a:theme xmlns:a="http://schemas.openxmlformats.org/drawingml/2006/main" name="Office Theme">
+<a:theme xmlns:a="http://schemas.openxmlformats.org/drawingml/2006/main" xmlns:r="http://schemas.openxmlformats.org/officeDocument/2006/relationships" name="Office Theme">
   <a:themeElements>
     <a:clrScheme name="Office">
       <a:dk1>
-        <a:sysClr val="windowText" lastClr="000000"/>
+        <a:srgbClr val="000000"/>
       </a:dk1>
       <a:lt1>
-        <a:sysClr val="window" lastClr="FFFFFF"/>
+        <a:srgbClr val="ffffff"/>
       </a:lt1>
       <a:dk2>
-        <a:srgbClr val="0E2841"/>
+        <a:srgbClr val="0e2841"/>
       </a:dk2>
       <a:lt2>
-        <a:srgbClr val="E8E8E8"/>
+        <a:srgbClr val="e8e8e8"/>
       </a:lt2>
       <a:accent1>
         <a:srgbClr val="156082"/>
       </a:accent1>
       <a:accent2>
-        <a:srgbClr val="E97132"/>
+        <a:srgbClr val="e97132"/>
       </a:accent2>
       <a:accent3>
-        <a:srgbClr val="196B24"/>
+        <a:srgbClr val="196b24"/>
       </a:accent3>
       <a:accent4>
-        <a:srgbClr val="0F9ED5"/>
+        <a:srgbClr val="0f9ed5"/>
       </a:accent4>
       <a:accent5>
-        <a:srgbClr val="A02B93"/>
+        <a:srgbClr val="a02b93"/>
       </a:accent5>
       <a:accent6>
-        <a:srgbClr val="4EA72E"/>
+        <a:srgbClr val="4ea72e"/>
       </a:accent6>
       <a:hlink>
         <a:srgbClr val="467886"/>
       </a:hlink>
       <a:folHlink>
-        <a:srgbClr val="96607D"/>
+        <a:srgbClr val="96607d"/>
       </a:folHlink>
     </a:clrScheme>
     <a:fontScheme name="Office">
       <a:majorFont>
-        <a:latin typeface="Aptos Display" panose="02110004020202020204"/>
+        <a:latin typeface="Aptos Display" panose="02110004020202020204" pitchFamily="0" charset="1"/>
         <a:ea typeface=""/>
         <a:cs typeface=""/>
-        <a:font script="Jpan" typeface="游ゴシック Light"/>
-        <a:font script="Hang" typeface="맑은 고딕"/>
-        <a:font script="Hans" typeface="等线 Light"/>
-        <a:font script="Hant" typeface="新細明體"/>
-        <a:font script="Arab" typeface="Times New Roman"/>
-        <a:font script="Hebr" typeface="Times New Roman"/>
-        <a:font script="Thai" typeface="Angsana New"/>
-        <a:font script="Ethi" typeface="Nyala"/>
-        <a:font script="Beng" typeface="Vrinda"/>
-        <a:font script="Gujr" typeface="Shruti"/>
-        <a:font script="Khmr" typeface="MoolBoran"/>
-        <a:font script="Knda" typeface="Tunga"/>
-        <a:font script="Guru" typeface="Raavi"/>
-        <a:font script="Cans" typeface="Euphemia"/>
-        <a:font script="Cher" typeface="Plantagenet Cherokee"/>
-        <a:font script="Yiii" typeface="Microsoft Yi Baiti"/>
-        <a:font script="Tibt" typeface="Microsoft Himalaya"/>
-        <a:font script="Thaa" typeface="MV Boli"/>
-        <a:font script="Deva" typeface="Mangal"/>
-        <a:font script="Telu" typeface="Gautami"/>
-        <a:font script="Taml" typeface="Latha"/>
-        <a:font script="Syrc" typeface="Estrangelo Edessa"/>
-        <a:font script="Orya" typeface="Kalinga"/>
-        <a:font script="Mlym" typeface="Kartika"/>
-        <a:font script="Laoo" typeface="DokChampa"/>
-        <a:font script="Sinh" typeface="Iskoola Pota"/>
-        <a:font script="Mong" typeface="Mongolian Baiti"/>
-        <a:font script="Viet" typeface="Times New Roman"/>
-        <a:font script="Uigh" typeface="Microsoft Uighur"/>
-        <a:font script="Geor" typeface="Sylfaen"/>
-        <a:font script="Armn" typeface="Arial"/>
-        <a:font script="Bugi" typeface="Leelawadee UI"/>
-        <a:font script="Bopo" typeface="Microsoft JhengHei"/>
-        <a:font script="Java" typeface="Javanese Text"/>
-        <a:font script="Lisu" typeface="Segoe UI"/>
-        <a:font script="Mymr" typeface="Myanmar Text"/>
-        <a:font script="Nkoo" typeface="Ebrima"/>
-        <a:font script="Olck" typeface="Nirmala UI"/>
-        <a:font script="Osma" typeface="Ebrima"/>
-        <a:font script="Phag" typeface="Phagspa"/>
-        <a:font script="Syrn" typeface="Estrangelo Edessa"/>
-        <a:font script="Syrj" typeface="Estrangelo Edessa"/>
-        <a:font script="Syre" typeface="Estrangelo Edessa"/>
-        <a:font script="Sora" typeface="Nirmala UI"/>
-        <a:font script="Tale" typeface="Microsoft Tai Le"/>
-        <a:font script="Talu" typeface="Microsoft New Tai Lue"/>
-        <a:font script="Tfng" typeface="Ebrima"/>
       </a:majorFont>
       <a:minorFont>
-        <a:latin typeface="Aptos" panose="02110004020202020204"/>
+        <a:latin typeface="Aptos" panose="02110004020202020204" pitchFamily="0" charset="1"/>
         <a:ea typeface=""/>
         <a:cs typeface=""/>
-        <a:font script="Jpan" typeface="游明朝"/>
-        <a:font script="Hang" typeface="맑은 고딕"/>
-        <a:font script="Hans" typeface="等线"/>
-        <a:font script="Hant" typeface="新細明體"/>
-        <a:font script="Arab" typeface="Arial"/>
-        <a:font script="Hebr" typeface="Arial"/>
-        <a:font script="Thai" typeface="Cordia New"/>
-        <a:font script="Ethi" typeface="Nyala"/>
-        <a:font script="Beng" typeface="Vrinda"/>
-        <a:font script="Gujr" typeface="Shruti"/>
-        <a:font script="Khmr" typeface="DaunPenh"/>
-        <a:font script="Knda" typeface="Tunga"/>
-        <a:font script="Guru" typeface="Raavi"/>
-        <a:font script="Cans" typeface="Euphemia"/>
-        <a:font script="Cher" typeface="Plantagenet Cherokee"/>
-        <a:font script="Yiii" typeface="Microsoft Yi Baiti"/>
-        <a:font script="Tibt" typeface="Microsoft Himalaya"/>
-        <a:font script="Thaa" typeface="MV Boli"/>
-        <a:font script="Deva" typeface="Mangal"/>
-        <a:font script="Telu" typeface="Gautami"/>
-        <a:font script="Taml" typeface="Latha"/>
-        <a:font script="Syrc" typeface="Estrangelo Edessa"/>
-        <a:font script="Orya" typeface="Kalinga"/>
-        <a:font script="Mlym" typeface="Kartika"/>
-        <a:font script="Laoo" typeface="DokChampa"/>
-        <a:font script="Sinh" typeface="Iskoola Pota"/>
-        <a:font script="Mong" typeface="Mongolian Baiti"/>
-        <a:font script="Viet" typeface="Arial"/>
-        <a:font script="Uigh" typeface="Microsoft Uighur"/>
-        <a:font script="Geor" typeface="Sylfaen"/>
-        <a:font script="Armn" typeface="Arial"/>
-        <a:font script="Bugi" typeface="Leelawadee UI"/>
-        <a:font script="Bopo" typeface="Microsoft JhengHei"/>
-        <a:font script="Java" typeface="Javanese Text"/>
-        <a:font script="Lisu" typeface="Segoe UI"/>
-        <a:font script="Mymr" typeface="Myanmar Text"/>
-        <a:font script="Nkoo" typeface="Ebrima"/>
-        <a:font script="Olck" typeface="Nirmala UI"/>
-        <a:font script="Osma" typeface="Ebrima"/>
-        <a:font script="Phag" typeface="Phagspa"/>
-        <a:font script="Syrn" typeface="Estrangelo Edessa"/>
-        <a:font script="Syrj" typeface="Estrangelo Edessa"/>
-        <a:font script="Syre" typeface="Estrangelo Edessa"/>
-        <a:font script="Sora" typeface="Nirmala UI"/>
-        <a:font script="Tale" typeface="Microsoft Tai Le"/>
-        <a:font script="Talu" typeface="Microsoft New Tai Lue"/>
-        <a:font script="Tfng" typeface="Ebrima"/>
       </a:minorFont>
     </a:fontScheme>
-    <a:fmtScheme name="Office">
+    <a:fmtScheme>
       <a:fillStyleLst>
         <a:solidFill>
           <a:schemeClr val="phClr"/>
         </a:solidFill>
-        <a:gradFill rotWithShape="1">
+        <a:gradFill>
           <a:gsLst>
             <a:gs pos="0">
               <a:schemeClr val="phClr">
                 <a:lumMod val="110000"/>
-                <a:satMod val="105000"/>
                 <a:tint val="67000"/>
               </a:schemeClr>
             </a:gs>
             <a:gs pos="50000">
               <a:schemeClr val="phClr">
                 <a:lumMod val="105000"/>
-                <a:satMod val="103000"/>
                 <a:tint val="73000"/>
               </a:schemeClr>
             </a:gs>
             <a:gs pos="100000">
               <a:schemeClr val="phClr">
                 <a:lumMod val="105000"/>
-                <a:satMod val="109000"/>
                 <a:tint val="81000"/>
               </a:schemeClr>
             </a:gs>
           </a:gsLst>
           <a:lin ang="5400000" scaled="0"/>
+          <a:tileRect l="0" t="0" r="0" b="0"/>
         </a:gradFill>
-        <a:gradFill rotWithShape="1">
+        <a:gradFill>
           <a:gsLst>
             <a:gs pos="0">
               <a:schemeClr val="phClr">
-                <a:satMod val="103000"/>
                 <a:lumMod val="102000"/>
                 <a:tint val="94000"/>
               </a:schemeClr>
             </a:gs>
             <a:gs pos="50000">
               <a:schemeClr val="phClr">
-                <a:satMod val="110000"/>
                 <a:lumMod val="100000"/>
                 <a:shade val="100000"/>
               </a:schemeClr>
@@ -1819,33 +2427,24 @@
             <a:gs pos="100000">
               <a:schemeClr val="phClr">
                 <a:lumMod val="99000"/>
-                <a:satMod val="120000"/>
                 <a:shade val="78000"/>
               </a:schemeClr>
             </a:gs>
           </a:gsLst>
           <a:lin ang="5400000" scaled="0"/>
+          <a:tileRect l="0" t="0" r="0" b="0"/>
         </a:gradFill>
       </a:fillStyleLst>
       <a:lnStyleLst>
         <a:ln w="12700" cap="flat" cmpd="sng" algn="ctr">
-          <a:solidFill>
-            <a:schemeClr val="phClr"/>
-          </a:solidFill>
           <a:prstDash val="solid"/>
           <a:miter lim="800000"/>
         </a:ln>
         <a:ln w="19050" cap="flat" cmpd="sng" algn="ctr">
-          <a:solidFill>
-            <a:schemeClr val="phClr"/>
-          </a:solidFill>
           <a:prstDash val="solid"/>
           <a:miter lim="800000"/>
         </a:ln>
         <a:ln w="25400" cap="flat" cmpd="sng" algn="ctr">
-          <a:solidFill>
-            <a:schemeClr val="phClr"/>
-          </a:solidFill>
           <a:prstDash val="solid"/>
           <a:miter lim="800000"/>
         </a:ln>
@@ -1858,13 +2457,7 @@
           <a:effectLst/>
         </a:effectStyle>
         <a:effectStyle>
-          <a:effectLst>
-            <a:outerShdw blurRad="57150" dist="19050" dir="5400000" algn="ctr" rotWithShape="0">
-              <a:srgbClr val="000000">
-                <a:alpha val="63000"/>
-              </a:srgbClr>
-            </a:outerShdw>
-          </a:effectLst>
+          <a:effectLst/>
         </a:effectStyle>
       </a:effectStyleLst>
       <a:bgFillStyleLst>
@@ -1874,15 +2467,13 @@
         <a:solidFill>
           <a:schemeClr val="phClr">
             <a:tint val="95000"/>
-            <a:satMod val="170000"/>
           </a:schemeClr>
         </a:solidFill>
-        <a:gradFill rotWithShape="1">
+        <a:gradFill>
           <a:gsLst>
             <a:gs pos="0">
               <a:schemeClr val="phClr">
                 <a:tint val="93000"/>
-                <a:satMod val="150000"/>
                 <a:shade val="98000"/>
                 <a:lumMod val="102000"/>
               </a:schemeClr>
@@ -1890,7 +2481,6 @@
             <a:gs pos="50000">
               <a:schemeClr val="phClr">
                 <a:tint val="98000"/>
-                <a:satMod val="130000"/>
                 <a:shade val="90000"/>
                 <a:lumMod val="103000"/>
               </a:schemeClr>
@@ -1898,41 +2488,14 @@
             <a:gs pos="100000">
               <a:schemeClr val="phClr">
                 <a:shade val="63000"/>
-                <a:satMod val="120000"/>
               </a:schemeClr>
             </a:gs>
           </a:gsLst>
           <a:lin ang="5400000" scaled="0"/>
+          <a:tileRect l="0" t="0" r="0" b="0"/>
         </a:gradFill>
       </a:bgFillStyleLst>
     </a:fmtScheme>
   </a:themeElements>
-  <a:objectDefaults>
-    <a:lnDef>
-      <a:spPr/>
-      <a:bodyPr/>
-      <a:lstStyle/>
-      <a:style>
-        <a:lnRef idx="2">
-          <a:schemeClr val="accent1"/>
-        </a:lnRef>
-        <a:fillRef idx="0">
-          <a:schemeClr val="accent1"/>
-        </a:fillRef>
-        <a:effectRef idx="1">
-          <a:schemeClr val="accent1"/>
-        </a:effectRef>
-        <a:fontRef idx="minor">
-          <a:schemeClr val="tx1"/>
-        </a:fontRef>
-      </a:style>
-    </a:lnDef>
-  </a:objectDefaults>
-  <a:extraClrSchemeLst/>
-  <a:extLst>
-    <a:ext uri="{05A4C25C-085E-4340-85A3-A5531E510DB2}">
-      <thm15:themeFamily xmlns:thm15="http://schemas.microsoft.com/office/thememl/2012/main" name="Office Theme" id="{2E142A2C-CD16-42D6-873A-C26D2A0506FA}" vid="{1BDDFF52-6CD6-40A5-AB3C-68EB2F1E4D0A}"/>
-    </a:ext>
-  </a:extLst>
 </a:theme>
 </file>
</xml_diff>

<commit_message>
Issue 51 update: vmnet driver state degradation, escalating to full VMware reinstall
</commit_message>
<xml_diff>
--- a/Incidents/Issues setting up Home Lab.docx
+++ b/Incidents/Issues setting up Home Lab.docx
@@ -1178,7 +1178,923 @@
         <w:rPr/>
       </w:pPr>
       <w:r>
-        <w:rPr/>
+        <w:rPr>
+          <w:b/>
+          <w:bCs/>
+        </w:rPr>
+        <w:t>Issue 51: VMnet19 host adapter drifted to 10.10.30.1</w:t>
+      </w:r>
+      <w:r>
+        <w:rPr/>
+        <w:t xml:space="preserve">, colliding with pfSense OPT2. Root cause likely manual netsh command or interrupted script run. Fix: re-run SetVMnetIPs.ps1 or manually reset to 10.10.30.2. Detection: </w:t>
+      </w:r>
+      <w:r>
+        <w:rPr>
+          <w:rStyle w:val="SourceText"/>
+        </w:rPr>
+        <w:t>Get-NetIPAddress -InterfaceAlias 'VMware*'</w:t>
+      </w:r>
+      <w:r>
+        <w:rPr/>
+        <w:t xml:space="preserve"> shows duplicate with pfSense interface IP."</w:t>
+      </w:r>
+    </w:p>
+    <w:p>
+      <w:pPr>
+        <w:pStyle w:val="Heading2"/>
+        <w:spacing w:before="0" w:after="160"/>
+        <w:rPr>
+          <w:rFonts w:ascii="Aptos" w:hAnsi="Aptos" w:eastAsia="Aptos" w:asciiTheme="minorHAnsi" w:cstheme="minorBidi" w:eastAsiaTheme="minorHAnsi" w:hAnsiTheme="minorHAnsi"/>
+          <w:color w:val="auto"/>
+          <w:sz w:val="24"/>
+          <w:szCs w:val="24"/>
+          <w14:ligatures w14:val="standardContextual"/>
+        </w:rPr>
+      </w:pPr>
+      <w:r>
+        <w:rPr>
+          <w:rFonts w:eastAsia="Aptos" w:cstheme="minorBidi" w:eastAsiaTheme="minorHAnsi" w:ascii="Aptos" w:hAnsi="Aptos"/>
+          <w:color w:val="auto"/>
+          <w:sz w:val="24"/>
+          <w:szCs w:val="24"/>
+          <w14:ligatures w14:val="standardContextual"/>
+        </w:rPr>
+        <w:t>Troubleshooting Log — Issue 51: VMnet19 Total Packet Loss After Dell Reboot (Unresolved)</w:t>
+      </w:r>
+    </w:p>
+    <w:p>
+      <w:pPr>
+        <w:pStyle w:val="BodyText"/>
+        <w:spacing w:lineRule="auto" w:line="278" w:before="0" w:after="160"/>
+        <w:rPr/>
+      </w:pPr>
+      <w:r>
+        <w:rPr>
+          <w:rStyle w:val="Strong"/>
+        </w:rPr>
+        <w:t>Date:</w:t>
+      </w:r>
+      <w:r>
+        <w:rPr/>
+        <w:t xml:space="preserve"> April 20, 2026 </w:t>
+      </w:r>
+      <w:r>
+        <w:rPr>
+          <w:rStyle w:val="Strong"/>
+        </w:rPr>
+        <w:t>Status:</w:t>
+      </w:r>
+      <w:r>
+        <w:rPr/>
+        <w:t xml:space="preserve"> Open — blocking Phase 22 </w:t>
+      </w:r>
+      <w:r>
+        <w:rPr>
+          <w:rStyle w:val="Strong"/>
+        </w:rPr>
+        <w:t>Severity:</w:t>
+      </w:r>
+      <w:r>
+        <w:rPr/>
+        <w:t xml:space="preserve"> High — DMZ network unreachable from all sources</w:t>
+      </w:r>
+    </w:p>
+    <w:p>
+      <w:pPr>
+        <w:pStyle w:val="Heading3"/>
+        <w:spacing w:before="0" w:after="160"/>
+        <w:rPr>
+          <w:rFonts w:eastAsia="Aptos" w:cstheme="minorBidi" w:eastAsiaTheme="minorHAnsi"/>
+          <w:color w:val="auto"/>
+          <w:sz w:val="24"/>
+          <w:szCs w:val="24"/>
+          <w14:ligatures w14:val="standardContextual"/>
+        </w:rPr>
+      </w:pPr>
+      <w:r>
+        <w:rPr>
+          <w:rFonts w:eastAsia="Aptos" w:cstheme="minorBidi" w:eastAsiaTheme="minorHAnsi"/>
+          <w:color w:val="auto"/>
+          <w:sz w:val="24"/>
+          <w:szCs w:val="24"/>
+          <w14:ligatures w14:val="standardContextual"/>
+        </w:rPr>
+        <w:t>Symptoms</w:t>
+      </w:r>
+    </w:p>
+    <w:p>
+      <w:pPr>
+        <w:pStyle w:val="BodyText"/>
+        <w:numPr>
+          <w:ilvl w:val="0"/>
+          <w:numId w:val="1"/>
+        </w:numPr>
+        <w:tabs>
+          <w:tab w:val="clear" w:pos="720"/>
+          <w:tab w:val="left" w:pos="0" w:leader="none"/>
+        </w:tabs>
+        <w:spacing w:lineRule="auto" w:line="278" w:before="0" w:after="0"/>
+        <w:ind w:hanging="283" w:start="709"/>
+        <w:rPr/>
+      </w:pPr>
+      <w:r>
+        <w:rPr/>
+        <w:t xml:space="preserve">100% packet loss on VMnet19 between all endpoints: Dell host → pfSense OPT2, pfSense OPT2 → VMs, VM → VM </w:t>
+      </w:r>
+    </w:p>
+    <w:p>
+      <w:pPr>
+        <w:pStyle w:val="BodyText"/>
+        <w:numPr>
+          <w:ilvl w:val="0"/>
+          <w:numId w:val="1"/>
+        </w:numPr>
+        <w:tabs>
+          <w:tab w:val="clear" w:pos="720"/>
+          <w:tab w:val="left" w:pos="0" w:leader="none"/>
+        </w:tabs>
+        <w:spacing w:lineRule="auto" w:line="278" w:before="0" w:after="0"/>
+        <w:ind w:hanging="283" w:start="709"/>
+        <w:rPr/>
+      </w:pPr>
+      <w:r>
+        <w:rPr>
+          <w:rStyle w:val="SourceText"/>
+        </w:rPr>
+        <w:t>arp -a</w:t>
+      </w:r>
+      <w:r>
+        <w:rPr/>
+        <w:t xml:space="preserve"> on Kali shows </w:t>
+      </w:r>
+      <w:r>
+        <w:rPr>
+          <w:rStyle w:val="SourceText"/>
+        </w:rPr>
+        <w:t>(incomplete)</w:t>
+      </w:r>
+      <w:r>
+        <w:rPr/>
+        <w:t xml:space="preserve"> entries for 10.10.30.0/24 hosts </w:t>
+      </w:r>
+    </w:p>
+    <w:p>
+      <w:pPr>
+        <w:pStyle w:val="BodyText"/>
+        <w:numPr>
+          <w:ilvl w:val="0"/>
+          <w:numId w:val="1"/>
+        </w:numPr>
+        <w:tabs>
+          <w:tab w:val="clear" w:pos="720"/>
+          <w:tab w:val="left" w:pos="0" w:leader="none"/>
+        </w:tabs>
+        <w:spacing w:lineRule="auto" w:line="278" w:before="0" w:after="0"/>
+        <w:ind w:hanging="283" w:start="709"/>
+        <w:rPr/>
+      </w:pPr>
+      <w:r>
+        <w:rPr/>
+        <w:t xml:space="preserve">ICMP </w:t>
+      </w:r>
+      <w:r>
+        <w:rPr>
+          <w:rStyle w:val="SourceText"/>
+        </w:rPr>
+        <w:t>Destination Host Unreachable</w:t>
+      </w:r>
+      <w:r>
+        <w:rPr/>
+        <w:t xml:space="preserve"> messages originate from the sending host itself (ARP failure), not from any gateway </w:t>
+      </w:r>
+    </w:p>
+    <w:p>
+      <w:pPr>
+        <w:pStyle w:val="BodyText"/>
+        <w:numPr>
+          <w:ilvl w:val="0"/>
+          <w:numId w:val="1"/>
+        </w:numPr>
+        <w:tabs>
+          <w:tab w:val="clear" w:pos="720"/>
+          <w:tab w:val="left" w:pos="0" w:leader="none"/>
+        </w:tabs>
+        <w:spacing w:lineRule="auto" w:line="278" w:before="0" w:after="0"/>
+        <w:ind w:hanging="283" w:start="709"/>
+        <w:rPr/>
+      </w:pPr>
+      <w:r>
+        <w:rPr/>
+        <w:t xml:space="preserve">VMnet10 (Servers) continues to work normally throughout — isolating the problem to VMnet19 </w:t>
+      </w:r>
+    </w:p>
+    <w:p>
+      <w:pPr>
+        <w:pStyle w:val="BodyText"/>
+        <w:numPr>
+          <w:ilvl w:val="0"/>
+          <w:numId w:val="1"/>
+        </w:numPr>
+        <w:tabs>
+          <w:tab w:val="clear" w:pos="720"/>
+          <w:tab w:val="left" w:pos="0" w:leader="none"/>
+        </w:tabs>
+        <w:spacing w:lineRule="auto" w:line="278"/>
+        <w:ind w:hanging="283" w:start="709"/>
+        <w:rPr/>
+      </w:pPr>
+      <w:r>
+        <w:rPr/>
+        <w:t xml:space="preserve">Once during troubleshooting, disabling Windows Firewall produced one ICMP reply from 10.10.30.2 before timing out the rest; not reproducible </w:t>
+      </w:r>
+    </w:p>
+    <w:p>
+      <w:pPr>
+        <w:pStyle w:val="Heading3"/>
+        <w:spacing w:before="0" w:after="160"/>
+        <w:rPr>
+          <w:rFonts w:eastAsia="Aptos" w:cstheme="minorBidi" w:eastAsiaTheme="minorHAnsi"/>
+          <w:color w:val="auto"/>
+          <w:sz w:val="24"/>
+          <w:szCs w:val="24"/>
+          <w14:ligatures w14:val="standardContextual"/>
+        </w:rPr>
+      </w:pPr>
+      <w:r>
+        <w:rPr>
+          <w:rFonts w:eastAsia="Aptos" w:cstheme="minorBidi" w:eastAsiaTheme="minorHAnsi"/>
+          <w:color w:val="auto"/>
+          <w:sz w:val="24"/>
+          <w:szCs w:val="24"/>
+          <w14:ligatures w14:val="standardContextual"/>
+        </w:rPr>
+        <w:t>Environment at Time of Issue</w:t>
+      </w:r>
+    </w:p>
+    <w:p>
+      <w:pPr>
+        <w:pStyle w:val="BodyText"/>
+        <w:numPr>
+          <w:ilvl w:val="0"/>
+          <w:numId w:val="2"/>
+        </w:numPr>
+        <w:tabs>
+          <w:tab w:val="clear" w:pos="720"/>
+          <w:tab w:val="left" w:pos="0" w:leader="none"/>
+        </w:tabs>
+        <w:spacing w:lineRule="auto" w:line="278" w:before="0" w:after="0"/>
+        <w:ind w:hanging="283" w:start="709"/>
+        <w:rPr/>
+      </w:pPr>
+      <w:r>
+        <w:rPr/>
+        <w:t xml:space="preserve">Dell OptiPlex 7050, Windows 11 </w:t>
+      </w:r>
+    </w:p>
+    <w:p>
+      <w:pPr>
+        <w:pStyle w:val="BodyText"/>
+        <w:numPr>
+          <w:ilvl w:val="0"/>
+          <w:numId w:val="2"/>
+        </w:numPr>
+        <w:tabs>
+          <w:tab w:val="clear" w:pos="720"/>
+          <w:tab w:val="left" w:pos="0" w:leader="none"/>
+        </w:tabs>
+        <w:spacing w:lineRule="auto" w:line="278" w:before="0" w:after="0"/>
+        <w:ind w:hanging="283" w:start="709"/>
+        <w:rPr/>
+      </w:pPr>
+      <w:r>
+        <w:rPr/>
+        <w:t xml:space="preserve">VMware Workstation Pro 17.6.4 build 24832109 </w:t>
+      </w:r>
+    </w:p>
+    <w:p>
+      <w:pPr>
+        <w:pStyle w:val="BodyText"/>
+        <w:numPr>
+          <w:ilvl w:val="0"/>
+          <w:numId w:val="2"/>
+        </w:numPr>
+        <w:tabs>
+          <w:tab w:val="clear" w:pos="720"/>
+          <w:tab w:val="left" w:pos="0" w:leader="none"/>
+        </w:tabs>
+        <w:spacing w:lineRule="auto" w:line="278" w:before="0" w:after="0"/>
+        <w:ind w:hanging="283" w:start="709"/>
+        <w:rPr/>
+      </w:pPr>
+      <w:r>
+        <w:rPr/>
+        <w:t xml:space="preserve">pfSense 2.7.2-RELEASE on SRV-FW01 </w:t>
+      </w:r>
+    </w:p>
+    <w:p>
+      <w:pPr>
+        <w:pStyle w:val="BodyText"/>
+        <w:numPr>
+          <w:ilvl w:val="0"/>
+          <w:numId w:val="2"/>
+        </w:numPr>
+        <w:tabs>
+          <w:tab w:val="clear" w:pos="720"/>
+          <w:tab w:val="left" w:pos="0" w:leader="none"/>
+        </w:tabs>
+        <w:spacing w:lineRule="auto" w:line="278" w:before="0" w:after="0"/>
+        <w:ind w:hanging="283" w:start="709"/>
+        <w:rPr/>
+      </w:pPr>
+      <w:r>
+        <w:rPr/>
+        <w:t xml:space="preserve">VMnet19 configured Host-only, 10.10.30.0/24, host adapter connected, DHCP disabled </w:t>
+      </w:r>
+    </w:p>
+    <w:p>
+      <w:pPr>
+        <w:pStyle w:val="BodyText"/>
+        <w:numPr>
+          <w:ilvl w:val="0"/>
+          <w:numId w:val="2"/>
+        </w:numPr>
+        <w:tabs>
+          <w:tab w:val="clear" w:pos="720"/>
+          <w:tab w:val="left" w:pos="0" w:leader="none"/>
+        </w:tabs>
+        <w:spacing w:lineRule="auto" w:line="278" w:before="0" w:after="0"/>
+        <w:ind w:hanging="283" w:start="709"/>
+        <w:rPr/>
+      </w:pPr>
+      <w:r>
+        <w:rPr/>
+        <w:t xml:space="preserve">pfSense OPT2 assigned em3, enabled, static 10.10.30.1/24 </w:t>
+      </w:r>
+    </w:p>
+    <w:p>
+      <w:pPr>
+        <w:pStyle w:val="BodyText"/>
+        <w:numPr>
+          <w:ilvl w:val="0"/>
+          <w:numId w:val="2"/>
+        </w:numPr>
+        <w:tabs>
+          <w:tab w:val="clear" w:pos="720"/>
+          <w:tab w:val="left" w:pos="0" w:leader="none"/>
+        </w:tabs>
+        <w:spacing w:lineRule="auto" w:line="278"/>
+        <w:ind w:hanging="283" w:start="709"/>
+        <w:rPr/>
+      </w:pPr>
+      <w:r>
+        <w:rPr/>
+        <w:t xml:space="preserve">SRV-FW01 Network Adapter 4 assigned to VMnet19 </w:t>
+      </w:r>
+    </w:p>
+    <w:p>
+      <w:pPr>
+        <w:pStyle w:val="Heading3"/>
+        <w:spacing w:before="0" w:after="160"/>
+        <w:rPr>
+          <w:rFonts w:eastAsia="Aptos" w:cstheme="minorBidi" w:eastAsiaTheme="minorHAnsi"/>
+          <w:color w:val="auto"/>
+          <w:sz w:val="24"/>
+          <w:szCs w:val="24"/>
+          <w14:ligatures w14:val="standardContextual"/>
+        </w:rPr>
+      </w:pPr>
+      <w:r>
+        <w:rPr>
+          <w:rFonts w:eastAsia="Aptos" w:cstheme="minorBidi" w:eastAsiaTheme="minorHAnsi"/>
+          <w:color w:val="auto"/>
+          <w:sz w:val="24"/>
+          <w:szCs w:val="24"/>
+          <w14:ligatures w14:val="standardContextual"/>
+        </w:rPr>
+        <w:t>Fixes Attempted (all unsuccessful for VMnet19)</w:t>
+      </w:r>
+    </w:p>
+    <w:p>
+      <w:pPr>
+        <w:pStyle w:val="BodyText"/>
+        <w:numPr>
+          <w:ilvl w:val="0"/>
+          <w:numId w:val="3"/>
+        </w:numPr>
+        <w:tabs>
+          <w:tab w:val="clear" w:pos="720"/>
+          <w:tab w:val="left" w:pos="0" w:leader="none"/>
+        </w:tabs>
+        <w:spacing w:lineRule="auto" w:line="278" w:before="0" w:after="0"/>
+        <w:ind w:hanging="283" w:start="709"/>
+        <w:rPr/>
+      </w:pPr>
+      <w:r>
+        <w:rPr>
+          <w:rStyle w:val="Strong"/>
+        </w:rPr>
+        <w:t>IP conflict resolution</w:t>
+      </w:r>
+      <w:r>
+        <w:rPr/>
+        <w:t xml:space="preserve"> — Dell VMnet19 host adapter was drifting to 10.10.30.1 (conflicting with pfSense OPT2); reset to 10.10.30.2 via </w:t>
+      </w:r>
+      <w:r>
+        <w:rPr>
+          <w:rStyle w:val="SourceText"/>
+        </w:rPr>
+        <w:t>netsh</w:t>
+      </w:r>
+      <w:r>
+        <w:rPr/>
+        <w:t xml:space="preserve">. Conflict cleared but traffic still did not flow. </w:t>
+      </w:r>
+    </w:p>
+    <w:p>
+      <w:pPr>
+        <w:pStyle w:val="BodyText"/>
+        <w:numPr>
+          <w:ilvl w:val="0"/>
+          <w:numId w:val="3"/>
+        </w:numPr>
+        <w:tabs>
+          <w:tab w:val="clear" w:pos="720"/>
+          <w:tab w:val="left" w:pos="0" w:leader="none"/>
+        </w:tabs>
+        <w:spacing w:lineRule="auto" w:line="278" w:before="0" w:after="0"/>
+        <w:ind w:hanging="283" w:start="709"/>
+        <w:rPr/>
+      </w:pPr>
+      <w:r>
+        <w:rPr>
+          <w:rStyle w:val="Strong"/>
+        </w:rPr>
+        <w:t>Virtual Network Editor subnet toggle</w:t>
+      </w:r>
+      <w:r>
+        <w:rPr/>
+        <w:t xml:space="preserve"> — changed VMnet19 subnet IP and reverted to force reinitialization. No effect. </w:t>
+      </w:r>
+    </w:p>
+    <w:p>
+      <w:pPr>
+        <w:pStyle w:val="BodyText"/>
+        <w:numPr>
+          <w:ilvl w:val="0"/>
+          <w:numId w:val="3"/>
+        </w:numPr>
+        <w:tabs>
+          <w:tab w:val="clear" w:pos="720"/>
+          <w:tab w:val="left" w:pos="0" w:leader="none"/>
+        </w:tabs>
+        <w:spacing w:lineRule="auto" w:line="278" w:before="0" w:after="0"/>
+        <w:ind w:hanging="283" w:start="709"/>
+        <w:rPr/>
+      </w:pPr>
+      <w:r>
+        <w:rPr>
+          <w:rStyle w:val="Strong"/>
+        </w:rPr>
+        <w:t>VMware service stack restart</w:t>
+      </w:r>
+      <w:r>
+        <w:rPr/>
+        <w:t xml:space="preserve"> — stopped and started NAT, DHCP, Authorization, USB Arbitration services. Services cycled clean. No effect. </w:t>
+      </w:r>
+    </w:p>
+    <w:p>
+      <w:pPr>
+        <w:pStyle w:val="BodyText"/>
+        <w:numPr>
+          <w:ilvl w:val="0"/>
+          <w:numId w:val="3"/>
+        </w:numPr>
+        <w:tabs>
+          <w:tab w:val="clear" w:pos="720"/>
+          <w:tab w:val="left" w:pos="0" w:leader="none"/>
+        </w:tabs>
+        <w:spacing w:lineRule="auto" w:line="278" w:before="0" w:after="0"/>
+        <w:ind w:hanging="283" w:start="709"/>
+        <w:rPr/>
+      </w:pPr>
+      <w:r>
+        <w:rPr>
+          <w:rStyle w:val="Strong"/>
+        </w:rPr>
+        <w:t>VMnet19 full removal and recreation</w:t>
+      </w:r>
+      <w:r>
+        <w:rPr/>
+        <w:t xml:space="preserve"> in Virtual Network Editor with correct Host-only config. No effect. </w:t>
+      </w:r>
+    </w:p>
+    <w:p>
+      <w:pPr>
+        <w:pStyle w:val="BodyText"/>
+        <w:numPr>
+          <w:ilvl w:val="0"/>
+          <w:numId w:val="3"/>
+        </w:numPr>
+        <w:tabs>
+          <w:tab w:val="clear" w:pos="720"/>
+          <w:tab w:val="left" w:pos="0" w:leader="none"/>
+        </w:tabs>
+        <w:spacing w:lineRule="auto" w:line="278" w:before="0" w:after="0"/>
+        <w:ind w:hanging="283" w:start="709"/>
+        <w:rPr/>
+      </w:pPr>
+      <w:r>
+        <w:rPr>
+          <w:rStyle w:val="Strong"/>
+        </w:rPr>
+        <w:t>Full Dell reboot</w:t>
+      </w:r>
+      <w:r>
+        <w:rPr/>
+        <w:t xml:space="preserve"> to clear vmnet kernel driver state. No effect. </w:t>
+      </w:r>
+    </w:p>
+    <w:p>
+      <w:pPr>
+        <w:pStyle w:val="BodyText"/>
+        <w:numPr>
+          <w:ilvl w:val="0"/>
+          <w:numId w:val="3"/>
+        </w:numPr>
+        <w:tabs>
+          <w:tab w:val="clear" w:pos="720"/>
+          <w:tab w:val="left" w:pos="0" w:leader="none"/>
+        </w:tabs>
+        <w:spacing w:lineRule="auto" w:line="278" w:before="0" w:after="0"/>
+        <w:ind w:hanging="283" w:start="709"/>
+        <w:rPr/>
+      </w:pPr>
+      <w:r>
+        <w:rPr>
+          <w:rStyle w:val="Strong"/>
+        </w:rPr>
+        <w:t>Host adapter disable/enable</w:t>
+      </w:r>
+      <w:r>
+        <w:rPr/>
+        <w:t xml:space="preserve"> via </w:t>
+      </w:r>
+      <w:r>
+        <w:rPr>
+          <w:rStyle w:val="SourceText"/>
+        </w:rPr>
+        <w:t>Disable-NetAdapter</w:t>
+      </w:r>
+      <w:r>
+        <w:rPr/>
+        <w:t xml:space="preserve"> / </w:t>
+      </w:r>
+      <w:r>
+        <w:rPr>
+          <w:rStyle w:val="SourceText"/>
+        </w:rPr>
+        <w:t>Enable-NetAdapter</w:t>
+      </w:r>
+      <w:r>
+        <w:rPr/>
+        <w:t xml:space="preserve">. </w:t>
+      </w:r>
+      <w:r>
+        <w:rPr>
+          <w:rStyle w:val="SourceText"/>
+        </w:rPr>
+        <w:t>Get-NetAdapterStatistics</w:t>
+      </w:r>
+      <w:r>
+        <w:rPr/>
+        <w:t xml:space="preserve"> returned </w:t>
+      </w:r>
+      <w:r>
+        <w:rPr>
+          <w:rStyle w:val="SourceText"/>
+        </w:rPr>
+        <w:t>ObjectNotFound</w:t>
+      </w:r>
+      <w:r>
+        <w:rPr/>
+        <w:t xml:space="preserve"> for VMnet19 specifically, suggesting incomplete NDIS binding. No effect on connectivity. </w:t>
+      </w:r>
+    </w:p>
+    <w:p>
+      <w:pPr>
+        <w:pStyle w:val="BodyText"/>
+        <w:numPr>
+          <w:ilvl w:val="0"/>
+          <w:numId w:val="3"/>
+        </w:numPr>
+        <w:tabs>
+          <w:tab w:val="clear" w:pos="720"/>
+          <w:tab w:val="left" w:pos="0" w:leader="none"/>
+        </w:tabs>
+        <w:spacing w:lineRule="auto" w:line="278" w:before="0" w:after="0"/>
+        <w:ind w:hanging="283" w:start="709"/>
+        <w:rPr/>
+      </w:pPr>
+      <w:r>
+        <w:rPr>
+          <w:rStyle w:val="Strong"/>
+        </w:rPr>
+        <w:t>vnetlib64.exe driver uninstall/reinstall</w:t>
+      </w:r>
+      <w:r>
+        <w:rPr/>
+        <w:t xml:space="preserve"> — </w:t>
+      </w:r>
+      <w:r>
+        <w:rPr>
+          <w:rStyle w:val="SourceText"/>
+        </w:rPr>
+        <w:t>uninstall vnetflt</w:t>
+      </w:r>
+      <w:r>
+        <w:rPr/>
+        <w:t xml:space="preserve">, </w:t>
+      </w:r>
+      <w:r>
+        <w:rPr>
+          <w:rStyle w:val="SourceText"/>
+        </w:rPr>
+        <w:t>uninstall vnetadapter</w:t>
+      </w:r>
+      <w:r>
+        <w:rPr/>
+        <w:t xml:space="preserve">, </w:t>
+      </w:r>
+      <w:r>
+        <w:rPr>
+          <w:rStyle w:val="SourceText"/>
+        </w:rPr>
+        <w:t>install vnetflt</w:t>
+      </w:r>
+      <w:r>
+        <w:rPr/>
+        <w:t xml:space="preserve">, </w:t>
+      </w:r>
+      <w:r>
+        <w:rPr>
+          <w:rStyle w:val="SourceText"/>
+        </w:rPr>
+        <w:t>install vnetadapter</w:t>
+      </w:r>
+      <w:r>
+        <w:rPr/>
+        <w:t xml:space="preserve">. Commands completed silently. No effect. </w:t>
+      </w:r>
+    </w:p>
+    <w:p>
+      <w:pPr>
+        <w:pStyle w:val="BodyText"/>
+        <w:numPr>
+          <w:ilvl w:val="0"/>
+          <w:numId w:val="3"/>
+        </w:numPr>
+        <w:tabs>
+          <w:tab w:val="clear" w:pos="720"/>
+          <w:tab w:val="left" w:pos="0" w:leader="none"/>
+        </w:tabs>
+        <w:spacing w:lineRule="auto" w:line="278" w:before="0" w:after="0"/>
+        <w:ind w:hanging="283" w:start="709"/>
+        <w:rPr/>
+      </w:pPr>
+      <w:r>
+        <w:rPr>
+          <w:rStyle w:val="Strong"/>
+        </w:rPr>
+        <w:t>VMware Workstation 17.6.4 repair install</w:t>
+      </w:r>
+      <w:r>
+        <w:rPr/>
+        <w:t xml:space="preserve"> via official installer from TechPowerUp mirror. Completed successfully. Reset all host adapter IPs to .1 defaults (caused new IP conflict on VMnet10 requiring manual </w:t>
+      </w:r>
+      <w:r>
+        <w:rPr>
+          <w:rStyle w:val="SourceText"/>
+        </w:rPr>
+        <w:t>netsh</w:t>
+      </w:r>
+      <w:r>
+        <w:rPr/>
+        <w:t xml:space="preserve"> fix). No effect on VMnet19. </w:t>
+      </w:r>
+    </w:p>
+    <w:p>
+      <w:pPr>
+        <w:pStyle w:val="BodyText"/>
+        <w:numPr>
+          <w:ilvl w:val="0"/>
+          <w:numId w:val="3"/>
+        </w:numPr>
+        <w:tabs>
+          <w:tab w:val="clear" w:pos="720"/>
+          <w:tab w:val="left" w:pos="0" w:leader="none"/>
+        </w:tabs>
+        <w:spacing w:lineRule="auto" w:line="278" w:before="0" w:after="0"/>
+        <w:ind w:hanging="283" w:start="709"/>
+        <w:rPr/>
+      </w:pPr>
+      <w:r>
+        <w:rPr>
+          <w:rStyle w:val="Strong"/>
+        </w:rPr>
+        <w:t>Windows Firewall rules</w:t>
+      </w:r>
+      <w:r>
+        <w:rPr/>
+        <w:t xml:space="preserve"> — created allow rules for VMnet19 adapter, both directions, protocol Any. No effect. Disabling all firewall profiles temporarily produced one ICMP reply from 10.10.30.2 (not reproducible). </w:t>
+      </w:r>
+    </w:p>
+    <w:p>
+      <w:pPr>
+        <w:pStyle w:val="BodyText"/>
+        <w:numPr>
+          <w:ilvl w:val="0"/>
+          <w:numId w:val="3"/>
+        </w:numPr>
+        <w:tabs>
+          <w:tab w:val="clear" w:pos="720"/>
+          <w:tab w:val="left" w:pos="0" w:leader="none"/>
+        </w:tabs>
+        <w:spacing w:lineRule="auto" w:line="278"/>
+        <w:ind w:hanging="283" w:start="709"/>
+        <w:rPr/>
+      </w:pPr>
+      <w:r>
+        <w:rPr>
+          <w:rStyle w:val="Strong"/>
+        </w:rPr>
+        <w:t>Recreated missing VMnet11</w:t>
+      </w:r>
+      <w:r>
+        <w:rPr/>
+        <w:t xml:space="preserve"> — Virtual Network Editor was missing VMnet11 after repair install (needed for pfSense OPT1/Clients). Added back as Host-only 10.10.20.0/24 with host adapter at 10.10.20.2. No effect on VMnet19. </w:t>
+      </w:r>
+    </w:p>
+    <w:p>
+      <w:pPr>
+        <w:pStyle w:val="Heading3"/>
+        <w:spacing w:before="0" w:after="160"/>
+        <w:rPr>
+          <w:rFonts w:eastAsia="Aptos" w:cstheme="minorBidi" w:eastAsiaTheme="minorHAnsi"/>
+          <w:color w:val="auto"/>
+          <w:sz w:val="24"/>
+          <w:szCs w:val="24"/>
+          <w14:ligatures w14:val="standardContextual"/>
+        </w:rPr>
+      </w:pPr>
+      <w:r>
+        <w:rPr>
+          <w:rFonts w:eastAsia="Aptos" w:cstheme="minorBidi" w:eastAsiaTheme="minorHAnsi"/>
+          <w:color w:val="auto"/>
+          <w:sz w:val="24"/>
+          <w:szCs w:val="24"/>
+          <w14:ligatures w14:val="standardContextual"/>
+        </w:rPr>
+        <w:t>Ruled Out</w:t>
+      </w:r>
+    </w:p>
+    <w:p>
+      <w:pPr>
+        <w:pStyle w:val="BodyText"/>
+        <w:numPr>
+          <w:ilvl w:val="0"/>
+          <w:numId w:val="4"/>
+        </w:numPr>
+        <w:tabs>
+          <w:tab w:val="clear" w:pos="720"/>
+          <w:tab w:val="left" w:pos="0" w:leader="none"/>
+        </w:tabs>
+        <w:spacing w:lineRule="auto" w:line="278" w:before="0" w:after="0"/>
+        <w:ind w:hanging="283" w:start="709"/>
+        <w:rPr/>
+      </w:pPr>
+      <w:r>
+        <w:rPr/>
+        <w:t xml:space="preserve">IP conflicts (verified multiple times after each fix) </w:t>
+      </w:r>
+    </w:p>
+    <w:p>
+      <w:pPr>
+        <w:pStyle w:val="BodyText"/>
+        <w:numPr>
+          <w:ilvl w:val="0"/>
+          <w:numId w:val="4"/>
+        </w:numPr>
+        <w:tabs>
+          <w:tab w:val="clear" w:pos="720"/>
+          <w:tab w:val="left" w:pos="0" w:leader="none"/>
+        </w:tabs>
+        <w:spacing w:lineRule="auto" w:line="278" w:before="0" w:after="0"/>
+        <w:ind w:hanging="283" w:start="709"/>
+        <w:rPr/>
+      </w:pPr>
+      <w:r>
+        <w:rPr/>
+        <w:t xml:space="preserve">pfSense configuration (OPT2 enabled, correct IP, interface shown up in console) </w:t>
+      </w:r>
+    </w:p>
+    <w:p>
+      <w:pPr>
+        <w:pStyle w:val="BodyText"/>
+        <w:numPr>
+          <w:ilvl w:val="0"/>
+          <w:numId w:val="4"/>
+        </w:numPr>
+        <w:tabs>
+          <w:tab w:val="clear" w:pos="720"/>
+          <w:tab w:val="left" w:pos="0" w:leader="none"/>
+        </w:tabs>
+        <w:spacing w:lineRule="auto" w:line="278" w:before="0" w:after="0"/>
+        <w:ind w:hanging="283" w:start="709"/>
+        <w:rPr/>
+      </w:pPr>
+      <w:r>
+        <w:rPr/>
+        <w:t xml:space="preserve">SRV-FW01 adapter-to-VMnet binding (Network Adapter 4 correctly mapped to VMnet19) </w:t>
+      </w:r>
+    </w:p>
+    <w:p>
+      <w:pPr>
+        <w:pStyle w:val="BodyText"/>
+        <w:numPr>
+          <w:ilvl w:val="0"/>
+          <w:numId w:val="4"/>
+        </w:numPr>
+        <w:tabs>
+          <w:tab w:val="clear" w:pos="720"/>
+          <w:tab w:val="left" w:pos="0" w:leader="none"/>
+        </w:tabs>
+        <w:spacing w:lineRule="auto" w:line="278" w:before="0" w:after="0"/>
+        <w:ind w:hanging="283" w:start="709"/>
+        <w:rPr/>
+      </w:pPr>
+      <w:r>
+        <w:rPr/>
+        <w:t xml:space="preserve">Virtual Network Editor config (Host-only, correct subnet, host adapter present, DHCP off) </w:t>
+      </w:r>
+    </w:p>
+    <w:p>
+      <w:pPr>
+        <w:pStyle w:val="BodyText"/>
+        <w:numPr>
+          <w:ilvl w:val="0"/>
+          <w:numId w:val="4"/>
+        </w:numPr>
+        <w:tabs>
+          <w:tab w:val="clear" w:pos="720"/>
+          <w:tab w:val="left" w:pos="0" w:leader="none"/>
+        </w:tabs>
+        <w:spacing w:lineRule="auto" w:line="278" w:before="0" w:after="0"/>
+        <w:ind w:hanging="283" w:start="709"/>
+        <w:rPr/>
+      </w:pPr>
+      <w:r>
+        <w:rPr/>
+        <w:t xml:space="preserve">VMware services state </w:t>
+      </w:r>
+    </w:p>
+    <w:p>
+      <w:pPr>
+        <w:pStyle w:val="BodyText"/>
+        <w:numPr>
+          <w:ilvl w:val="0"/>
+          <w:numId w:val="4"/>
+        </w:numPr>
+        <w:tabs>
+          <w:tab w:val="clear" w:pos="720"/>
+          <w:tab w:val="left" w:pos="0" w:leader="none"/>
+        </w:tabs>
+        <w:spacing w:lineRule="auto" w:line="278" w:before="0" w:after="0"/>
+        <w:ind w:hanging="283" w:start="709"/>
+        <w:rPr/>
+      </w:pPr>
+      <w:r>
+        <w:rPr/>
+        <w:t xml:space="preserve">vmnet driver installation (reinstalled via vnetlib64 and VMware repair) </w:t>
+      </w:r>
+    </w:p>
+    <w:p>
+      <w:pPr>
+        <w:pStyle w:val="BodyText"/>
+        <w:numPr>
+          <w:ilvl w:val="0"/>
+          <w:numId w:val="4"/>
+        </w:numPr>
+        <w:tabs>
+          <w:tab w:val="clear" w:pos="720"/>
+          <w:tab w:val="left" w:pos="0" w:leader="none"/>
+        </w:tabs>
+        <w:spacing w:lineRule="auto" w:line="278"/>
+        <w:ind w:hanging="283" w:start="709"/>
+        <w:rPr/>
+      </w:pPr>
+      <w:r>
+        <w:rPr/>
+        <w:t>Windows Firewall (rules created, also tested with firewall fully off)</w:t>
       </w:r>
     </w:p>
     <w:p>
@@ -1194,15 +2110,11 @@
               <wp:inline distT="0" distB="0" distL="0" distR="0">
                 <wp:extent cx="5943600" cy="19050"/>
                 <wp:effectExtent l="0" t="0" r="0" b="0"/>
-                <wp:docPr id="1" name=""/>
+                <wp:docPr id="1" name="Shape1"/>
                 <a:graphic xmlns:a="http://schemas.openxmlformats.org/drawingml/2006/main">
                   <a:graphicData uri="http://schemas.microsoft.com/office/word/2010/wordprocessingShape">
                     <wps:wsp>
                       <wps:cNvSpPr/>
-                      <wps:nvSpPr>
-                        <wps:cNvPr id="2" name=""/>
-                        <wps:cNvSpPr/>
-                      </wps:nvSpPr>
                       <wps:spPr>
                         <a:xfrm>
                           <a:off x="0" y="0"/>
@@ -1218,6 +2130,12 @@
                           <a:noFill/>
                         </a:ln>
                       </wps:spPr>
+                      <wps:style>
+                        <a:lnRef idx="0"/>
+                        <a:fillRef idx="0"/>
+                        <a:effectRef idx="0"/>
+                        <a:fontRef idx="minor"/>
+                      </wps:style>
                       <wps:bodyPr/>
                     </wps:wsp>
                   </a:graphicData>
@@ -1230,10 +2148,10 @@
           </mc:Choice>
           <mc:Fallback>
             <w:pict>
-              <v:rect id="shape_0" fillcolor="#a0a0a0" stroked="f" o:allowincell="f" style="position:absolute;margin-left:0pt;margin-top:-1.55pt;width:467.95pt;height:1.45pt;mso-wrap-style:none;v-text-anchor:middle;mso-position-horizontal:center;mso-position-vertical:top">
+              <v:rect id="shape_0" fillcolor="#a0a0a0" stroked="f" o:allowincell="f" style="position:absolute;margin-left:0pt;margin-top:-1.55pt;width:467.95pt;height:1.45pt;mso-wrap-style:none;v-text-anchor:middle;mso-position-vertical:top">
                 <v:fill o:detectmouseclick="t" type="solid" color2="#5f5f5f"/>
                 <v:stroke color="#3465a4" joinstyle="round" endcap="flat"/>
-                <w10:wrap type="topAndBottom"/>
+                <w10:wrap type="square"/>
               </v:rect>
             </w:pict>
           </mc:Fallback>
@@ -1282,6 +2200,675 @@
     </w:sectPr>
   </w:body>
 </w:document>
+</file>
+
+<file path=word/numbering.xml><?xml version="1.0" encoding="utf-8"?>
+<w:numbering xmlns:w="http://schemas.openxmlformats.org/wordprocessingml/2006/main" xmlns:o="urn:schemas-microsoft-com:office:office" xmlns:r="http://schemas.openxmlformats.org/officeDocument/2006/relationships" xmlns:v="urn:schemas-microsoft-com:vml" xmlns:mc="http://schemas.openxmlformats.org/markup-compatibility/2006" xmlns:w14="http://schemas.microsoft.com/office/word/2010/wordml" mc:Ignorable="w14">
+  <w:abstractNum w:abstractNumId="1">
+    <w:lvl w:ilvl="0">
+      <w:start w:val="1"/>
+      <w:numFmt w:val="bullet"/>
+      <w:lvlText w:val=""/>
+      <w:lvlJc w:val="start"/>
+      <w:pPr>
+        <w:tabs>
+          <w:tab w:val="num" w:pos="709"/>
+        </w:tabs>
+        <w:ind w:start="709" w:hanging="283"/>
+      </w:pPr>
+      <w:rPr>
+        <w:rFonts w:ascii="Symbol" w:hAnsi="Symbol" w:cs="Symbol" w:hint="default"/>
+      </w:rPr>
+    </w:lvl>
+    <w:lvl w:ilvl="1">
+      <w:start w:val="1"/>
+      <w:numFmt w:val="bullet"/>
+      <w:lvlText w:val=""/>
+      <w:lvlJc w:val="start"/>
+      <w:pPr>
+        <w:tabs>
+          <w:tab w:val="num" w:pos="1418"/>
+        </w:tabs>
+        <w:ind w:start="1418" w:hanging="283"/>
+      </w:pPr>
+      <w:rPr>
+        <w:rFonts w:ascii="Symbol" w:hAnsi="Symbol" w:cs="Symbol" w:hint="default"/>
+      </w:rPr>
+    </w:lvl>
+    <w:lvl w:ilvl="2">
+      <w:start w:val="1"/>
+      <w:numFmt w:val="bullet"/>
+      <w:lvlText w:val=""/>
+      <w:lvlJc w:val="start"/>
+      <w:pPr>
+        <w:tabs>
+          <w:tab w:val="num" w:pos="2127"/>
+        </w:tabs>
+        <w:ind w:start="2127" w:hanging="283"/>
+      </w:pPr>
+      <w:rPr>
+        <w:rFonts w:ascii="Symbol" w:hAnsi="Symbol" w:cs="Symbol" w:hint="default"/>
+      </w:rPr>
+    </w:lvl>
+    <w:lvl w:ilvl="3">
+      <w:start w:val="1"/>
+      <w:numFmt w:val="bullet"/>
+      <w:lvlText w:val=""/>
+      <w:lvlJc w:val="start"/>
+      <w:pPr>
+        <w:tabs>
+          <w:tab w:val="num" w:pos="2836"/>
+        </w:tabs>
+        <w:ind w:start="2836" w:hanging="283"/>
+      </w:pPr>
+      <w:rPr>
+        <w:rFonts w:ascii="Symbol" w:hAnsi="Symbol" w:cs="Symbol" w:hint="default"/>
+      </w:rPr>
+    </w:lvl>
+    <w:lvl w:ilvl="4">
+      <w:start w:val="1"/>
+      <w:numFmt w:val="bullet"/>
+      <w:lvlText w:val=""/>
+      <w:lvlJc w:val="start"/>
+      <w:pPr>
+        <w:tabs>
+          <w:tab w:val="num" w:pos="3545"/>
+        </w:tabs>
+        <w:ind w:start="3545" w:hanging="283"/>
+      </w:pPr>
+      <w:rPr>
+        <w:rFonts w:ascii="Symbol" w:hAnsi="Symbol" w:cs="Symbol" w:hint="default"/>
+      </w:rPr>
+    </w:lvl>
+    <w:lvl w:ilvl="5">
+      <w:start w:val="1"/>
+      <w:numFmt w:val="bullet"/>
+      <w:lvlText w:val=""/>
+      <w:lvlJc w:val="start"/>
+      <w:pPr>
+        <w:tabs>
+          <w:tab w:val="num" w:pos="4254"/>
+        </w:tabs>
+        <w:ind w:start="4254" w:hanging="283"/>
+      </w:pPr>
+      <w:rPr>
+        <w:rFonts w:ascii="Symbol" w:hAnsi="Symbol" w:cs="Symbol" w:hint="default"/>
+      </w:rPr>
+    </w:lvl>
+    <w:lvl w:ilvl="6">
+      <w:start w:val="1"/>
+      <w:numFmt w:val="bullet"/>
+      <w:lvlText w:val=""/>
+      <w:lvlJc w:val="start"/>
+      <w:pPr>
+        <w:tabs>
+          <w:tab w:val="num" w:pos="4963"/>
+        </w:tabs>
+        <w:ind w:start="4963" w:hanging="283"/>
+      </w:pPr>
+      <w:rPr>
+        <w:rFonts w:ascii="Symbol" w:hAnsi="Symbol" w:cs="Symbol" w:hint="default"/>
+      </w:rPr>
+    </w:lvl>
+    <w:lvl w:ilvl="7">
+      <w:start w:val="1"/>
+      <w:numFmt w:val="bullet"/>
+      <w:lvlText w:val=""/>
+      <w:lvlJc w:val="start"/>
+      <w:pPr>
+        <w:tabs>
+          <w:tab w:val="num" w:pos="5672"/>
+        </w:tabs>
+        <w:ind w:start="5672" w:hanging="283"/>
+      </w:pPr>
+      <w:rPr>
+        <w:rFonts w:ascii="Symbol" w:hAnsi="Symbol" w:cs="Symbol" w:hint="default"/>
+      </w:rPr>
+    </w:lvl>
+    <w:lvl w:ilvl="8">
+      <w:start w:val="1"/>
+      <w:numFmt w:val="bullet"/>
+      <w:lvlText w:val=""/>
+      <w:lvlJc w:val="start"/>
+      <w:pPr>
+        <w:tabs>
+          <w:tab w:val="num" w:pos="6381"/>
+        </w:tabs>
+        <w:ind w:start="6381" w:hanging="283"/>
+      </w:pPr>
+      <w:rPr>
+        <w:rFonts w:ascii="Symbol" w:hAnsi="Symbol" w:cs="Symbol" w:hint="default"/>
+      </w:rPr>
+    </w:lvl>
+  </w:abstractNum>
+  <w:abstractNum w:abstractNumId="2">
+    <w:lvl w:ilvl="0">
+      <w:start w:val="1"/>
+      <w:numFmt w:val="bullet"/>
+      <w:lvlText w:val=""/>
+      <w:lvlJc w:val="start"/>
+      <w:pPr>
+        <w:tabs>
+          <w:tab w:val="num" w:pos="709"/>
+        </w:tabs>
+        <w:ind w:start="709" w:hanging="283"/>
+      </w:pPr>
+      <w:rPr>
+        <w:rFonts w:ascii="Symbol" w:hAnsi="Symbol" w:cs="Symbol" w:hint="default"/>
+      </w:rPr>
+    </w:lvl>
+    <w:lvl w:ilvl="1">
+      <w:start w:val="1"/>
+      <w:numFmt w:val="bullet"/>
+      <w:lvlText w:val=""/>
+      <w:lvlJc w:val="start"/>
+      <w:pPr>
+        <w:tabs>
+          <w:tab w:val="num" w:pos="1418"/>
+        </w:tabs>
+        <w:ind w:start="1418" w:hanging="283"/>
+      </w:pPr>
+      <w:rPr>
+        <w:rFonts w:ascii="Symbol" w:hAnsi="Symbol" w:cs="Symbol" w:hint="default"/>
+      </w:rPr>
+    </w:lvl>
+    <w:lvl w:ilvl="2">
+      <w:start w:val="1"/>
+      <w:numFmt w:val="bullet"/>
+      <w:lvlText w:val=""/>
+      <w:lvlJc w:val="start"/>
+      <w:pPr>
+        <w:tabs>
+          <w:tab w:val="num" w:pos="2127"/>
+        </w:tabs>
+        <w:ind w:start="2127" w:hanging="283"/>
+      </w:pPr>
+      <w:rPr>
+        <w:rFonts w:ascii="Symbol" w:hAnsi="Symbol" w:cs="Symbol" w:hint="default"/>
+      </w:rPr>
+    </w:lvl>
+    <w:lvl w:ilvl="3">
+      <w:start w:val="1"/>
+      <w:numFmt w:val="bullet"/>
+      <w:lvlText w:val=""/>
+      <w:lvlJc w:val="start"/>
+      <w:pPr>
+        <w:tabs>
+          <w:tab w:val="num" w:pos="2836"/>
+        </w:tabs>
+        <w:ind w:start="2836" w:hanging="283"/>
+      </w:pPr>
+      <w:rPr>
+        <w:rFonts w:ascii="Symbol" w:hAnsi="Symbol" w:cs="Symbol" w:hint="default"/>
+      </w:rPr>
+    </w:lvl>
+    <w:lvl w:ilvl="4">
+      <w:start w:val="1"/>
+      <w:numFmt w:val="bullet"/>
+      <w:lvlText w:val=""/>
+      <w:lvlJc w:val="start"/>
+      <w:pPr>
+        <w:tabs>
+          <w:tab w:val="num" w:pos="3545"/>
+        </w:tabs>
+        <w:ind w:start="3545" w:hanging="283"/>
+      </w:pPr>
+      <w:rPr>
+        <w:rFonts w:ascii="Symbol" w:hAnsi="Symbol" w:cs="Symbol" w:hint="default"/>
+      </w:rPr>
+    </w:lvl>
+    <w:lvl w:ilvl="5">
+      <w:start w:val="1"/>
+      <w:numFmt w:val="bullet"/>
+      <w:lvlText w:val=""/>
+      <w:lvlJc w:val="start"/>
+      <w:pPr>
+        <w:tabs>
+          <w:tab w:val="num" w:pos="4254"/>
+        </w:tabs>
+        <w:ind w:start="4254" w:hanging="283"/>
+      </w:pPr>
+      <w:rPr>
+        <w:rFonts w:ascii="Symbol" w:hAnsi="Symbol" w:cs="Symbol" w:hint="default"/>
+      </w:rPr>
+    </w:lvl>
+    <w:lvl w:ilvl="6">
+      <w:start w:val="1"/>
+      <w:numFmt w:val="bullet"/>
+      <w:lvlText w:val=""/>
+      <w:lvlJc w:val="start"/>
+      <w:pPr>
+        <w:tabs>
+          <w:tab w:val="num" w:pos="4963"/>
+        </w:tabs>
+        <w:ind w:start="4963" w:hanging="283"/>
+      </w:pPr>
+      <w:rPr>
+        <w:rFonts w:ascii="Symbol" w:hAnsi="Symbol" w:cs="Symbol" w:hint="default"/>
+      </w:rPr>
+    </w:lvl>
+    <w:lvl w:ilvl="7">
+      <w:start w:val="1"/>
+      <w:numFmt w:val="bullet"/>
+      <w:lvlText w:val=""/>
+      <w:lvlJc w:val="start"/>
+      <w:pPr>
+        <w:tabs>
+          <w:tab w:val="num" w:pos="5672"/>
+        </w:tabs>
+        <w:ind w:start="5672" w:hanging="283"/>
+      </w:pPr>
+      <w:rPr>
+        <w:rFonts w:ascii="Symbol" w:hAnsi="Symbol" w:cs="Symbol" w:hint="default"/>
+      </w:rPr>
+    </w:lvl>
+    <w:lvl w:ilvl="8">
+      <w:start w:val="1"/>
+      <w:numFmt w:val="bullet"/>
+      <w:lvlText w:val=""/>
+      <w:lvlJc w:val="start"/>
+      <w:pPr>
+        <w:tabs>
+          <w:tab w:val="num" w:pos="6381"/>
+        </w:tabs>
+        <w:ind w:start="6381" w:hanging="283"/>
+      </w:pPr>
+      <w:rPr>
+        <w:rFonts w:ascii="Symbol" w:hAnsi="Symbol" w:cs="Symbol" w:hint="default"/>
+      </w:rPr>
+    </w:lvl>
+  </w:abstractNum>
+  <w:abstractNum w:abstractNumId="3">
+    <w:lvl w:ilvl="0">
+      <w:start w:val="1"/>
+      <w:numFmt w:val="decimal"/>
+      <w:lvlText w:val="%1."/>
+      <w:lvlJc w:val="start"/>
+      <w:pPr>
+        <w:tabs>
+          <w:tab w:val="num" w:pos="709"/>
+        </w:tabs>
+        <w:ind w:start="709" w:hanging="283"/>
+      </w:pPr>
+      <w:rPr/>
+    </w:lvl>
+    <w:lvl w:ilvl="1">
+      <w:start w:val="1"/>
+      <w:numFmt w:val="decimal"/>
+      <w:lvlText w:val="%2."/>
+      <w:lvlJc w:val="start"/>
+      <w:pPr>
+        <w:tabs>
+          <w:tab w:val="num" w:pos="1418"/>
+        </w:tabs>
+        <w:ind w:start="1418" w:hanging="283"/>
+      </w:pPr>
+      <w:rPr/>
+    </w:lvl>
+    <w:lvl w:ilvl="2">
+      <w:start w:val="1"/>
+      <w:numFmt w:val="decimal"/>
+      <w:lvlText w:val="%3."/>
+      <w:lvlJc w:val="start"/>
+      <w:pPr>
+        <w:tabs>
+          <w:tab w:val="num" w:pos="2127"/>
+        </w:tabs>
+        <w:ind w:start="2127" w:hanging="283"/>
+      </w:pPr>
+      <w:rPr/>
+    </w:lvl>
+    <w:lvl w:ilvl="3">
+      <w:start w:val="1"/>
+      <w:numFmt w:val="decimal"/>
+      <w:lvlText w:val="%4."/>
+      <w:lvlJc w:val="start"/>
+      <w:pPr>
+        <w:tabs>
+          <w:tab w:val="num" w:pos="2836"/>
+        </w:tabs>
+        <w:ind w:start="2836" w:hanging="283"/>
+      </w:pPr>
+      <w:rPr/>
+    </w:lvl>
+    <w:lvl w:ilvl="4">
+      <w:start w:val="1"/>
+      <w:numFmt w:val="decimal"/>
+      <w:lvlText w:val="%5."/>
+      <w:lvlJc w:val="start"/>
+      <w:pPr>
+        <w:tabs>
+          <w:tab w:val="num" w:pos="3545"/>
+        </w:tabs>
+        <w:ind w:start="3545" w:hanging="283"/>
+      </w:pPr>
+      <w:rPr/>
+    </w:lvl>
+    <w:lvl w:ilvl="5">
+      <w:start w:val="1"/>
+      <w:numFmt w:val="decimal"/>
+      <w:lvlText w:val="%6."/>
+      <w:lvlJc w:val="start"/>
+      <w:pPr>
+        <w:tabs>
+          <w:tab w:val="num" w:pos="4254"/>
+        </w:tabs>
+        <w:ind w:start="4254" w:hanging="283"/>
+      </w:pPr>
+      <w:rPr/>
+    </w:lvl>
+    <w:lvl w:ilvl="6">
+      <w:start w:val="1"/>
+      <w:numFmt w:val="decimal"/>
+      <w:lvlText w:val="%7."/>
+      <w:lvlJc w:val="start"/>
+      <w:pPr>
+        <w:tabs>
+          <w:tab w:val="num" w:pos="4963"/>
+        </w:tabs>
+        <w:ind w:start="4963" w:hanging="283"/>
+      </w:pPr>
+      <w:rPr/>
+    </w:lvl>
+    <w:lvl w:ilvl="7">
+      <w:start w:val="1"/>
+      <w:numFmt w:val="decimal"/>
+      <w:lvlText w:val="%8."/>
+      <w:lvlJc w:val="start"/>
+      <w:pPr>
+        <w:tabs>
+          <w:tab w:val="num" w:pos="5672"/>
+        </w:tabs>
+        <w:ind w:start="5672" w:hanging="283"/>
+      </w:pPr>
+      <w:rPr/>
+    </w:lvl>
+    <w:lvl w:ilvl="8">
+      <w:start w:val="1"/>
+      <w:numFmt w:val="decimal"/>
+      <w:lvlText w:val="%9."/>
+      <w:lvlJc w:val="start"/>
+      <w:pPr>
+        <w:tabs>
+          <w:tab w:val="num" w:pos="6381"/>
+        </w:tabs>
+        <w:ind w:start="6381" w:hanging="283"/>
+      </w:pPr>
+      <w:rPr/>
+    </w:lvl>
+  </w:abstractNum>
+  <w:abstractNum w:abstractNumId="4">
+    <w:lvl w:ilvl="0">
+      <w:start w:val="1"/>
+      <w:numFmt w:val="bullet"/>
+      <w:lvlText w:val=""/>
+      <w:lvlJc w:val="start"/>
+      <w:pPr>
+        <w:tabs>
+          <w:tab w:val="num" w:pos="709"/>
+        </w:tabs>
+        <w:ind w:start="709" w:hanging="283"/>
+      </w:pPr>
+      <w:rPr>
+        <w:rFonts w:ascii="Symbol" w:hAnsi="Symbol" w:cs="Symbol" w:hint="default"/>
+      </w:rPr>
+    </w:lvl>
+    <w:lvl w:ilvl="1">
+      <w:start w:val="1"/>
+      <w:numFmt w:val="bullet"/>
+      <w:lvlText w:val=""/>
+      <w:lvlJc w:val="start"/>
+      <w:pPr>
+        <w:tabs>
+          <w:tab w:val="num" w:pos="1418"/>
+        </w:tabs>
+        <w:ind w:start="1418" w:hanging="283"/>
+      </w:pPr>
+      <w:rPr>
+        <w:rFonts w:ascii="Symbol" w:hAnsi="Symbol" w:cs="Symbol" w:hint="default"/>
+      </w:rPr>
+    </w:lvl>
+    <w:lvl w:ilvl="2">
+      <w:start w:val="1"/>
+      <w:numFmt w:val="bullet"/>
+      <w:lvlText w:val=""/>
+      <w:lvlJc w:val="start"/>
+      <w:pPr>
+        <w:tabs>
+          <w:tab w:val="num" w:pos="2127"/>
+        </w:tabs>
+        <w:ind w:start="2127" w:hanging="283"/>
+      </w:pPr>
+      <w:rPr>
+        <w:rFonts w:ascii="Symbol" w:hAnsi="Symbol" w:cs="Symbol" w:hint="default"/>
+      </w:rPr>
+    </w:lvl>
+    <w:lvl w:ilvl="3">
+      <w:start w:val="1"/>
+      <w:numFmt w:val="bullet"/>
+      <w:lvlText w:val=""/>
+      <w:lvlJc w:val="start"/>
+      <w:pPr>
+        <w:tabs>
+          <w:tab w:val="num" w:pos="2836"/>
+        </w:tabs>
+        <w:ind w:start="2836" w:hanging="283"/>
+      </w:pPr>
+      <w:rPr>
+        <w:rFonts w:ascii="Symbol" w:hAnsi="Symbol" w:cs="Symbol" w:hint="default"/>
+      </w:rPr>
+    </w:lvl>
+    <w:lvl w:ilvl="4">
+      <w:start w:val="1"/>
+      <w:numFmt w:val="bullet"/>
+      <w:lvlText w:val=""/>
+      <w:lvlJc w:val="start"/>
+      <w:pPr>
+        <w:tabs>
+          <w:tab w:val="num" w:pos="3545"/>
+        </w:tabs>
+        <w:ind w:start="3545" w:hanging="283"/>
+      </w:pPr>
+      <w:rPr>
+        <w:rFonts w:ascii="Symbol" w:hAnsi="Symbol" w:cs="Symbol" w:hint="default"/>
+      </w:rPr>
+    </w:lvl>
+    <w:lvl w:ilvl="5">
+      <w:start w:val="1"/>
+      <w:numFmt w:val="bullet"/>
+      <w:lvlText w:val=""/>
+      <w:lvlJc w:val="start"/>
+      <w:pPr>
+        <w:tabs>
+          <w:tab w:val="num" w:pos="4254"/>
+        </w:tabs>
+        <w:ind w:start="4254" w:hanging="283"/>
+      </w:pPr>
+      <w:rPr>
+        <w:rFonts w:ascii="Symbol" w:hAnsi="Symbol" w:cs="Symbol" w:hint="default"/>
+      </w:rPr>
+    </w:lvl>
+    <w:lvl w:ilvl="6">
+      <w:start w:val="1"/>
+      <w:numFmt w:val="bullet"/>
+      <w:lvlText w:val=""/>
+      <w:lvlJc w:val="start"/>
+      <w:pPr>
+        <w:tabs>
+          <w:tab w:val="num" w:pos="4963"/>
+        </w:tabs>
+        <w:ind w:start="4963" w:hanging="283"/>
+      </w:pPr>
+      <w:rPr>
+        <w:rFonts w:ascii="Symbol" w:hAnsi="Symbol" w:cs="Symbol" w:hint="default"/>
+      </w:rPr>
+    </w:lvl>
+    <w:lvl w:ilvl="7">
+      <w:start w:val="1"/>
+      <w:numFmt w:val="bullet"/>
+      <w:lvlText w:val=""/>
+      <w:lvlJc w:val="start"/>
+      <w:pPr>
+        <w:tabs>
+          <w:tab w:val="num" w:pos="5672"/>
+        </w:tabs>
+        <w:ind w:start="5672" w:hanging="283"/>
+      </w:pPr>
+      <w:rPr>
+        <w:rFonts w:ascii="Symbol" w:hAnsi="Symbol" w:cs="Symbol" w:hint="default"/>
+      </w:rPr>
+    </w:lvl>
+    <w:lvl w:ilvl="8">
+      <w:start w:val="1"/>
+      <w:numFmt w:val="bullet"/>
+      <w:lvlText w:val=""/>
+      <w:lvlJc w:val="start"/>
+      <w:pPr>
+        <w:tabs>
+          <w:tab w:val="num" w:pos="6381"/>
+        </w:tabs>
+        <w:ind w:start="6381" w:hanging="283"/>
+      </w:pPr>
+      <w:rPr>
+        <w:rFonts w:ascii="Symbol" w:hAnsi="Symbol" w:cs="Symbol" w:hint="default"/>
+      </w:rPr>
+    </w:lvl>
+  </w:abstractNum>
+  <w:abstractNum w:abstractNumId="5">
+    <w:lvl w:ilvl="0">
+      <w:start w:val="1"/>
+      <w:numFmt w:val="none"/>
+      <w:suff w:val="nothing"/>
+      <w:lvlText w:val=""/>
+      <w:lvlJc w:val="start"/>
+      <w:pPr>
+        <w:tabs>
+          <w:tab w:val="num" w:pos="0"/>
+        </w:tabs>
+        <w:ind w:start="0" w:hanging="0"/>
+      </w:pPr>
+    </w:lvl>
+    <w:lvl w:ilvl="1">
+      <w:start w:val="1"/>
+      <w:numFmt w:val="none"/>
+      <w:suff w:val="nothing"/>
+      <w:lvlText w:val=""/>
+      <w:lvlJc w:val="start"/>
+      <w:pPr>
+        <w:tabs>
+          <w:tab w:val="num" w:pos="0"/>
+        </w:tabs>
+        <w:ind w:start="0" w:hanging="0"/>
+      </w:pPr>
+    </w:lvl>
+    <w:lvl w:ilvl="2">
+      <w:start w:val="1"/>
+      <w:numFmt w:val="none"/>
+      <w:suff w:val="nothing"/>
+      <w:lvlText w:val=""/>
+      <w:lvlJc w:val="start"/>
+      <w:pPr>
+        <w:tabs>
+          <w:tab w:val="num" w:pos="0"/>
+        </w:tabs>
+        <w:ind w:start="0" w:hanging="0"/>
+      </w:pPr>
+    </w:lvl>
+    <w:lvl w:ilvl="3">
+      <w:start w:val="1"/>
+      <w:numFmt w:val="none"/>
+      <w:suff w:val="nothing"/>
+      <w:lvlText w:val=""/>
+      <w:lvlJc w:val="start"/>
+      <w:pPr>
+        <w:tabs>
+          <w:tab w:val="num" w:pos="0"/>
+        </w:tabs>
+        <w:ind w:start="0" w:hanging="0"/>
+      </w:pPr>
+    </w:lvl>
+    <w:lvl w:ilvl="4">
+      <w:start w:val="1"/>
+      <w:numFmt w:val="none"/>
+      <w:suff w:val="nothing"/>
+      <w:lvlText w:val=""/>
+      <w:lvlJc w:val="start"/>
+      <w:pPr>
+        <w:tabs>
+          <w:tab w:val="num" w:pos="0"/>
+        </w:tabs>
+        <w:ind w:start="0" w:hanging="0"/>
+      </w:pPr>
+    </w:lvl>
+    <w:lvl w:ilvl="5">
+      <w:start w:val="1"/>
+      <w:numFmt w:val="none"/>
+      <w:suff w:val="nothing"/>
+      <w:lvlText w:val=""/>
+      <w:lvlJc w:val="start"/>
+      <w:pPr>
+        <w:tabs>
+          <w:tab w:val="num" w:pos="0"/>
+        </w:tabs>
+        <w:ind w:start="0" w:hanging="0"/>
+      </w:pPr>
+    </w:lvl>
+    <w:lvl w:ilvl="6">
+      <w:start w:val="1"/>
+      <w:numFmt w:val="none"/>
+      <w:suff w:val="nothing"/>
+      <w:lvlText w:val=""/>
+      <w:lvlJc w:val="start"/>
+      <w:pPr>
+        <w:tabs>
+          <w:tab w:val="num" w:pos="0"/>
+        </w:tabs>
+        <w:ind w:start="0" w:hanging="0"/>
+      </w:pPr>
+    </w:lvl>
+    <w:lvl w:ilvl="7">
+      <w:start w:val="1"/>
+      <w:numFmt w:val="none"/>
+      <w:suff w:val="nothing"/>
+      <w:lvlText w:val=""/>
+      <w:lvlJc w:val="start"/>
+      <w:pPr>
+        <w:tabs>
+          <w:tab w:val="num" w:pos="0"/>
+        </w:tabs>
+        <w:ind w:start="0" w:hanging="0"/>
+      </w:pPr>
+    </w:lvl>
+    <w:lvl w:ilvl="8">
+      <w:start w:val="1"/>
+      <w:numFmt w:val="none"/>
+      <w:suff w:val="nothing"/>
+      <w:lvlText w:val=""/>
+      <w:lvlJc w:val="start"/>
+      <w:pPr>
+        <w:tabs>
+          <w:tab w:val="num" w:pos="0"/>
+        </w:tabs>
+        <w:ind w:start="0" w:hanging="0"/>
+      </w:pPr>
+    </w:lvl>
+  </w:abstractNum>
+  <w:num w:numId="1">
+    <w:abstractNumId w:val="1"/>
+  </w:num>
+  <w:num w:numId="2">
+    <w:abstractNumId w:val="2"/>
+  </w:num>
+  <w:num w:numId="3">
+    <w:abstractNumId w:val="3"/>
+  </w:num>
+  <w:num w:numId="4">
+    <w:abstractNumId w:val="4"/>
+  </w:num>
+  <w:num w:numId="5">
+    <w:abstractNumId w:val="5"/>
+  </w:num>
+</w:numbering>
 </file>
 
 <file path=word/styles.xml><?xml version="1.0" encoding="utf-8"?>
@@ -1686,6 +3273,7 @@
     <w:qFormat/>
     <w:pPr>
       <w:widowControl/>
+      <w:suppressAutoHyphens w:val="true"/>
       <w:bidi w:val="0"/>
       <w:spacing w:lineRule="auto" w:line="278" w:before="0" w:after="160"/>
       <w:jc w:val="start"/>
@@ -2154,6 +3742,18 @@
     <w:rPr>
       <w:rFonts w:ascii="Liberation Mono" w:hAnsi="Liberation Mono" w:eastAsia="Liberation Mono" w:cs="Liberation Mono"/>
     </w:rPr>
+  </w:style>
+  <w:style w:type="character" w:styleId="Bullets">
+    <w:name w:val="Bullets"/>
+    <w:qFormat/>
+    <w:rPr>
+      <w:rFonts w:ascii="OpenSymbol" w:hAnsi="OpenSymbol" w:eastAsia="OpenSymbol" w:cs="OpenSymbol"/>
+    </w:rPr>
+  </w:style>
+  <w:style w:type="character" w:styleId="NumberingSymbols">
+    <w:name w:val="Numbering Symbols"/>
+    <w:qFormat/>
+    <w:rPr/>
   </w:style>
   <w:style w:type="paragraph" w:styleId="Heading">
     <w:name w:val="Heading"/>

</xml_diff>